<commit_message>
style: rewrite diary to DSTU 3008:2015 standard (Times New Roman 14pt, 1.5 spacing)
</commit_message>
<xml_diff>
--- a/diary/Devuan_Security_OS_Diary.docx
+++ b/diary/Devuan_Security_OS_Diary.docx
@@ -2,129 +2,254 @@
 <file path=word/document.xml><?xml version="1.0" encoding="utf-8"?>
 <w:document xmlns:wpc="http://schemas.microsoft.com/office/word/2010/wordprocessingCanvas" xmlns:mo="http://schemas.microsoft.com/office/mac/office/2008/main" xmlns:mc="http://schemas.openxmlformats.org/markup-compatibility/2006" xmlns:mv="urn:schemas-microsoft-com:mac:vml" xmlns:o="urn:schemas-microsoft-com:office:office" xmlns:r="http://schemas.openxmlformats.org/officeDocument/2006/relationships" xmlns:m="http://schemas.openxmlformats.org/officeDocument/2006/math" xmlns:v="urn:schemas-microsoft-com:vml" xmlns:wp14="http://schemas.microsoft.com/office/word/2010/wordprocessingDrawing" xmlns:wp="http://schemas.openxmlformats.org/drawingml/2006/wordprocessingDrawing" xmlns:w10="urn:schemas-microsoft-com:office:word" xmlns:w="http://schemas.openxmlformats.org/wordprocessingml/2006/main" xmlns:w14="http://schemas.microsoft.com/office/word/2010/wordml" xmlns:wpg="http://schemas.microsoft.com/office/word/2010/wordprocessingGroup" xmlns:wpi="http://schemas.microsoft.com/office/word/2010/wordprocessingInk" xmlns:wne="http://schemas.microsoft.com/office/word/2006/wordml" xmlns:wps="http://schemas.microsoft.com/office/word/2010/wordprocessingShape" mc:Ignorable="w14 wp14">
   <w:body>
-    <w:p/>
-    <w:p/>
-    <w:p/>
-    <w:p/>
     <w:p>
       <w:pPr>
+        <w:spacing w:line="360" w:lineRule="auto" w:before="0" w:after="0"/>
+        <w:ind w:firstLine="0"/>
+        <w:jc w:val="both"/>
+      </w:pPr>
+    </w:p>
+    <w:p>
+      <w:pPr>
+        <w:spacing w:line="360" w:lineRule="auto" w:before="0" w:after="0"/>
+        <w:ind w:firstLine="0"/>
+        <w:jc w:val="both"/>
+      </w:pPr>
+    </w:p>
+    <w:p>
+      <w:pPr>
+        <w:spacing w:line="360" w:lineRule="auto" w:before="0" w:after="0"/>
+        <w:ind w:firstLine="0"/>
+        <w:jc w:val="both"/>
+      </w:pPr>
+    </w:p>
+    <w:p>
+      <w:pPr>
+        <w:spacing w:line="360" w:lineRule="auto" w:before="0" w:after="0"/>
+        <w:ind w:firstLine="0"/>
         <w:jc w:val="center"/>
       </w:pPr>
       <w:r>
         <w:rPr>
+          <w:rFonts w:ascii="Times New Roman" w:hAnsi="Times New Roman"/>
           <w:b/>
-          <w:color w:val="1A569A"/>
-          <w:sz w:val="56"/>
+          <w:i w:val="0"/>
+          <w:color w:val="000000"/>
+          <w:sz w:val="28"/>
         </w:rPr>
-        <w:t>Щоденник розробки</w:t>
+        <w:t>Щоденник розробки дипломного проєкту</w:t>
       </w:r>
     </w:p>
     <w:p>
       <w:pPr>
+        <w:spacing w:line="360" w:lineRule="auto" w:before="0" w:after="0"/>
+        <w:ind w:firstLine="0"/>
+        <w:jc w:val="both"/>
+      </w:pPr>
+    </w:p>
+    <w:p>
+      <w:pPr>
+        <w:spacing w:line="360" w:lineRule="auto" w:before="0" w:after="0"/>
+        <w:ind w:firstLine="0"/>
         <w:jc w:val="center"/>
       </w:pPr>
       <w:r>
         <w:rPr>
+          <w:rFonts w:ascii="Times New Roman" w:hAnsi="Times New Roman"/>
           <w:b/>
-          <w:color w:val="2E75B6"/>
-          <w:sz w:val="44"/>
+          <w:i w:val="0"/>
+          <w:color w:val="000000"/>
+          <w:sz w:val="32"/>
         </w:rPr>
-        <w:t>Devuan Security OS</w:t>
+        <w:t>DEVUAN SECURITY OS</w:t>
       </w:r>
     </w:p>
-    <w:p/>
     <w:p>
       <w:pPr>
+        <w:spacing w:line="360" w:lineRule="auto" w:before="0" w:after="0"/>
+        <w:ind w:firstLine="0"/>
+        <w:jc w:val="both"/>
+      </w:pPr>
+    </w:p>
+    <w:p>
+      <w:pPr>
+        <w:spacing w:line="360" w:lineRule="auto" w:before="0" w:after="0"/>
+        <w:ind w:firstLine="0"/>
         <w:jc w:val="center"/>
       </w:pPr>
       <w:r>
         <w:rPr>
-          <w:color w:val="555555"/>
-          <w:sz w:val="24"/>
+          <w:rFonts w:ascii="Times New Roman" w:hAnsi="Times New Roman"/>
+          <w:b w:val="0"/>
+          <w:i/>
+          <w:color w:val="000000"/>
+          <w:sz w:val="28"/>
         </w:rPr>
-        <w:t>Кастомний дистрибутив на базі Devuan Excalibur 6.x</w:t>
+        <w:t>Кастомний дистрибутив GNU/Linux на базі Devuan Excalibur 6.x,</w:t>
         <w:br/>
-        <w:t>Орієнтований на безпеку • Без systemd • XFCE інтерфейс</w:t>
+        <w:t>орієнтований на безпеку, без системи ініціалізації systemd</w:t>
       </w:r>
     </w:p>
-    <w:p/>
-    <w:p/>
-    <w:p/>
-    <w:p/>
-    <w:p/>
-    <w:p/>
     <w:p>
       <w:pPr>
+        <w:spacing w:line="360" w:lineRule="auto" w:before="0" w:after="0"/>
+        <w:ind w:firstLine="0"/>
+        <w:jc w:val="both"/>
+      </w:pPr>
+    </w:p>
+    <w:p>
+      <w:pPr>
+        <w:spacing w:line="360" w:lineRule="auto" w:before="0" w:after="0"/>
+        <w:ind w:firstLine="0"/>
+        <w:jc w:val="both"/>
+      </w:pPr>
+    </w:p>
+    <w:p>
+      <w:pPr>
+        <w:spacing w:line="360" w:lineRule="auto" w:before="0" w:after="0"/>
+        <w:ind w:firstLine="0"/>
+        <w:jc w:val="both"/>
+      </w:pPr>
+    </w:p>
+    <w:p>
+      <w:pPr>
+        <w:spacing w:line="360" w:lineRule="auto" w:before="0" w:after="0"/>
+        <w:ind w:firstLine="0"/>
+        <w:jc w:val="both"/>
+      </w:pPr>
+    </w:p>
+    <w:p>
+      <w:pPr>
+        <w:spacing w:line="360" w:lineRule="auto" w:before="0" w:after="0"/>
+        <w:ind w:firstLine="0"/>
+        <w:jc w:val="both"/>
+      </w:pPr>
+    </w:p>
+    <w:p>
+      <w:pPr>
+        <w:spacing w:line="360" w:lineRule="auto" w:before="0" w:after="0"/>
+        <w:ind w:firstLine="0"/>
+        <w:jc w:val="both"/>
+      </w:pPr>
+    </w:p>
+    <w:p>
+      <w:pPr>
+        <w:spacing w:line="360" w:lineRule="auto" w:before="0" w:after="0"/>
+        <w:ind w:firstLine="0"/>
+        <w:jc w:val="both"/>
+      </w:pPr>
+    </w:p>
+    <w:p>
+      <w:pPr>
+        <w:spacing w:line="360" w:lineRule="auto" w:before="0" w:after="0"/>
+        <w:ind w:firstLine="0"/>
+        <w:jc w:val="both"/>
+      </w:pPr>
+    </w:p>
+    <w:p>
+      <w:pPr>
+        <w:spacing w:line="360" w:lineRule="auto"/>
+        <w:ind w:firstLine="0"/>
         <w:jc w:val="center"/>
       </w:pPr>
       <w:r>
         <w:rPr>
+          <w:rFonts w:ascii="Times New Roman" w:hAnsi="Times New Roman"/>
           <w:b/>
-          <w:sz w:val="22"/>
+          <w:i w:val="0"/>
+          <w:color w:val="000000"/>
+          <w:sz w:val="28"/>
         </w:rPr>
         <w:t xml:space="preserve">Автор: </w:t>
       </w:r>
       <w:r>
         <w:rPr>
-          <w:color w:val="2E75B6"/>
-          <w:sz w:val="22"/>
+          <w:rFonts w:ascii="Times New Roman" w:hAnsi="Times New Roman"/>
+          <w:b w:val="0"/>
+          <w:i w:val="0"/>
+          <w:color w:val="000000"/>
+          <w:sz w:val="28"/>
         </w:rPr>
         <w:t>zoozienix</w:t>
       </w:r>
     </w:p>
     <w:p>
       <w:pPr>
+        <w:spacing w:line="360" w:lineRule="auto"/>
+        <w:ind w:firstLine="0"/>
         <w:jc w:val="center"/>
       </w:pPr>
       <w:r>
         <w:rPr>
+          <w:rFonts w:ascii="Times New Roman" w:hAnsi="Times New Roman"/>
           <w:b/>
-          <w:sz w:val="22"/>
+          <w:i w:val="0"/>
+          <w:color w:val="000000"/>
+          <w:sz w:val="28"/>
         </w:rPr>
         <w:t xml:space="preserve">Репозиторій: </w:t>
       </w:r>
       <w:r>
         <w:rPr>
-          <w:color w:val="2E75B6"/>
-          <w:sz w:val="22"/>
+          <w:rFonts w:ascii="Times New Roman" w:hAnsi="Times New Roman"/>
+          <w:b w:val="0"/>
+          <w:i w:val="0"/>
+          <w:color w:val="000000"/>
+          <w:sz w:val="28"/>
         </w:rPr>
         <w:t>github.com/zoozieuniver/Devuan_Project</w:t>
       </w:r>
     </w:p>
     <w:p>
       <w:pPr>
+        <w:spacing w:line="360" w:lineRule="auto"/>
+        <w:ind w:firstLine="0"/>
         <w:jc w:val="center"/>
       </w:pPr>
       <w:r>
         <w:rPr>
+          <w:rFonts w:ascii="Times New Roman" w:hAnsi="Times New Roman"/>
           <w:b/>
-          <w:sz w:val="22"/>
+          <w:i w:val="0"/>
+          <w:color w:val="000000"/>
+          <w:sz w:val="28"/>
         </w:rPr>
         <w:t xml:space="preserve">Дата початку: </w:t>
       </w:r>
       <w:r>
         <w:rPr>
-          <w:color w:val="2E75B6"/>
-          <w:sz w:val="22"/>
+          <w:rFonts w:ascii="Times New Roman" w:hAnsi="Times New Roman"/>
+          <w:b w:val="0"/>
+          <w:i w:val="0"/>
+          <w:color w:val="000000"/>
+          <w:sz w:val="28"/>
         </w:rPr>
         <w:t>04.07.2026</w:t>
       </w:r>
     </w:p>
     <w:p>
       <w:pPr>
+        <w:spacing w:line="360" w:lineRule="auto"/>
+        <w:ind w:firstLine="0"/>
         <w:jc w:val="center"/>
       </w:pPr>
       <w:r>
         <w:rPr>
+          <w:rFonts w:ascii="Times New Roman" w:hAnsi="Times New Roman"/>
           <w:b/>
-          <w:sz w:val="22"/>
+          <w:i w:val="0"/>
+          <w:color w:val="000000"/>
+          <w:sz w:val="28"/>
         </w:rPr>
         <w:t xml:space="preserve">Версія документу: </w:t>
       </w:r>
       <w:r>
         <w:rPr>
-          <w:color w:val="2E75B6"/>
-          <w:sz w:val="22"/>
+          <w:rFonts w:ascii="Times New Roman" w:hAnsi="Times New Roman"/>
+          <w:b w:val="0"/>
+          <w:i w:val="0"/>
+          <w:color w:val="000000"/>
+          <w:sz w:val="28"/>
         </w:rPr>
         <w:t>0.1</w:t>
       </w:r>
@@ -136,143 +261,260 @@
     </w:p>
     <w:p>
       <w:pPr>
-        <w:pStyle w:val="Heading1"/>
+        <w:spacing w:line="360" w:lineRule="auto" w:before="0" w:after="0"/>
+        <w:ind w:firstLine="0"/>
+        <w:jc w:val="center"/>
       </w:pPr>
       <w:r>
-        <w:t>Зміст</w:t>
+        <w:rPr>
+          <w:rFonts w:ascii="Times New Roman" w:hAnsi="Times New Roman"/>
+          <w:b/>
+          <w:caps/>
+          <w:color w:val="000000"/>
+          <w:sz w:val="28"/>
+        </w:rPr>
+        <w:t>ЗМІСТ</w:t>
       </w:r>
     </w:p>
     <w:p>
+      <w:pPr>
+        <w:spacing w:line="360" w:lineRule="auto" w:before="0" w:after="0"/>
+        <w:ind w:firstLine="0"/>
+        <w:jc w:val="both"/>
+      </w:pPr>
+    </w:p>
+    <w:p>
+      <w:pPr>
+        <w:spacing w:line="360" w:lineRule="auto" w:before="0" w:after="0"/>
+        <w:ind w:firstLine="0"/>
+      </w:pPr>
       <w:r>
         <w:rPr>
-          <w:b/>
-          <w:sz w:val="22"/>
+          <w:rFonts w:ascii="Times New Roman" w:hAnsi="Times New Roman"/>
+          <w:b w:val="0"/>
+          <w:i w:val="0"/>
+          <w:color w:val="000000"/>
+          <w:sz w:val="28"/>
         </w:rPr>
-        <w:t>1. Вступ та мета проєкту</w:t>
+        <w:t>Вступ</w:t>
       </w:r>
       <w:r>
         <w:rPr>
-          <w:color w:val="999999"/>
+          <w:rFonts w:ascii="Times New Roman" w:hAnsi="Times New Roman"/>
+          <w:b w:val="0"/>
+          <w:i w:val="0"/>
+          <w:color w:val="000000"/>
+          <w:sz w:val="28"/>
         </w:rPr>
-        <w:t>.................................... 3</w:t>
+        <w:t xml:space="preserve"> ............................................................ 3</w:t>
       </w:r>
     </w:p>
     <w:p>
+      <w:pPr>
+        <w:spacing w:line="360" w:lineRule="auto" w:before="0" w:after="0"/>
+        <w:ind w:firstLine="0"/>
+      </w:pPr>
       <w:r>
         <w:rPr>
+          <w:rFonts w:ascii="Times New Roman" w:hAnsi="Times New Roman"/>
           <w:b/>
-          <w:sz w:val="22"/>
+          <w:i w:val="0"/>
+          <w:color w:val="000000"/>
+          <w:sz w:val="28"/>
         </w:rPr>
-        <w:t>2. Технічний стек та обґрунтування вибору</w:t>
+        <w:t>1 Технічний стек та обґрунтування вибору</w:t>
       </w:r>
       <w:r>
         <w:rPr>
-          <w:color w:val="999999"/>
+          <w:rFonts w:ascii="Times New Roman" w:hAnsi="Times New Roman"/>
+          <w:b w:val="0"/>
+          <w:i w:val="0"/>
+          <w:color w:val="000000"/>
+          <w:sz w:val="28"/>
         </w:rPr>
-        <w:t>................... 3</w:t>
+        <w:t xml:space="preserve"> ......................... 3</w:t>
       </w:r>
     </w:p>
     <w:p>
+      <w:pPr>
+        <w:spacing w:line="360" w:lineRule="auto" w:before="0" w:after="0"/>
+        <w:ind w:firstLine="0"/>
+      </w:pPr>
       <w:r>
         <w:rPr>
+          <w:rFonts w:ascii="Times New Roman" w:hAnsi="Times New Roman"/>
           <w:b/>
-          <w:sz w:val="22"/>
+          <w:i w:val="0"/>
+          <w:color w:val="000000"/>
+          <w:sz w:val="28"/>
         </w:rPr>
-        <w:t>Фаза 1: Підготовка середовища (Build Box)</w:t>
+        <w:t>2 Фаза 1. Підготовка середовища (Build Box)</w:t>
       </w:r>
       <w:r>
         <w:rPr>
-          <w:color w:val="999999"/>
+          <w:rFonts w:ascii="Times New Roman" w:hAnsi="Times New Roman"/>
+          <w:b w:val="0"/>
+          <w:i w:val="0"/>
+          <w:color w:val="000000"/>
+          <w:sz w:val="28"/>
         </w:rPr>
-        <w:t>................... 4</w:t>
+        <w:t xml:space="preserve"> ...................... 4</w:t>
       </w:r>
     </w:p>
     <w:p>
+      <w:pPr>
+        <w:spacing w:line="360" w:lineRule="auto" w:before="0" w:after="0"/>
+        <w:ind w:firstLine="0"/>
+      </w:pPr>
       <w:r>
         <w:rPr>
-          <w:sz w:val="22"/>
+          <w:rFonts w:ascii="Times New Roman" w:hAnsi="Times New Roman"/>
+          <w:b w:val="0"/>
+          <w:i w:val="0"/>
+          <w:color w:val="000000"/>
+          <w:sz w:val="28"/>
         </w:rPr>
-        <w:t xml:space="preserve">  1.1. Завантаження ISO-образу Devuan</w:t>
+        <w:t xml:space="preserve">  2.1 Завантаження ISO-образу Devuan</w:t>
       </w:r>
       <w:r>
         <w:rPr>
-          <w:color w:val="999999"/>
+          <w:rFonts w:ascii="Times New Roman" w:hAnsi="Times New Roman"/>
+          <w:b w:val="0"/>
+          <w:i w:val="0"/>
+          <w:color w:val="000000"/>
+          <w:sz w:val="28"/>
         </w:rPr>
-        <w:t>....................... 4</w:t>
+        <w:t xml:space="preserve"> ............................. 4</w:t>
       </w:r>
     </w:p>
     <w:p>
+      <w:pPr>
+        <w:spacing w:line="360" w:lineRule="auto" w:before="0" w:after="0"/>
+        <w:ind w:firstLine="0"/>
+      </w:pPr>
       <w:r>
         <w:rPr>
-          <w:sz w:val="22"/>
+          <w:rFonts w:ascii="Times New Roman" w:hAnsi="Times New Roman"/>
+          <w:b w:val="0"/>
+          <w:i w:val="0"/>
+          <w:color w:val="000000"/>
+          <w:sz w:val="28"/>
         </w:rPr>
-        <w:t xml:space="preserve">  1.2. Створення віртуальної машини у VMware</w:t>
+        <w:t xml:space="preserve">  2.2 Створення віртуальної машини у VMware</w:t>
       </w:r>
       <w:r>
         <w:rPr>
-          <w:color w:val="999999"/>
+          <w:rFonts w:ascii="Times New Roman" w:hAnsi="Times New Roman"/>
+          <w:b w:val="0"/>
+          <w:i w:val="0"/>
+          <w:color w:val="000000"/>
+          <w:sz w:val="28"/>
         </w:rPr>
-        <w:t>................ 4</w:t>
+        <w:t xml:space="preserve"> ...................... 5</w:t>
       </w:r>
     </w:p>
     <w:p>
+      <w:pPr>
+        <w:spacing w:line="360" w:lineRule="auto" w:before="0" w:after="0"/>
+        <w:ind w:firstLine="0"/>
+      </w:pPr>
       <w:r>
         <w:rPr>
+          <w:rFonts w:ascii="Times New Roman" w:hAnsi="Times New Roman"/>
           <w:b/>
-          <w:sz w:val="22"/>
+          <w:i w:val="0"/>
+          <w:color w:val="000000"/>
+          <w:sz w:val="28"/>
         </w:rPr>
-        <w:t>Фаза 2: Встановлення Devuan без графічного середовища</w:t>
+        <w:t>3 Фаза 2. Встановлення Devuan без графічного середовища</w:t>
       </w:r>
       <w:r>
         <w:rPr>
-          <w:color w:val="999999"/>
+          <w:rFonts w:ascii="Times New Roman" w:hAnsi="Times New Roman"/>
+          <w:b w:val="0"/>
+          <w:i w:val="0"/>
+          <w:color w:val="000000"/>
+          <w:sz w:val="28"/>
         </w:rPr>
-        <w:t>....... —</w:t>
+        <w:t xml:space="preserve"> .......... —</w:t>
       </w:r>
     </w:p>
     <w:p>
+      <w:pPr>
+        <w:spacing w:line="360" w:lineRule="auto" w:before="0" w:after="0"/>
+        <w:ind w:firstLine="0"/>
+      </w:pPr>
       <w:r>
         <w:rPr>
+          <w:rFonts w:ascii="Times New Roman" w:hAnsi="Times New Roman"/>
           <w:b/>
-          <w:sz w:val="22"/>
+          <w:i w:val="0"/>
+          <w:color w:val="000000"/>
+          <w:sz w:val="28"/>
         </w:rPr>
-        <w:t>Фаза 3: Конфігурування live-build</w:t>
+        <w:t>4 Фаза 3. Конфігурування live-build</w:t>
       </w:r>
       <w:r>
         <w:rPr>
-          <w:color w:val="999999"/>
+          <w:rFonts w:ascii="Times New Roman" w:hAnsi="Times New Roman"/>
+          <w:b w:val="0"/>
+          <w:i w:val="0"/>
+          <w:color w:val="000000"/>
+          <w:sz w:val="28"/>
         </w:rPr>
-        <w:t>........................... —</w:t>
+        <w:t xml:space="preserve"> .............................. —</w:t>
       </w:r>
     </w:p>
     <w:p>
+      <w:pPr>
+        <w:spacing w:line="360" w:lineRule="auto" w:before="0" w:after="0"/>
+        <w:ind w:firstLine="0"/>
+      </w:pPr>
       <w:r>
         <w:rPr>
+          <w:rFonts w:ascii="Times New Roman" w:hAnsi="Times New Roman"/>
           <w:b/>
-          <w:sz w:val="22"/>
+          <w:i w:val="0"/>
+          <w:color w:val="000000"/>
+          <w:sz w:val="28"/>
         </w:rPr>
-        <w:t>Фаза 4: Збірка ISO-образу</w:t>
+        <w:t>5 Фаза 4. Збірка ISO-образу</w:t>
       </w:r>
       <w:r>
         <w:rPr>
-          <w:color w:val="999999"/>
+          <w:rFonts w:ascii="Times New Roman" w:hAnsi="Times New Roman"/>
+          <w:b w:val="0"/>
+          <w:i w:val="0"/>
+          <w:color w:val="000000"/>
+          <w:sz w:val="28"/>
         </w:rPr>
-        <w:t>................................... —</w:t>
+        <w:t xml:space="preserve"> ...................................... —</w:t>
       </w:r>
     </w:p>
     <w:p>
+      <w:pPr>
+        <w:spacing w:line="360" w:lineRule="auto" w:before="0" w:after="0"/>
+        <w:ind w:firstLine="0"/>
+      </w:pPr>
       <w:r>
         <w:rPr>
+          <w:rFonts w:ascii="Times New Roman" w:hAnsi="Times New Roman"/>
           <w:b/>
-          <w:sz w:val="22"/>
+          <w:i w:val="0"/>
+          <w:color w:val="000000"/>
+          <w:sz w:val="28"/>
         </w:rPr>
-        <w:t>Фаза 5: Тестування та оптимізація</w:t>
+        <w:t>6 Фаза 5. Тестування та оптимізація</w:t>
       </w:r>
       <w:r>
         <w:rPr>
-          <w:color w:val="999999"/>
+          <w:rFonts w:ascii="Times New Roman" w:hAnsi="Times New Roman"/>
+          <w:b w:val="0"/>
+          <w:i w:val="0"/>
+          <w:color w:val="000000"/>
+          <w:sz w:val="28"/>
         </w:rPr>
-        <w:t>........................... —</w:t>
+        <w:t xml:space="preserve"> .............................. —</w:t>
       </w:r>
     </w:p>
     <w:p>
@@ -282,26 +524,140 @@
     </w:p>
     <w:p>
       <w:pPr>
-        <w:pStyle w:val="Heading1"/>
+        <w:spacing w:line="360" w:lineRule="auto" w:before="0" w:after="0"/>
+        <w:ind w:firstLine="0"/>
+        <w:jc w:val="center"/>
       </w:pPr>
       <w:r>
-        <w:t>1. Вступ та мета проєкту</w:t>
+        <w:rPr>
+          <w:rFonts w:ascii="Times New Roman" w:hAnsi="Times New Roman"/>
+          <w:b/>
+          <w:caps/>
+          <w:color w:val="000000"/>
+          <w:sz w:val="28"/>
+        </w:rPr>
+        <w:t>ВСТУП</w:t>
+      </w:r>
+    </w:p>
+    <w:p>
+      <w:pPr>
+        <w:spacing w:line="360" w:lineRule="auto" w:before="0" w:after="0"/>
+        <w:ind w:firstLine="0"/>
+        <w:jc w:val="both"/>
+      </w:pPr>
+    </w:p>
+    <w:p>
+      <w:pPr>
+        <w:spacing w:line="360" w:lineRule="auto" w:before="0" w:after="0"/>
+        <w:ind w:firstLine="709"/>
+        <w:jc w:val="both"/>
+      </w:pPr>
+      <w:r>
+        <w:rPr>
+          <w:rFonts w:ascii="Times New Roman" w:hAnsi="Times New Roman"/>
+          <w:b w:val="0"/>
+          <w:i w:val="0"/>
+          <w:color w:val="000000"/>
+          <w:sz w:val="28"/>
+        </w:rPr>
+        <w:t>Даний щоденник фіксує процес розробки власного дистрибутиву GNU/Linux на базі Devuan Excalibur 6.x. Devuan є форком дистрибутиву Debian, головною особливістю якого є відмова від системи ініціалізації systemd на користь класичного SysVinit.</w:t>
+      </w:r>
+    </w:p>
+    <w:p>
+      <w:pPr>
+        <w:spacing w:line="360" w:lineRule="auto" w:before="0" w:after="0"/>
+        <w:ind w:firstLine="709"/>
+        <w:jc w:val="both"/>
+      </w:pPr>
+      <w:r>
+        <w:rPr>
+          <w:rFonts w:ascii="Times New Roman" w:hAnsi="Times New Roman"/>
+          <w:b w:val="0"/>
+          <w:i w:val="0"/>
+          <w:color w:val="000000"/>
+          <w:sz w:val="28"/>
+        </w:rPr>
+        <w:t>Метою проєкту є створення мінімальної, безпечної та відтворюваної (reproducible) системи, яка може використовуватися як основа для спеціалізованих середовищ безпеки. Кінцевим результатом є завантажувальний ISO-образ, зібраний інструментом live-build, з повністю задокументованим та версіонованим процесом збірки через систему контролю версій Git.</w:t>
+      </w:r>
+    </w:p>
+    <w:p>
+      <w:pPr>
+        <w:spacing w:line="360" w:lineRule="auto" w:before="0" w:after="0"/>
+        <w:ind w:firstLine="709"/>
+        <w:jc w:val="both"/>
+      </w:pPr>
+      <w:r>
+        <w:rPr>
+          <w:rFonts w:ascii="Times New Roman" w:hAnsi="Times New Roman"/>
+          <w:b w:val="0"/>
+          <w:i w:val="0"/>
+          <w:color w:val="000000"/>
+          <w:sz w:val="28"/>
+        </w:rPr>
+        <w:t>Кожен крок розробки фіксується у вигляді Git-комітів із відповідними скріншотами, що забезпечує повну відтворюваність проєкту та слугує технічним щоденником.</w:t>
       </w:r>
     </w:p>
     <w:p>
       <w:r>
-        <w:t>Даний щоденник фіксує процес розробки власного дистрибутиву GNU/Linux на базі Devuan Excalibur 6.x. Devuan є форком дистрибутиву Debian, головною особливістю якого є відмова від системи ініціалізації systemd на користь класичного SysVinit або альтернативних рішень (runit, OpenRC).</w:t>
-        <w:br/>
-        <w:br/>
-        <w:t>Мета проєкту — створити мінімальну, безпечну та відтворювану (reproducible) систему, яка може використовуватися як основа для спеціалізованих середовищ безпеки. Кінцевий результат — завантажувальний ISO-образ, зібраний інструментом live-build, з повністю задокументованим та версіонованим процесом збірки через Git.</w:t>
+        <w:br w:type="page"/>
       </w:r>
     </w:p>
     <w:p>
       <w:pPr>
-        <w:pStyle w:val="Heading1"/>
+        <w:spacing w:line="360" w:lineRule="auto" w:before="0" w:after="0"/>
+        <w:ind w:firstLine="0"/>
+        <w:jc w:val="center"/>
       </w:pPr>
       <w:r>
-        <w:t>2. Технічний стек та обґрунтування вибору</w:t>
+        <w:rPr>
+          <w:rFonts w:ascii="Times New Roman" w:hAnsi="Times New Roman"/>
+          <w:b/>
+          <w:caps/>
+          <w:color w:val="000000"/>
+          <w:sz w:val="28"/>
+        </w:rPr>
+        <w:t>1 ТЕХНІЧНИЙ СТЕК ТА ОБҐРУНТУВАННЯ ВИБОРУ</w:t>
+      </w:r>
+    </w:p>
+    <w:p>
+      <w:pPr>
+        <w:spacing w:line="360" w:lineRule="auto" w:before="0" w:after="0"/>
+        <w:ind w:firstLine="0"/>
+        <w:jc w:val="both"/>
+      </w:pPr>
+    </w:p>
+    <w:p>
+      <w:pPr>
+        <w:spacing w:line="360" w:lineRule="auto" w:before="0" w:after="0"/>
+        <w:ind w:firstLine="709"/>
+        <w:jc w:val="both"/>
+      </w:pPr>
+      <w:r>
+        <w:rPr>
+          <w:rFonts w:ascii="Times New Roman" w:hAnsi="Times New Roman"/>
+          <w:b w:val="0"/>
+          <w:i w:val="0"/>
+          <w:color w:val="000000"/>
+          <w:sz w:val="28"/>
+        </w:rPr>
+        <w:t>У таблиці 1.1 наведено перелік технологій та інструментів, обраних для реалізації проєкту, із зазначенням обґрунтування кожного вибору.</w:t>
+      </w:r>
+    </w:p>
+    <w:p>
+      <w:pPr>
+        <w:spacing w:line="360" w:lineRule="auto" w:before="0" w:after="0"/>
+        <w:ind w:firstLine="0"/>
+        <w:jc w:val="left"/>
+      </w:pPr>
+      <w:r>
+        <w:rPr>
+          <w:rFonts w:ascii="Times New Roman" w:hAnsi="Times New Roman"/>
+          <w:b w:val="0"/>
+          <w:i w:val="0"/>
+          <w:color w:val="000000"/>
+          <w:sz w:val="28"/>
+        </w:rPr>
+        <w:t>Таблиця 1.1 — Технічний стек проєкту</w:t>
       </w:r>
     </w:p>
     <w:tbl>
@@ -311,21 +667,27 @@
         <w:tblLook w:firstColumn="1" w:firstRow="1" w:lastColumn="0" w:lastRow="0" w:noHBand="0" w:noVBand="1" w:val="04A0"/>
       </w:tblPr>
       <w:tblGrid>
-        <w:gridCol w:w="3118"/>
-        <w:gridCol w:w="3118"/>
-        <w:gridCol w:w="3118"/>
+        <w:gridCol w:w="3213"/>
+        <w:gridCol w:w="3213"/>
+        <w:gridCol w:w="3213"/>
       </w:tblGrid>
       <w:tr>
         <w:tc>
           <w:tcPr>
-            <w:tcW w:type="dxa" w:w="3118"/>
-            <w:shd w:val="clear" w:color="auto" w:fill="1A569A"/>
+            <w:tcW w:type="dxa" w:w="3213"/>
+            <w:shd w:val="clear" w:color="auto" w:fill="C0C0C0"/>
           </w:tcPr>
           <w:p>
+            <w:pPr>
+              <w:spacing w:line="360" w:lineRule="auto"/>
+              <w:jc w:val="center"/>
+            </w:pPr>
+            <w:r/>
             <w:r>
               <w:rPr>
+                <w:rFonts w:ascii="Times New Roman" w:hAnsi="Times New Roman"/>
                 <w:b/>
-                <w:color w:val="FFFFFF"/>
+                <w:sz w:val="28"/>
               </w:rPr>
               <w:t>Компонент</w:t>
             </w:r>
@@ -333,14 +695,20 @@
         </w:tc>
         <w:tc>
           <w:tcPr>
-            <w:tcW w:type="dxa" w:w="3118"/>
-            <w:shd w:val="clear" w:color="auto" w:fill="1A569A"/>
+            <w:tcW w:type="dxa" w:w="3213"/>
+            <w:shd w:val="clear" w:color="auto" w:fill="C0C0C0"/>
           </w:tcPr>
           <w:p>
+            <w:pPr>
+              <w:spacing w:line="360" w:lineRule="auto"/>
+              <w:jc w:val="center"/>
+            </w:pPr>
+            <w:r/>
             <w:r>
               <w:rPr>
+                <w:rFonts w:ascii="Times New Roman" w:hAnsi="Times New Roman"/>
                 <w:b/>
-                <w:color w:val="FFFFFF"/>
+                <w:sz w:val="28"/>
               </w:rPr>
               <w:t>Вибір</w:t>
             </w:r>
@@ -348,14 +716,20 @@
         </w:tc>
         <w:tc>
           <w:tcPr>
-            <w:tcW w:type="dxa" w:w="3118"/>
-            <w:shd w:val="clear" w:color="auto" w:fill="1A569A"/>
+            <w:tcW w:type="dxa" w:w="3213"/>
+            <w:shd w:val="clear" w:color="auto" w:fill="C0C0C0"/>
           </w:tcPr>
           <w:p>
+            <w:pPr>
+              <w:spacing w:line="360" w:lineRule="auto"/>
+              <w:jc w:val="center"/>
+            </w:pPr>
+            <w:r/>
             <w:r>
               <w:rPr>
+                <w:rFonts w:ascii="Times New Roman" w:hAnsi="Times New Roman"/>
                 <w:b/>
-                <w:color w:val="FFFFFF"/>
+                <w:sz w:val="28"/>
               </w:rPr>
               <w:t>Обґрунтування</w:t>
             </w:r>
@@ -365,12 +739,20 @@
       <w:tr>
         <w:tc>
           <w:tcPr>
-            <w:tcW w:type="dxa" w:w="3118"/>
+            <w:tcW w:type="dxa" w:w="3213"/>
           </w:tcPr>
           <w:p>
+            <w:pPr>
+              <w:spacing w:line="360" w:lineRule="auto"/>
+              <w:ind w:firstLine="0"/>
+              <w:jc w:val="left"/>
+            </w:pPr>
+            <w:r/>
             <w:r>
               <w:rPr>
+                <w:rFonts w:ascii="Times New Roman" w:hAnsi="Times New Roman"/>
                 <w:b/>
+                <w:sz w:val="28"/>
               </w:rPr>
               <w:t>База дистрибутиву</w:t>
             </w:r>
@@ -378,20 +760,40 @@
         </w:tc>
         <w:tc>
           <w:tcPr>
-            <w:tcW w:type="dxa" w:w="3118"/>
+            <w:tcW w:type="dxa" w:w="3213"/>
           </w:tcPr>
           <w:p>
+            <w:pPr>
+              <w:spacing w:line="360" w:lineRule="auto"/>
+              <w:ind w:firstLine="0"/>
+              <w:jc w:val="left"/>
+            </w:pPr>
+            <w:r/>
             <w:r>
+              <w:rPr>
+                <w:rFonts w:ascii="Times New Roman" w:hAnsi="Times New Roman"/>
+                <w:sz w:val="28"/>
+              </w:rPr>
               <w:t>Devuan Excalibur 6.1.1</w:t>
             </w:r>
           </w:p>
         </w:tc>
         <w:tc>
           <w:tcPr>
-            <w:tcW w:type="dxa" w:w="3118"/>
+            <w:tcW w:type="dxa" w:w="3213"/>
           </w:tcPr>
           <w:p>
+            <w:pPr>
+              <w:spacing w:line="360" w:lineRule="auto"/>
+              <w:ind w:firstLine="0"/>
+              <w:jc w:val="left"/>
+            </w:pPr>
+            <w:r/>
             <w:r>
+              <w:rPr>
+                <w:rFonts w:ascii="Times New Roman" w:hAnsi="Times New Roman"/>
+                <w:sz w:val="28"/>
+              </w:rPr>
               <w:t>Debian без systemd, стабільна база</w:t>
             </w:r>
           </w:p>
@@ -400,12 +802,20 @@
       <w:tr>
         <w:tc>
           <w:tcPr>
-            <w:tcW w:type="dxa" w:w="3118"/>
+            <w:tcW w:type="dxa" w:w="3213"/>
           </w:tcPr>
           <w:p>
+            <w:pPr>
+              <w:spacing w:line="360" w:lineRule="auto"/>
+              <w:ind w:firstLine="0"/>
+              <w:jc w:val="left"/>
+            </w:pPr>
+            <w:r/>
             <w:r>
               <w:rPr>
+                <w:rFonts w:ascii="Times New Roman" w:hAnsi="Times New Roman"/>
                 <w:b/>
+                <w:sz w:val="28"/>
               </w:rPr>
               <w:t>Ядро</w:t>
             </w:r>
@@ -413,20 +823,40 @@
         </w:tc>
         <w:tc>
           <w:tcPr>
-            <w:tcW w:type="dxa" w:w="3118"/>
+            <w:tcW w:type="dxa" w:w="3213"/>
           </w:tcPr>
           <w:p>
+            <w:pPr>
+              <w:spacing w:line="360" w:lineRule="auto"/>
+              <w:ind w:firstLine="0"/>
+              <w:jc w:val="left"/>
+            </w:pPr>
+            <w:r/>
             <w:r>
+              <w:rPr>
+                <w:rFonts w:ascii="Times New Roman" w:hAnsi="Times New Roman"/>
+                <w:sz w:val="28"/>
+              </w:rPr>
               <w:t>Linux (стабільний реліз)</w:t>
             </w:r>
           </w:p>
         </w:tc>
         <w:tc>
           <w:tcPr>
-            <w:tcW w:type="dxa" w:w="3118"/>
+            <w:tcW w:type="dxa" w:w="3213"/>
           </w:tcPr>
           <w:p>
+            <w:pPr>
+              <w:spacing w:line="360" w:lineRule="auto"/>
+              <w:ind w:firstLine="0"/>
+              <w:jc w:val="left"/>
+            </w:pPr>
+            <w:r/>
             <w:r>
+              <w:rPr>
+                <w:rFonts w:ascii="Times New Roman" w:hAnsi="Times New Roman"/>
+                <w:sz w:val="28"/>
+              </w:rPr>
               <w:t>Широка підтримка обладнання</w:t>
             </w:r>
           </w:p>
@@ -435,12 +865,20 @@
       <w:tr>
         <w:tc>
           <w:tcPr>
-            <w:tcW w:type="dxa" w:w="3118"/>
+            <w:tcW w:type="dxa" w:w="3213"/>
           </w:tcPr>
           <w:p>
+            <w:pPr>
+              <w:spacing w:line="360" w:lineRule="auto"/>
+              <w:ind w:firstLine="0"/>
+              <w:jc w:val="left"/>
+            </w:pPr>
+            <w:r/>
             <w:r>
               <w:rPr>
+                <w:rFonts w:ascii="Times New Roman" w:hAnsi="Times New Roman"/>
                 <w:b/>
+                <w:sz w:val="28"/>
               </w:rPr>
               <w:t>Init система</w:t>
             </w:r>
@@ -448,20 +886,40 @@
         </w:tc>
         <w:tc>
           <w:tcPr>
-            <w:tcW w:type="dxa" w:w="3118"/>
+            <w:tcW w:type="dxa" w:w="3213"/>
           </w:tcPr>
           <w:p>
+            <w:pPr>
+              <w:spacing w:line="360" w:lineRule="auto"/>
+              <w:ind w:firstLine="0"/>
+              <w:jc w:val="left"/>
+            </w:pPr>
+            <w:r/>
             <w:r>
+              <w:rPr>
+                <w:rFonts w:ascii="Times New Roman" w:hAnsi="Times New Roman"/>
+                <w:sz w:val="28"/>
+              </w:rPr>
               <w:t>SysVinit</w:t>
             </w:r>
           </w:p>
         </w:tc>
         <w:tc>
           <w:tcPr>
-            <w:tcW w:type="dxa" w:w="3118"/>
+            <w:tcW w:type="dxa" w:w="3213"/>
           </w:tcPr>
           <w:p>
+            <w:pPr>
+              <w:spacing w:line="360" w:lineRule="auto"/>
+              <w:ind w:firstLine="0"/>
+              <w:jc w:val="left"/>
+            </w:pPr>
+            <w:r/>
             <w:r>
+              <w:rPr>
+                <w:rFonts w:ascii="Times New Roman" w:hAnsi="Times New Roman"/>
+                <w:sz w:val="28"/>
+              </w:rPr>
               <w:t>Простота, передбачуваність, без залежностей</w:t>
             </w:r>
           </w:p>
@@ -470,12 +928,20 @@
       <w:tr>
         <w:tc>
           <w:tcPr>
-            <w:tcW w:type="dxa" w:w="3118"/>
+            <w:tcW w:type="dxa" w:w="3213"/>
           </w:tcPr>
           <w:p>
+            <w:pPr>
+              <w:spacing w:line="360" w:lineRule="auto"/>
+              <w:ind w:firstLine="0"/>
+              <w:jc w:val="left"/>
+            </w:pPr>
+            <w:r/>
             <w:r>
               <w:rPr>
+                <w:rFonts w:ascii="Times New Roman" w:hAnsi="Times New Roman"/>
                 <w:b/>
+                <w:sz w:val="28"/>
               </w:rPr>
               <w:t>Робочий стіл</w:t>
             </w:r>
@@ -483,20 +949,40 @@
         </w:tc>
         <w:tc>
           <w:tcPr>
-            <w:tcW w:type="dxa" w:w="3118"/>
+            <w:tcW w:type="dxa" w:w="3213"/>
           </w:tcPr>
           <w:p>
+            <w:pPr>
+              <w:spacing w:line="360" w:lineRule="auto"/>
+              <w:ind w:firstLine="0"/>
+              <w:jc w:val="left"/>
+            </w:pPr>
+            <w:r/>
             <w:r>
+              <w:rPr>
+                <w:rFonts w:ascii="Times New Roman" w:hAnsi="Times New Roman"/>
+                <w:sz w:val="28"/>
+              </w:rPr>
               <w:t>XFCE 4</w:t>
             </w:r>
           </w:p>
         </w:tc>
         <w:tc>
           <w:tcPr>
-            <w:tcW w:type="dxa" w:w="3118"/>
+            <w:tcW w:type="dxa" w:w="3213"/>
           </w:tcPr>
           <w:p>
+            <w:pPr>
+              <w:spacing w:line="360" w:lineRule="auto"/>
+              <w:ind w:firstLine="0"/>
+              <w:jc w:val="left"/>
+            </w:pPr>
+            <w:r/>
             <w:r>
+              <w:rPr>
+                <w:rFonts w:ascii="Times New Roman" w:hAnsi="Times New Roman"/>
+                <w:sz w:val="28"/>
+              </w:rPr>
               <w:t>Легковаговість, повна функціональність</w:t>
             </w:r>
           </w:p>
@@ -505,12 +991,20 @@
       <w:tr>
         <w:tc>
           <w:tcPr>
-            <w:tcW w:type="dxa" w:w="3118"/>
+            <w:tcW w:type="dxa" w:w="3213"/>
           </w:tcPr>
           <w:p>
+            <w:pPr>
+              <w:spacing w:line="360" w:lineRule="auto"/>
+              <w:ind w:firstLine="0"/>
+              <w:jc w:val="left"/>
+            </w:pPr>
+            <w:r/>
             <w:r>
               <w:rPr>
+                <w:rFonts w:ascii="Times New Roman" w:hAnsi="Times New Roman"/>
                 <w:b/>
+                <w:sz w:val="28"/>
               </w:rPr>
               <w:t>Інструмент збірки</w:t>
             </w:r>
@@ -518,20 +1012,40 @@
         </w:tc>
         <w:tc>
           <w:tcPr>
-            <w:tcW w:type="dxa" w:w="3118"/>
+            <w:tcW w:type="dxa" w:w="3213"/>
           </w:tcPr>
           <w:p>
+            <w:pPr>
+              <w:spacing w:line="360" w:lineRule="auto"/>
+              <w:ind w:firstLine="0"/>
+              <w:jc w:val="left"/>
+            </w:pPr>
+            <w:r/>
             <w:r>
+              <w:rPr>
+                <w:rFonts w:ascii="Times New Roman" w:hAnsi="Times New Roman"/>
+                <w:sz w:val="28"/>
+              </w:rPr>
               <w:t>live-build</w:t>
             </w:r>
           </w:p>
         </w:tc>
         <w:tc>
           <w:tcPr>
-            <w:tcW w:type="dxa" w:w="3118"/>
+            <w:tcW w:type="dxa" w:w="3213"/>
           </w:tcPr>
           <w:p>
+            <w:pPr>
+              <w:spacing w:line="360" w:lineRule="auto"/>
+              <w:ind w:firstLine="0"/>
+              <w:jc w:val="left"/>
+            </w:pPr>
+            <w:r/>
             <w:r>
+              <w:rPr>
+                <w:rFonts w:ascii="Times New Roman" w:hAnsi="Times New Roman"/>
+                <w:sz w:val="28"/>
+              </w:rPr>
               <w:t>Декларативна конфігурація, стандарт Debian</w:t>
             </w:r>
           </w:p>
@@ -540,12 +1054,20 @@
       <w:tr>
         <w:tc>
           <w:tcPr>
-            <w:tcW w:type="dxa" w:w="3118"/>
+            <w:tcW w:type="dxa" w:w="3213"/>
           </w:tcPr>
           <w:p>
+            <w:pPr>
+              <w:spacing w:line="360" w:lineRule="auto"/>
+              <w:ind w:firstLine="0"/>
+              <w:jc w:val="left"/>
+            </w:pPr>
+            <w:r/>
             <w:r>
               <w:rPr>
+                <w:rFonts w:ascii="Times New Roman" w:hAnsi="Times New Roman"/>
                 <w:b/>
+                <w:sz w:val="28"/>
               </w:rPr>
               <w:t>Гіпервізор</w:t>
             </w:r>
@@ -553,20 +1075,40 @@
         </w:tc>
         <w:tc>
           <w:tcPr>
-            <w:tcW w:type="dxa" w:w="3118"/>
+            <w:tcW w:type="dxa" w:w="3213"/>
           </w:tcPr>
           <w:p>
+            <w:pPr>
+              <w:spacing w:line="360" w:lineRule="auto"/>
+              <w:ind w:firstLine="0"/>
+              <w:jc w:val="left"/>
+            </w:pPr>
+            <w:r/>
             <w:r>
+              <w:rPr>
+                <w:rFonts w:ascii="Times New Roman" w:hAnsi="Times New Roman"/>
+                <w:sz w:val="28"/>
+              </w:rPr>
               <w:t>VMware Workstation Pro 25H2</w:t>
             </w:r>
           </w:p>
         </w:tc>
         <w:tc>
           <w:tcPr>
-            <w:tcW w:type="dxa" w:w="3118"/>
+            <w:tcW w:type="dxa" w:w="3213"/>
           </w:tcPr>
           <w:p>
+            <w:pPr>
+              <w:spacing w:line="360" w:lineRule="auto"/>
+              <w:ind w:firstLine="0"/>
+              <w:jc w:val="left"/>
+            </w:pPr>
+            <w:r/>
             <w:r>
+              <w:rPr>
+                <w:rFonts w:ascii="Times New Roman" w:hAnsi="Times New Roman"/>
+                <w:sz w:val="28"/>
+              </w:rPr>
               <w:t>Build Box та тестове середовище</w:t>
             </w:r>
           </w:p>
@@ -575,12 +1117,20 @@
       <w:tr>
         <w:tc>
           <w:tcPr>
-            <w:tcW w:type="dxa" w:w="3118"/>
+            <w:tcW w:type="dxa" w:w="3213"/>
           </w:tcPr>
           <w:p>
+            <w:pPr>
+              <w:spacing w:line="360" w:lineRule="auto"/>
+              <w:ind w:firstLine="0"/>
+              <w:jc w:val="left"/>
+            </w:pPr>
+            <w:r/>
             <w:r>
               <w:rPr>
+                <w:rFonts w:ascii="Times New Roman" w:hAnsi="Times New Roman"/>
                 <w:b/>
+                <w:sz w:val="28"/>
               </w:rPr>
               <w:t>Версіонування</w:t>
             </w:r>
@@ -588,20 +1138,40 @@
         </w:tc>
         <w:tc>
           <w:tcPr>
-            <w:tcW w:type="dxa" w:w="3118"/>
+            <w:tcW w:type="dxa" w:w="3213"/>
           </w:tcPr>
           <w:p>
+            <w:pPr>
+              <w:spacing w:line="360" w:lineRule="auto"/>
+              <w:ind w:firstLine="0"/>
+              <w:jc w:val="left"/>
+            </w:pPr>
+            <w:r/>
             <w:r>
+              <w:rPr>
+                <w:rFonts w:ascii="Times New Roman" w:hAnsi="Times New Roman"/>
+                <w:sz w:val="28"/>
+              </w:rPr>
               <w:t>Git + GitHub</w:t>
             </w:r>
           </w:p>
         </w:tc>
         <w:tc>
           <w:tcPr>
-            <w:tcW w:type="dxa" w:w="3118"/>
+            <w:tcW w:type="dxa" w:w="3213"/>
           </w:tcPr>
           <w:p>
+            <w:pPr>
+              <w:spacing w:line="360" w:lineRule="auto"/>
+              <w:ind w:firstLine="0"/>
+              <w:jc w:val="left"/>
+            </w:pPr>
+            <w:r/>
             <w:r>
+              <w:rPr>
+                <w:rFonts w:ascii="Times New Roman" w:hAnsi="Times New Roman"/>
+                <w:sz w:val="28"/>
+              </w:rPr>
               <w:t>Відтворюваність збірки, журнал змін</w:t>
             </w:r>
           </w:p>
@@ -615,352 +1185,125 @@
     </w:p>
     <w:p>
       <w:pPr>
-        <w:pStyle w:val="Heading1"/>
+        <w:spacing w:line="360" w:lineRule="auto" w:before="0" w:after="0"/>
+        <w:ind w:firstLine="0"/>
+        <w:jc w:val="center"/>
       </w:pPr>
       <w:r>
-        <w:t>Фаза 1: Підготовка середовища (Build Box)</w:t>
-      </w:r>
-    </w:p>
-    <w:p>
-      <w:r>
         <w:rPr>
+          <w:rFonts w:ascii="Times New Roman" w:hAnsi="Times New Roman"/>
           <w:b/>
-          <w:color w:val="FFC107"/>
+          <w:caps/>
+          <w:color w:val="000000"/>
+          <w:sz w:val="28"/>
         </w:rPr>
-        <w:t>▶ Статус: В процесі</w:t>
-      </w:r>
-    </w:p>
-    <w:p/>
-    <w:p>
-      <w:r>
-        <w:t>Мета цієї фази — підготувати еталонне середовище (Build Box) у вигляді віртуальної машини, де надалі відбуватиметься збірка дистрибутиву. Обрана платформа — VMware Workstation Pro 25H2, оскільки вона надає стабільне та ізольоване середовище для роботи.</w:t>
+        <w:t>2 ФАЗА 1. ПІДГОТОВКА СЕРЕДОВИЩА (BUILD BOX)</w:t>
       </w:r>
     </w:p>
     <w:p>
       <w:pPr>
-        <w:pStyle w:val="Heading2"/>
+        <w:spacing w:line="360" w:lineRule="auto" w:before="0" w:after="0"/>
+        <w:ind w:firstLine="0"/>
+        <w:jc w:val="both"/>
+      </w:pPr>
+    </w:p>
+    <w:p>
+      <w:pPr>
+        <w:spacing w:line="360" w:lineRule="auto" w:before="0" w:after="0"/>
+        <w:ind w:firstLine="709"/>
+        <w:jc w:val="both"/>
       </w:pPr>
       <w:r>
-        <w:t>Крок 1.1: Завантаження ISO-образу Devuan</w:t>
+        <w:rPr>
+          <w:rFonts w:ascii="Times New Roman" w:hAnsi="Times New Roman"/>
+          <w:b w:val="0"/>
+          <w:i w:val="0"/>
+          <w:color w:val="000000"/>
+          <w:sz w:val="28"/>
+        </w:rPr>
+        <w:t>Метою даної фази є підготовка еталонного середовища збірки (Build Box) у вигляді віртуальної машини під управлінням VMware Workstation Pro 25H2. Саме в цьому середовищі надалі виконуватиметься збірка дистрибутиву за допомогою live-build.</w:t>
       </w:r>
     </w:p>
     <w:p>
-      <w:r>
-        <w:t>Для встановлення Build Box обрано образ типу netinstall дистрибутиву Devuan Excalibur 6.1.1 (amd64). Цей тип образу є мінімальним встановлювачем, який завантажує лише базову систему, а всі пакети отримує з мережі під час встановлення. Це гарантує актуальність встановлених пакетів.</w:t>
-        <w:br/>
-        <w:br/>
-        <w:t>Образ завантажено з офіційного архіву Devuan: files.devuan.org. Версія Excalibur 6.x базується на Debian 13 (Trixie) та є поточним стабільним релізом.</w:t>
-      </w:r>
-    </w:p>
-    <w:p/>
-    <w:p>
       <w:pPr>
-        <w:jc w:val="center"/>
+        <w:spacing w:line="360" w:lineRule="auto" w:before="0" w:after="0"/>
+        <w:ind w:firstLine="709"/>
+        <w:jc w:val="left"/>
       </w:pPr>
       <w:r>
         <w:rPr>
-          <w:i/>
-          <w:color w:val="FF0000"/>
+          <w:rFonts w:ascii="Times New Roman" w:hAnsi="Times New Roman"/>
+          <w:b/>
+          <w:color w:val="000000"/>
+          <w:sz w:val="28"/>
         </w:rPr>
-        <w:t>[СКРІНШОТ ВІДСУТНІЙ: 1.1_devuan_release_archive.png]</w:t>
-      </w:r>
-    </w:p>
-    <w:p/>
-    <w:p>
-      <w:pPr>
-        <w:pStyle w:val="Heading2"/>
-      </w:pPr>
-      <w:r>
-        <w:t>Крок 1.2: Створення віртуальної машини у VMware Workstation</w:t>
+        <w:t>2.1 Завантаження ISO-образу Devuan</w:t>
       </w:r>
     </w:p>
     <w:p>
+      <w:pPr>
+        <w:spacing w:line="360" w:lineRule="auto" w:before="0" w:after="0"/>
+        <w:ind w:firstLine="0"/>
+        <w:jc w:val="both"/>
+      </w:pPr>
+    </w:p>
+    <w:p>
+      <w:pPr>
+        <w:spacing w:line="360" w:lineRule="auto" w:before="0" w:after="0"/>
+        <w:ind w:firstLine="709"/>
+        <w:jc w:val="both"/>
+      </w:pPr>
       <w:r>
-        <w:t>Для Build Box створено нову віртуальну машину у VMware Workstation Pro 25H2. Параметри ВМ підібрані з урахуванням вимог процесу збірки дистрибутиву через live-build, який потребує достатньо оперативної пам'яті та обчислювальних ресурсів.</w:t>
+        <w:rPr>
+          <w:rFonts w:ascii="Times New Roman" w:hAnsi="Times New Roman"/>
+          <w:b w:val="0"/>
+          <w:i w:val="0"/>
+          <w:color w:val="000000"/>
+          <w:sz w:val="28"/>
+        </w:rPr>
+        <w:t>Для встановлення Build Box обрано образ типу netinstall дистрибутиву Devuan Excalibur 6.1.1 (amd64). Даний тип образу є мінімальним встановлювачем, що завантажує лише базову систему, а всі пакети отримує з мережі під час встановлення. Це забезпечує актуальність встановлених пакетів.</w:t>
       </w:r>
     </w:p>
     <w:p>
-      <w:r>
-        <w:rPr>
-          <w:b/>
-        </w:rPr>
-        <w:t>Параметри створеної віртуальної машини:</w:t>
-      </w:r>
-    </w:p>
-    <w:tbl>
-      <w:tblPr>
-        <w:tblStyle w:val="TableGrid"/>
-        <w:tblW w:type="auto" w:w="0"/>
-        <w:tblLook w:firstColumn="1" w:firstRow="1" w:lastColumn="0" w:lastRow="0" w:noHBand="0" w:noVBand="1" w:val="04A0"/>
-      </w:tblPr>
-      <w:tblGrid>
-        <w:gridCol w:w="4677"/>
-        <w:gridCol w:w="4677"/>
-      </w:tblGrid>
-      <w:tr>
-        <w:tc>
-          <w:tcPr>
-            <w:tcW w:type="dxa" w:w="4677"/>
-            <w:shd w:val="clear" w:color="auto" w:fill="2E75B6"/>
-          </w:tcPr>
-          <w:p>
-            <w:r>
-              <w:rPr>
-                <w:b/>
-                <w:color w:val="FFFFFF"/>
-              </w:rPr>
-              <w:t>Параметр</w:t>
-            </w:r>
-          </w:p>
-        </w:tc>
-        <w:tc>
-          <w:tcPr>
-            <w:tcW w:type="dxa" w:w="4677"/>
-            <w:shd w:val="clear" w:color="auto" w:fill="2E75B6"/>
-          </w:tcPr>
-          <w:p>
-            <w:r>
-              <w:rPr>
-                <w:b/>
-                <w:color w:val="FFFFFF"/>
-              </w:rPr>
-              <w:t>Значення</w:t>
-            </w:r>
-          </w:p>
-        </w:tc>
-      </w:tr>
-      <w:tr>
-        <w:tc>
-          <w:tcPr>
-            <w:tcW w:type="dxa" w:w="4677"/>
-          </w:tcPr>
-          <w:p>
-            <w:r>
-              <w:rPr>
-                <w:b/>
-              </w:rPr>
-              <w:t>Назва ВМ</w:t>
-            </w:r>
-          </w:p>
-        </w:tc>
-        <w:tc>
-          <w:tcPr>
-            <w:tcW w:type="dxa" w:w="4677"/>
-          </w:tcPr>
-          <w:p>
-            <w:r>
-              <w:t>Devuan_Security</w:t>
-            </w:r>
-          </w:p>
-        </w:tc>
-      </w:tr>
-      <w:tr>
-        <w:tc>
-          <w:tcPr>
-            <w:tcW w:type="dxa" w:w="4677"/>
-          </w:tcPr>
-          <w:p>
-            <w:r>
-              <w:rPr>
-                <w:b/>
-              </w:rPr>
-              <w:t>Гостьова ОС (VMware)</w:t>
-            </w:r>
-          </w:p>
-        </w:tc>
-        <w:tc>
-          <w:tcPr>
-            <w:tcW w:type="dxa" w:w="4677"/>
-          </w:tcPr>
-          <w:p>
-            <w:r>
-              <w:t>Debian 13.x 64-bit</w:t>
-            </w:r>
-          </w:p>
-        </w:tc>
-      </w:tr>
-      <w:tr>
-        <w:tc>
-          <w:tcPr>
-            <w:tcW w:type="dxa" w:w="4677"/>
-          </w:tcPr>
-          <w:p>
-            <w:r>
-              <w:rPr>
-                <w:b/>
-              </w:rPr>
-              <w:t>Тип конфігурації</w:t>
-            </w:r>
-          </w:p>
-        </w:tc>
-        <w:tc>
-          <w:tcPr>
-            <w:tcW w:type="dxa" w:w="4677"/>
-          </w:tcPr>
-          <w:p>
-            <w:r>
-              <w:t>Typical (Recommended)</w:t>
-            </w:r>
-          </w:p>
-        </w:tc>
-      </w:tr>
-      <w:tr>
-        <w:tc>
-          <w:tcPr>
-            <w:tcW w:type="dxa" w:w="4677"/>
-          </w:tcPr>
-          <w:p>
-            <w:r>
-              <w:rPr>
-                <w:b/>
-              </w:rPr>
-              <w:t>ISO-образ</w:t>
-            </w:r>
-          </w:p>
-        </w:tc>
-        <w:tc>
-          <w:tcPr>
-            <w:tcW w:type="dxa" w:w="4677"/>
-          </w:tcPr>
-          <w:p>
-            <w:r>
-              <w:t>devuan_excalibur_6.1.1_amd64_netinstall.iso</w:t>
-            </w:r>
-          </w:p>
-        </w:tc>
-      </w:tr>
-      <w:tr>
-        <w:tc>
-          <w:tcPr>
-            <w:tcW w:type="dxa" w:w="4677"/>
-          </w:tcPr>
-          <w:p>
-            <w:r>
-              <w:rPr>
-                <w:b/>
-              </w:rPr>
-              <w:t>Оперативна пам'ять</w:t>
-            </w:r>
-          </w:p>
-        </w:tc>
-        <w:tc>
-          <w:tcPr>
-            <w:tcW w:type="dxa" w:w="4677"/>
-          </w:tcPr>
-          <w:p>
-            <w:r>
-              <w:t>2048 МБ (2 ГБ)</w:t>
-            </w:r>
-          </w:p>
-        </w:tc>
-      </w:tr>
-      <w:tr>
-        <w:tc>
-          <w:tcPr>
-            <w:tcW w:type="dxa" w:w="4677"/>
-          </w:tcPr>
-          <w:p>
-            <w:r>
-              <w:rPr>
-                <w:b/>
-              </w:rPr>
-              <w:t>Процесор</w:t>
-            </w:r>
-          </w:p>
-        </w:tc>
-        <w:tc>
-          <w:tcPr>
-            <w:tcW w:type="dxa" w:w="4677"/>
-          </w:tcPr>
-          <w:p>
-            <w:r>
-              <w:t>2 ядра</w:t>
-            </w:r>
-          </w:p>
-        </w:tc>
-      </w:tr>
-      <w:tr>
-        <w:tc>
-          <w:tcPr>
-            <w:tcW w:type="dxa" w:w="4677"/>
-          </w:tcPr>
-          <w:p>
-            <w:r>
-              <w:rPr>
-                <w:b/>
-              </w:rPr>
-              <w:t>Жорсткий диск</w:t>
-            </w:r>
-          </w:p>
-        </w:tc>
-        <w:tc>
-          <w:tcPr>
-            <w:tcW w:type="dxa" w:w="4677"/>
-          </w:tcPr>
-          <w:p>
-            <w:r>
-              <w:t>20 ГБ (Split into multiple files)</w:t>
-            </w:r>
-          </w:p>
-        </w:tc>
-      </w:tr>
-      <w:tr>
-        <w:tc>
-          <w:tcPr>
-            <w:tcW w:type="dxa" w:w="4677"/>
-          </w:tcPr>
-          <w:p>
-            <w:r>
-              <w:rPr>
-                <w:b/>
-              </w:rPr>
-              <w:t>Мережевий адаптер</w:t>
-            </w:r>
-          </w:p>
-        </w:tc>
-        <w:tc>
-          <w:tcPr>
-            <w:tcW w:type="dxa" w:w="4677"/>
-          </w:tcPr>
-          <w:p>
-            <w:r>
-              <w:t>NAT</w:t>
-            </w:r>
-          </w:p>
-        </w:tc>
-      </w:tr>
-    </w:tbl>
-    <w:p/>
-    <w:p>
-      <w:r>
-        <w:rPr>
-          <w:b/>
-        </w:rPr>
-        <w:t>Процес створення ВМ (покрокові скріншоти):</w:t>
-      </w:r>
-    </w:p>
-    <w:p/>
-    <w:p>
       <w:pPr>
-        <w:jc w:val="center"/>
+        <w:spacing w:line="360" w:lineRule="auto" w:before="0" w:after="0"/>
+        <w:ind w:firstLine="709"/>
+        <w:jc w:val="both"/>
       </w:pPr>
       <w:r>
         <w:rPr>
-          <w:i/>
-          <w:color w:val="FF0000"/>
+          <w:rFonts w:ascii="Times New Roman" w:hAnsi="Times New Roman"/>
+          <w:b w:val="0"/>
+          <w:i w:val="0"/>
+          <w:color w:val="000000"/>
+          <w:sz w:val="28"/>
         </w:rPr>
-        <w:t>[СКРІНШОТ ВІДСУТНІЙ: 1.2_vmware_main_screen.png]</w:t>
+        <w:t>Образ завантажено з офіційного архіву Devuan за адресою files.devuan.org. Версія Excalibur 6.x базується на Debian 13 (Trixie) та є поточним стабільним релізом станом на липень 2026 року. Розмір образу складає 594 МБ.</w:t>
       </w:r>
     </w:p>
-    <w:p/>
     <w:p>
       <w:pPr>
+        <w:spacing w:line="360" w:lineRule="auto" w:before="0" w:after="0"/>
+        <w:ind w:firstLine="0"/>
+        <w:jc w:val="both"/>
+      </w:pPr>
+    </w:p>
+    <w:p>
+      <w:pPr>
+        <w:spacing w:line="360" w:lineRule="auto" w:before="0" w:after="0"/>
+        <w:ind w:firstLine="0"/>
+        <w:jc w:val="both"/>
+      </w:pPr>
+    </w:p>
+    <w:p>
+      <w:pPr>
+        <w:spacing w:before="0" w:after="0"/>
         <w:jc w:val="center"/>
       </w:pPr>
       <w:r>
         <w:drawing>
           <wp:inline xmlns:a="http://schemas.openxmlformats.org/drawingml/2006/main" xmlns:pic="http://schemas.openxmlformats.org/drawingml/2006/picture">
-            <wp:extent cx="5029200" cy="3364606"/>
+            <wp:extent cx="5040000" cy="2732625"/>
             <wp:docPr id="1" name="Picture 1"/>
             <wp:cNvGraphicFramePr>
               <a:graphicFrameLocks noChangeAspect="1"/>
@@ -969,11 +1312,11 @@
               <a:graphicData uri="http://schemas.openxmlformats.org/drawingml/2006/picture">
                 <pic:pic>
                   <pic:nvPicPr>
-                    <pic:cNvPr id="0" name="1.3_vmware_wizard_type.png"/>
+                    <pic:cNvPr id="0" name="1.1_devuan_release_archive.png"/>
                     <pic:cNvPicPr/>
                   </pic:nvPicPr>
                   <pic:blipFill>
-                    <a:blip r:embed="rId9"/>
+                    <a:blip r:embed="rId10"/>
                     <a:stretch>
                       <a:fillRect/>
                     </a:stretch>
@@ -981,7 +1324,7 @@
                   <pic:spPr>
                     <a:xfrm>
                       <a:off x="0" y="0"/>
-                      <a:ext cx="5029200" cy="3364606"/>
+                      <a:ext cx="5040000" cy="2732625"/>
                     </a:xfrm>
                     <a:prstGeom prst="rect"/>
                   </pic:spPr>
@@ -994,26 +1337,532 @@
     </w:p>
     <w:p>
       <w:pPr>
+        <w:spacing w:before="60" w:after="120" w:line="360" w:lineRule="auto"/>
+        <w:ind w:firstLine="0"/>
         <w:jc w:val="center"/>
       </w:pPr>
       <w:r>
         <w:rPr>
-          <w:i/>
-          <w:color w:val="666666"/>
-          <w:sz w:val="18"/>
+          <w:rFonts w:ascii="Times New Roman" w:hAnsi="Times New Roman"/>
+          <w:color w:val="000000"/>
+          <w:sz w:val="28"/>
         </w:rPr>
-        <w:t>Рис. 1.3 — Вибір типу конфігурації ВМ (Typical / Custom)</w:t>
+        <w:t>Рисунок 2.1 — Офіційний архів ISO-образів Devuan Excalibur на files.devuan.org</w:t>
       </w:r>
     </w:p>
-    <w:p/>
     <w:p>
       <w:pPr>
+        <w:spacing w:line="360" w:lineRule="auto" w:before="0" w:after="0"/>
+        <w:ind w:firstLine="709"/>
+        <w:jc w:val="left"/>
+      </w:pPr>
+      <w:r>
+        <w:rPr>
+          <w:rFonts w:ascii="Times New Roman" w:hAnsi="Times New Roman"/>
+          <w:b/>
+          <w:color w:val="000000"/>
+          <w:sz w:val="28"/>
+        </w:rPr>
+        <w:t>2.2 Створення віртуальної машини у VMware Workstation</w:t>
+      </w:r>
+    </w:p>
+    <w:p>
+      <w:pPr>
+        <w:spacing w:line="360" w:lineRule="auto" w:before="0" w:after="0"/>
+        <w:ind w:firstLine="0"/>
+        <w:jc w:val="both"/>
+      </w:pPr>
+    </w:p>
+    <w:p>
+      <w:pPr>
+        <w:spacing w:line="360" w:lineRule="auto" w:before="0" w:after="0"/>
+        <w:ind w:firstLine="709"/>
+        <w:jc w:val="both"/>
+      </w:pPr>
+      <w:r>
+        <w:rPr>
+          <w:rFonts w:ascii="Times New Roman" w:hAnsi="Times New Roman"/>
+          <w:b w:val="0"/>
+          <w:i w:val="0"/>
+          <w:color w:val="000000"/>
+          <w:sz w:val="28"/>
+        </w:rPr>
+        <w:t>Для Build Box створено нову віртуальну машину у VMware Workstation Pro 25H2. Параметри підібрані з урахуванням вимог процесу збірки через live-build, що потребує достатньо оперативної пам'яті та обчислювальних ресурсів для завантаження та розпакування пакетів.</w:t>
+      </w:r>
+    </w:p>
+    <w:p>
+      <w:pPr>
+        <w:spacing w:line="360" w:lineRule="auto" w:before="0" w:after="0"/>
+        <w:ind w:firstLine="709"/>
+        <w:jc w:val="both"/>
+      </w:pPr>
+      <w:r>
+        <w:rPr>
+          <w:rFonts w:ascii="Times New Roman" w:hAnsi="Times New Roman"/>
+          <w:b w:val="0"/>
+          <w:i w:val="0"/>
+          <w:color w:val="000000"/>
+          <w:sz w:val="28"/>
+        </w:rPr>
+        <w:t>У таблиці 2.1 наведено параметри створеної віртуальної машини.</w:t>
+      </w:r>
+    </w:p>
+    <w:p>
+      <w:pPr>
+        <w:spacing w:line="360" w:lineRule="auto" w:before="0" w:after="0"/>
+        <w:ind w:firstLine="0"/>
+        <w:jc w:val="left"/>
+      </w:pPr>
+      <w:r>
+        <w:rPr>
+          <w:rFonts w:ascii="Times New Roman" w:hAnsi="Times New Roman"/>
+          <w:b w:val="0"/>
+          <w:i w:val="0"/>
+          <w:color w:val="000000"/>
+          <w:sz w:val="28"/>
+        </w:rPr>
+        <w:t>Таблиця 2.1 — Параметри віртуальної машини Build Box</w:t>
+      </w:r>
+    </w:p>
+    <w:tbl>
+      <w:tblPr>
+        <w:tblStyle w:val="TableGrid"/>
+        <w:tblW w:type="auto" w:w="0"/>
+        <w:tblLook w:firstColumn="1" w:firstRow="1" w:lastColumn="0" w:lastRow="0" w:noHBand="0" w:noVBand="1" w:val="04A0"/>
+      </w:tblPr>
+      <w:tblGrid>
+        <w:gridCol w:w="4819"/>
+        <w:gridCol w:w="4819"/>
+      </w:tblGrid>
+      <w:tr>
+        <w:tc>
+          <w:tcPr>
+            <w:tcW w:type="dxa" w:w="4819"/>
+            <w:shd w:val="clear" w:color="auto" w:fill="C0C0C0"/>
+          </w:tcPr>
+          <w:p>
+            <w:pPr>
+              <w:spacing w:line="360" w:lineRule="auto"/>
+              <w:jc w:val="center"/>
+            </w:pPr>
+            <w:r/>
+            <w:r>
+              <w:rPr>
+                <w:rFonts w:ascii="Times New Roman" w:hAnsi="Times New Roman"/>
+                <w:b/>
+                <w:sz w:val="28"/>
+              </w:rPr>
+              <w:t>Параметр</w:t>
+            </w:r>
+          </w:p>
+        </w:tc>
+        <w:tc>
+          <w:tcPr>
+            <w:tcW w:type="dxa" w:w="4819"/>
+            <w:shd w:val="clear" w:color="auto" w:fill="C0C0C0"/>
+          </w:tcPr>
+          <w:p>
+            <w:pPr>
+              <w:spacing w:line="360" w:lineRule="auto"/>
+              <w:jc w:val="center"/>
+            </w:pPr>
+            <w:r/>
+            <w:r>
+              <w:rPr>
+                <w:rFonts w:ascii="Times New Roman" w:hAnsi="Times New Roman"/>
+                <w:b/>
+                <w:sz w:val="28"/>
+              </w:rPr>
+              <w:t>Значення</w:t>
+            </w:r>
+          </w:p>
+        </w:tc>
+      </w:tr>
+      <w:tr>
+        <w:tc>
+          <w:tcPr>
+            <w:tcW w:type="dxa" w:w="4819"/>
+          </w:tcPr>
+          <w:p>
+            <w:pPr>
+              <w:spacing w:line="360" w:lineRule="auto"/>
+              <w:ind w:firstLine="0"/>
+              <w:jc w:val="left"/>
+            </w:pPr>
+            <w:r/>
+            <w:r>
+              <w:rPr>
+                <w:rFonts w:ascii="Times New Roman" w:hAnsi="Times New Roman"/>
+                <w:b/>
+                <w:sz w:val="28"/>
+              </w:rPr>
+              <w:t>Назва ВМ</w:t>
+            </w:r>
+          </w:p>
+        </w:tc>
+        <w:tc>
+          <w:tcPr>
+            <w:tcW w:type="dxa" w:w="4819"/>
+          </w:tcPr>
+          <w:p>
+            <w:pPr>
+              <w:spacing w:line="360" w:lineRule="auto"/>
+              <w:ind w:firstLine="0"/>
+              <w:jc w:val="left"/>
+            </w:pPr>
+            <w:r/>
+            <w:r>
+              <w:rPr>
+                <w:rFonts w:ascii="Times New Roman" w:hAnsi="Times New Roman"/>
+                <w:sz w:val="28"/>
+              </w:rPr>
+              <w:t>Devuan_Security</w:t>
+            </w:r>
+          </w:p>
+        </w:tc>
+      </w:tr>
+      <w:tr>
+        <w:tc>
+          <w:tcPr>
+            <w:tcW w:type="dxa" w:w="4819"/>
+          </w:tcPr>
+          <w:p>
+            <w:pPr>
+              <w:spacing w:line="360" w:lineRule="auto"/>
+              <w:ind w:firstLine="0"/>
+              <w:jc w:val="left"/>
+            </w:pPr>
+            <w:r/>
+            <w:r>
+              <w:rPr>
+                <w:rFonts w:ascii="Times New Roman" w:hAnsi="Times New Roman"/>
+                <w:b/>
+                <w:sz w:val="28"/>
+              </w:rPr>
+              <w:t>Гостьова ОС (VMware)</w:t>
+            </w:r>
+          </w:p>
+        </w:tc>
+        <w:tc>
+          <w:tcPr>
+            <w:tcW w:type="dxa" w:w="4819"/>
+          </w:tcPr>
+          <w:p>
+            <w:pPr>
+              <w:spacing w:line="360" w:lineRule="auto"/>
+              <w:ind w:firstLine="0"/>
+              <w:jc w:val="left"/>
+            </w:pPr>
+            <w:r/>
+            <w:r>
+              <w:rPr>
+                <w:rFonts w:ascii="Times New Roman" w:hAnsi="Times New Roman"/>
+                <w:sz w:val="28"/>
+              </w:rPr>
+              <w:t>Debian 13.x 64-bit</w:t>
+            </w:r>
+          </w:p>
+        </w:tc>
+      </w:tr>
+      <w:tr>
+        <w:tc>
+          <w:tcPr>
+            <w:tcW w:type="dxa" w:w="4819"/>
+          </w:tcPr>
+          <w:p>
+            <w:pPr>
+              <w:spacing w:line="360" w:lineRule="auto"/>
+              <w:ind w:firstLine="0"/>
+              <w:jc w:val="left"/>
+            </w:pPr>
+            <w:r/>
+            <w:r>
+              <w:rPr>
+                <w:rFonts w:ascii="Times New Roman" w:hAnsi="Times New Roman"/>
+                <w:b/>
+                <w:sz w:val="28"/>
+              </w:rPr>
+              <w:t>Тип конфігурації</w:t>
+            </w:r>
+          </w:p>
+        </w:tc>
+        <w:tc>
+          <w:tcPr>
+            <w:tcW w:type="dxa" w:w="4819"/>
+          </w:tcPr>
+          <w:p>
+            <w:pPr>
+              <w:spacing w:line="360" w:lineRule="auto"/>
+              <w:ind w:firstLine="0"/>
+              <w:jc w:val="left"/>
+            </w:pPr>
+            <w:r/>
+            <w:r>
+              <w:rPr>
+                <w:rFonts w:ascii="Times New Roman" w:hAnsi="Times New Roman"/>
+                <w:sz w:val="28"/>
+              </w:rPr>
+              <w:t>Typical (Recommended)</w:t>
+            </w:r>
+          </w:p>
+        </w:tc>
+      </w:tr>
+      <w:tr>
+        <w:tc>
+          <w:tcPr>
+            <w:tcW w:type="dxa" w:w="4819"/>
+          </w:tcPr>
+          <w:p>
+            <w:pPr>
+              <w:spacing w:line="360" w:lineRule="auto"/>
+              <w:ind w:firstLine="0"/>
+              <w:jc w:val="left"/>
+            </w:pPr>
+            <w:r/>
+            <w:r>
+              <w:rPr>
+                <w:rFonts w:ascii="Times New Roman" w:hAnsi="Times New Roman"/>
+                <w:b/>
+                <w:sz w:val="28"/>
+              </w:rPr>
+              <w:t>ISO-образ</w:t>
+            </w:r>
+          </w:p>
+        </w:tc>
+        <w:tc>
+          <w:tcPr>
+            <w:tcW w:type="dxa" w:w="4819"/>
+          </w:tcPr>
+          <w:p>
+            <w:pPr>
+              <w:spacing w:line="360" w:lineRule="auto"/>
+              <w:ind w:firstLine="0"/>
+              <w:jc w:val="left"/>
+            </w:pPr>
+            <w:r/>
+            <w:r>
+              <w:rPr>
+                <w:rFonts w:ascii="Times New Roman" w:hAnsi="Times New Roman"/>
+                <w:sz w:val="28"/>
+              </w:rPr>
+              <w:t>devuan_excalibur_6.1.1_amd64_netinstall.iso</w:t>
+            </w:r>
+          </w:p>
+        </w:tc>
+      </w:tr>
+      <w:tr>
+        <w:tc>
+          <w:tcPr>
+            <w:tcW w:type="dxa" w:w="4819"/>
+          </w:tcPr>
+          <w:p>
+            <w:pPr>
+              <w:spacing w:line="360" w:lineRule="auto"/>
+              <w:ind w:firstLine="0"/>
+              <w:jc w:val="left"/>
+            </w:pPr>
+            <w:r/>
+            <w:r>
+              <w:rPr>
+                <w:rFonts w:ascii="Times New Roman" w:hAnsi="Times New Roman"/>
+                <w:b/>
+                <w:sz w:val="28"/>
+              </w:rPr>
+              <w:t>Оперативна пам'ять</w:t>
+            </w:r>
+          </w:p>
+        </w:tc>
+        <w:tc>
+          <w:tcPr>
+            <w:tcW w:type="dxa" w:w="4819"/>
+          </w:tcPr>
+          <w:p>
+            <w:pPr>
+              <w:spacing w:line="360" w:lineRule="auto"/>
+              <w:ind w:firstLine="0"/>
+              <w:jc w:val="left"/>
+            </w:pPr>
+            <w:r/>
+            <w:r>
+              <w:rPr>
+                <w:rFonts w:ascii="Times New Roman" w:hAnsi="Times New Roman"/>
+                <w:sz w:val="28"/>
+              </w:rPr>
+              <w:t>2048 МБ (2 ГБ)</w:t>
+            </w:r>
+          </w:p>
+        </w:tc>
+      </w:tr>
+      <w:tr>
+        <w:tc>
+          <w:tcPr>
+            <w:tcW w:type="dxa" w:w="4819"/>
+          </w:tcPr>
+          <w:p>
+            <w:pPr>
+              <w:spacing w:line="360" w:lineRule="auto"/>
+              <w:ind w:firstLine="0"/>
+              <w:jc w:val="left"/>
+            </w:pPr>
+            <w:r/>
+            <w:r>
+              <w:rPr>
+                <w:rFonts w:ascii="Times New Roman" w:hAnsi="Times New Roman"/>
+                <w:b/>
+                <w:sz w:val="28"/>
+              </w:rPr>
+              <w:t>Процесор</w:t>
+            </w:r>
+          </w:p>
+        </w:tc>
+        <w:tc>
+          <w:tcPr>
+            <w:tcW w:type="dxa" w:w="4819"/>
+          </w:tcPr>
+          <w:p>
+            <w:pPr>
+              <w:spacing w:line="360" w:lineRule="auto"/>
+              <w:ind w:firstLine="0"/>
+              <w:jc w:val="left"/>
+            </w:pPr>
+            <w:r/>
+            <w:r>
+              <w:rPr>
+                <w:rFonts w:ascii="Times New Roman" w:hAnsi="Times New Roman"/>
+                <w:sz w:val="28"/>
+              </w:rPr>
+              <w:t>2 ядра</w:t>
+            </w:r>
+          </w:p>
+        </w:tc>
+      </w:tr>
+      <w:tr>
+        <w:tc>
+          <w:tcPr>
+            <w:tcW w:type="dxa" w:w="4819"/>
+          </w:tcPr>
+          <w:p>
+            <w:pPr>
+              <w:spacing w:line="360" w:lineRule="auto"/>
+              <w:ind w:firstLine="0"/>
+              <w:jc w:val="left"/>
+            </w:pPr>
+            <w:r/>
+            <w:r>
+              <w:rPr>
+                <w:rFonts w:ascii="Times New Roman" w:hAnsi="Times New Roman"/>
+                <w:b/>
+                <w:sz w:val="28"/>
+              </w:rPr>
+              <w:t>Жорсткий диск</w:t>
+            </w:r>
+          </w:p>
+        </w:tc>
+        <w:tc>
+          <w:tcPr>
+            <w:tcW w:type="dxa" w:w="4819"/>
+          </w:tcPr>
+          <w:p>
+            <w:pPr>
+              <w:spacing w:line="360" w:lineRule="auto"/>
+              <w:ind w:firstLine="0"/>
+              <w:jc w:val="left"/>
+            </w:pPr>
+            <w:r/>
+            <w:r>
+              <w:rPr>
+                <w:rFonts w:ascii="Times New Roman" w:hAnsi="Times New Roman"/>
+                <w:sz w:val="28"/>
+              </w:rPr>
+              <w:t>20 ГБ (Split into multiple files)</w:t>
+            </w:r>
+          </w:p>
+        </w:tc>
+      </w:tr>
+      <w:tr>
+        <w:tc>
+          <w:tcPr>
+            <w:tcW w:type="dxa" w:w="4819"/>
+          </w:tcPr>
+          <w:p>
+            <w:pPr>
+              <w:spacing w:line="360" w:lineRule="auto"/>
+              <w:ind w:firstLine="0"/>
+              <w:jc w:val="left"/>
+            </w:pPr>
+            <w:r/>
+            <w:r>
+              <w:rPr>
+                <w:rFonts w:ascii="Times New Roman" w:hAnsi="Times New Roman"/>
+                <w:b/>
+                <w:sz w:val="28"/>
+              </w:rPr>
+              <w:t>Мережевий адаптер</w:t>
+            </w:r>
+          </w:p>
+        </w:tc>
+        <w:tc>
+          <w:tcPr>
+            <w:tcW w:type="dxa" w:w="4819"/>
+          </w:tcPr>
+          <w:p>
+            <w:pPr>
+              <w:spacing w:line="360" w:lineRule="auto"/>
+              <w:ind w:firstLine="0"/>
+              <w:jc w:val="left"/>
+            </w:pPr>
+            <w:r/>
+            <w:r>
+              <w:rPr>
+                <w:rFonts w:ascii="Times New Roman" w:hAnsi="Times New Roman"/>
+                <w:sz w:val="28"/>
+              </w:rPr>
+              <w:t>NAT</w:t>
+            </w:r>
+          </w:p>
+        </w:tc>
+      </w:tr>
+    </w:tbl>
+    <w:p>
+      <w:pPr>
+        <w:spacing w:line="360" w:lineRule="auto" w:before="0" w:after="0"/>
+        <w:ind w:firstLine="0"/>
+        <w:jc w:val="both"/>
+      </w:pPr>
+    </w:p>
+    <w:p>
+      <w:pPr>
+        <w:spacing w:line="360" w:lineRule="auto" w:before="0" w:after="0"/>
+        <w:ind w:firstLine="709"/>
+        <w:jc w:val="both"/>
+      </w:pPr>
+      <w:r>
+        <w:rPr>
+          <w:rFonts w:ascii="Times New Roman" w:hAnsi="Times New Roman"/>
+          <w:b w:val="0"/>
+          <w:i w:val="0"/>
+          <w:color w:val="000000"/>
+          <w:sz w:val="28"/>
+        </w:rPr>
+        <w:t>На рисунках 2.2–2.8 наведено послідовність екранів майстра створення нової віртуальної машини у VMware Workstation Pro 25H2.</w:t>
+      </w:r>
+    </w:p>
+    <w:p>
+      <w:pPr>
+        <w:spacing w:line="360" w:lineRule="auto" w:before="0" w:after="0"/>
+        <w:ind w:firstLine="0"/>
+        <w:jc w:val="both"/>
+      </w:pPr>
+    </w:p>
+    <w:p>
+      <w:pPr>
+        <w:spacing w:before="0" w:after="0"/>
         <w:jc w:val="center"/>
       </w:pPr>
       <w:r>
         <w:drawing>
           <wp:inline xmlns:a="http://schemas.openxmlformats.org/drawingml/2006/main" xmlns:pic="http://schemas.openxmlformats.org/drawingml/2006/picture">
-            <wp:extent cx="5029200" cy="3364606"/>
+            <wp:extent cx="5040000" cy="2835000"/>
             <wp:docPr id="2" name="Picture 2"/>
             <wp:cNvGraphicFramePr>
               <a:graphicFrameLocks noChangeAspect="1"/>
@@ -1022,11 +1871,11 @@
               <a:graphicData uri="http://schemas.openxmlformats.org/drawingml/2006/picture">
                 <pic:pic>
                   <pic:nvPicPr>
-                    <pic:cNvPr id="0" name="1.4_vmware_iso_selection.png"/>
+                    <pic:cNvPr id="0" name="1.2_vmware_main_screen.png"/>
                     <pic:cNvPicPr/>
                   </pic:nvPicPr>
                   <pic:blipFill>
-                    <a:blip r:embed="rId10"/>
+                    <a:blip r:embed="rId11"/>
                     <a:stretch>
                       <a:fillRect/>
                     </a:stretch>
@@ -1034,7 +1883,7 @@
                   <pic:spPr>
                     <a:xfrm>
                       <a:off x="0" y="0"/>
-                      <a:ext cx="5029200" cy="3364606"/>
+                      <a:ext cx="5040000" cy="2835000"/>
                     </a:xfrm>
                     <a:prstGeom prst="rect"/>
                   </pic:spPr>
@@ -1047,26 +1896,35 @@
     </w:p>
     <w:p>
       <w:pPr>
+        <w:spacing w:before="60" w:after="120" w:line="360" w:lineRule="auto"/>
+        <w:ind w:firstLine="0"/>
         <w:jc w:val="center"/>
       </w:pPr>
       <w:r>
         <w:rPr>
-          <w:i/>
-          <w:color w:val="666666"/>
-          <w:sz w:val="18"/>
+          <w:rFonts w:ascii="Times New Roman" w:hAnsi="Times New Roman"/>
+          <w:color w:val="000000"/>
+          <w:sz w:val="28"/>
         </w:rPr>
-        <w:t>Рис. 1.4 — Підключення ISO-образу Devuan Excalibur</w:t>
+        <w:t>Рисунок 2.2 — Головне меню VMware Workstation Pro 25H2</w:t>
       </w:r>
     </w:p>
-    <w:p/>
     <w:p>
       <w:pPr>
+        <w:spacing w:line="360" w:lineRule="auto" w:before="0" w:after="0"/>
+        <w:ind w:firstLine="0"/>
+        <w:jc w:val="both"/>
+      </w:pPr>
+    </w:p>
+    <w:p>
+      <w:pPr>
+        <w:spacing w:before="0" w:after="0"/>
         <w:jc w:val="center"/>
       </w:pPr>
       <w:r>
         <w:drawing>
           <wp:inline xmlns:a="http://schemas.openxmlformats.org/drawingml/2006/main" xmlns:pic="http://schemas.openxmlformats.org/drawingml/2006/picture">
-            <wp:extent cx="5029200" cy="3364606"/>
+            <wp:extent cx="5040000" cy="3371831"/>
             <wp:docPr id="3" name="Picture 3"/>
             <wp:cNvGraphicFramePr>
               <a:graphicFrameLocks noChangeAspect="1"/>
@@ -1075,11 +1933,11 @@
               <a:graphicData uri="http://schemas.openxmlformats.org/drawingml/2006/picture">
                 <pic:pic>
                   <pic:nvPicPr>
-                    <pic:cNvPr id="0" name="1.5_vmware_guest_os_debian13.png"/>
+                    <pic:cNvPr id="0" name="1.3_vmware_wizard_type.png"/>
                     <pic:cNvPicPr/>
                   </pic:nvPicPr>
                   <pic:blipFill>
-                    <a:blip r:embed="rId11"/>
+                    <a:blip r:embed="rId12"/>
                     <a:stretch>
                       <a:fillRect/>
                     </a:stretch>
@@ -1087,7 +1945,7 @@
                   <pic:spPr>
                     <a:xfrm>
                       <a:off x="0" y="0"/>
-                      <a:ext cx="5029200" cy="3364606"/>
+                      <a:ext cx="5040000" cy="3371831"/>
                     </a:xfrm>
                     <a:prstGeom prst="rect"/>
                   </pic:spPr>
@@ -1100,26 +1958,35 @@
     </w:p>
     <w:p>
       <w:pPr>
+        <w:spacing w:before="60" w:after="120" w:line="360" w:lineRule="auto"/>
+        <w:ind w:firstLine="0"/>
         <w:jc w:val="center"/>
       </w:pPr>
       <w:r>
         <w:rPr>
-          <w:i/>
-          <w:color w:val="666666"/>
-          <w:sz w:val="18"/>
+          <w:rFonts w:ascii="Times New Roman" w:hAnsi="Times New Roman"/>
+          <w:color w:val="000000"/>
+          <w:sz w:val="28"/>
         </w:rPr>
-        <w:t>Рис. 1.5 — Вибір гостьової ОС: Debian 13.x 64-bit</w:t>
+        <w:t>Рисунок 2.3 — Вибір типу конфігурації ВМ (Typical / Custom)</w:t>
       </w:r>
     </w:p>
-    <w:p/>
     <w:p>
       <w:pPr>
+        <w:spacing w:line="360" w:lineRule="auto" w:before="0" w:after="0"/>
+        <w:ind w:firstLine="0"/>
+        <w:jc w:val="both"/>
+      </w:pPr>
+    </w:p>
+    <w:p>
+      <w:pPr>
+        <w:spacing w:before="0" w:after="0"/>
         <w:jc w:val="center"/>
       </w:pPr>
       <w:r>
         <w:drawing>
           <wp:inline xmlns:a="http://schemas.openxmlformats.org/drawingml/2006/main" xmlns:pic="http://schemas.openxmlformats.org/drawingml/2006/picture">
-            <wp:extent cx="5029200" cy="3364606"/>
+            <wp:extent cx="5040000" cy="3371831"/>
             <wp:docPr id="4" name="Picture 4"/>
             <wp:cNvGraphicFramePr>
               <a:graphicFrameLocks noChangeAspect="1"/>
@@ -1128,11 +1995,11 @@
               <a:graphicData uri="http://schemas.openxmlformats.org/drawingml/2006/picture">
                 <pic:pic>
                   <pic:nvPicPr>
-                    <pic:cNvPr id="0" name="1.6_vmware_vm_name.png"/>
+                    <pic:cNvPr id="0" name="1.4_vmware_iso_selection.png"/>
                     <pic:cNvPicPr/>
                   </pic:nvPicPr>
                   <pic:blipFill>
-                    <a:blip r:embed="rId12"/>
+                    <a:blip r:embed="rId13"/>
                     <a:stretch>
                       <a:fillRect/>
                     </a:stretch>
@@ -1140,7 +2007,7 @@
                   <pic:spPr>
                     <a:xfrm>
                       <a:off x="0" y="0"/>
-                      <a:ext cx="5029200" cy="3364606"/>
+                      <a:ext cx="5040000" cy="3371831"/>
                     </a:xfrm>
                     <a:prstGeom prst="rect"/>
                   </pic:spPr>
@@ -1153,26 +2020,35 @@
     </w:p>
     <w:p>
       <w:pPr>
+        <w:spacing w:before="60" w:after="120" w:line="360" w:lineRule="auto"/>
+        <w:ind w:firstLine="0"/>
         <w:jc w:val="center"/>
       </w:pPr>
       <w:r>
         <w:rPr>
-          <w:i/>
-          <w:color w:val="666666"/>
-          <w:sz w:val="18"/>
+          <w:rFonts w:ascii="Times New Roman" w:hAnsi="Times New Roman"/>
+          <w:color w:val="000000"/>
+          <w:sz w:val="28"/>
         </w:rPr>
-        <w:t>Рис. 1.6 — Задання імені віртуальної машини: Devuan_Security</w:t>
+        <w:t>Рисунок 2.4 — Підключення ISO-образу Devuan Excalibur 6.1.1</w:t>
       </w:r>
     </w:p>
-    <w:p/>
     <w:p>
       <w:pPr>
+        <w:spacing w:line="360" w:lineRule="auto" w:before="0" w:after="0"/>
+        <w:ind w:firstLine="0"/>
+        <w:jc w:val="both"/>
+      </w:pPr>
+    </w:p>
+    <w:p>
+      <w:pPr>
+        <w:spacing w:before="0" w:after="0"/>
         <w:jc w:val="center"/>
       </w:pPr>
       <w:r>
         <w:drawing>
           <wp:inline xmlns:a="http://schemas.openxmlformats.org/drawingml/2006/main" xmlns:pic="http://schemas.openxmlformats.org/drawingml/2006/picture">
-            <wp:extent cx="5029200" cy="3364606"/>
+            <wp:extent cx="5040000" cy="3371831"/>
             <wp:docPr id="5" name="Picture 5"/>
             <wp:cNvGraphicFramePr>
               <a:graphicFrameLocks noChangeAspect="1"/>
@@ -1181,11 +2057,11 @@
               <a:graphicData uri="http://schemas.openxmlformats.org/drawingml/2006/picture">
                 <pic:pic>
                   <pic:nvPicPr>
-                    <pic:cNvPr id="0" name="1.7_vmware_disk_size.png"/>
+                    <pic:cNvPr id="0" name="1.5_vmware_guest_os_debian13.png"/>
                     <pic:cNvPicPr/>
                   </pic:nvPicPr>
                   <pic:blipFill>
-                    <a:blip r:embed="rId13"/>
+                    <a:blip r:embed="rId14"/>
                     <a:stretch>
                       <a:fillRect/>
                     </a:stretch>
@@ -1193,7 +2069,7 @@
                   <pic:spPr>
                     <a:xfrm>
                       <a:off x="0" y="0"/>
-                      <a:ext cx="5029200" cy="3364606"/>
+                      <a:ext cx="5040000" cy="3371831"/>
                     </a:xfrm>
                     <a:prstGeom prst="rect"/>
                   </pic:spPr>
@@ -1206,26 +2082,35 @@
     </w:p>
     <w:p>
       <w:pPr>
+        <w:spacing w:before="60" w:after="120" w:line="360" w:lineRule="auto"/>
+        <w:ind w:firstLine="0"/>
         <w:jc w:val="center"/>
       </w:pPr>
       <w:r>
         <w:rPr>
-          <w:i/>
-          <w:color w:val="666666"/>
-          <w:sz w:val="18"/>
+          <w:rFonts w:ascii="Times New Roman" w:hAnsi="Times New Roman"/>
+          <w:color w:val="000000"/>
+          <w:sz w:val="28"/>
         </w:rPr>
-        <w:t>Рис. 1.7 — Налаштування розміру віртуального диску: 20 ГБ</w:t>
+        <w:t>Рисунок 2.5 — Вибір гостьової ОС: Debian 13.x 64-bit</w:t>
       </w:r>
     </w:p>
-    <w:p/>
     <w:p>
       <w:pPr>
+        <w:spacing w:line="360" w:lineRule="auto" w:before="0" w:after="0"/>
+        <w:ind w:firstLine="0"/>
+        <w:jc w:val="both"/>
+      </w:pPr>
+    </w:p>
+    <w:p>
+      <w:pPr>
+        <w:spacing w:before="0" w:after="0"/>
         <w:jc w:val="center"/>
       </w:pPr>
       <w:r>
         <w:drawing>
           <wp:inline xmlns:a="http://schemas.openxmlformats.org/drawingml/2006/main" xmlns:pic="http://schemas.openxmlformats.org/drawingml/2006/picture">
-            <wp:extent cx="5029200" cy="3364606"/>
+            <wp:extent cx="5040000" cy="3371831"/>
             <wp:docPr id="6" name="Picture 6"/>
             <wp:cNvGraphicFramePr>
               <a:graphicFrameLocks noChangeAspect="1"/>
@@ -1234,11 +2119,11 @@
               <a:graphicData uri="http://schemas.openxmlformats.org/drawingml/2006/picture">
                 <pic:pic>
                   <pic:nvPicPr>
-                    <pic:cNvPr id="0" name="1.8_vmware_summary.png"/>
+                    <pic:cNvPr id="0" name="1.6_vmware_vm_name.png"/>
                     <pic:cNvPicPr/>
                   </pic:nvPicPr>
                   <pic:blipFill>
-                    <a:blip r:embed="rId14"/>
+                    <a:blip r:embed="rId15"/>
                     <a:stretch>
                       <a:fillRect/>
                     </a:stretch>
@@ -1246,7 +2131,7 @@
                   <pic:spPr>
                     <a:xfrm>
                       <a:off x="0" y="0"/>
-                      <a:ext cx="5029200" cy="3364606"/>
+                      <a:ext cx="5040000" cy="3371831"/>
                     </a:xfrm>
                     <a:prstGeom prst="rect"/>
                   </pic:spPr>
@@ -1259,97 +2144,141 @@
     </w:p>
     <w:p>
       <w:pPr>
+        <w:spacing w:before="60" w:after="120" w:line="360" w:lineRule="auto"/>
+        <w:ind w:firstLine="0"/>
         <w:jc w:val="center"/>
       </w:pPr>
       <w:r>
         <w:rPr>
-          <w:i/>
-          <w:color w:val="666666"/>
-          <w:sz w:val="18"/>
+          <w:rFonts w:ascii="Times New Roman" w:hAnsi="Times New Roman"/>
+          <w:color w:val="000000"/>
+          <w:sz w:val="28"/>
         </w:rPr>
-        <w:t>Рис. 1.8 — Фінальний підсумок перед створенням ВМ</w:t>
-      </w:r>
-    </w:p>
-    <w:p/>
-    <w:p>
-      <w:r>
-        <w:br w:type="page"/>
+        <w:t>Рисунок 2.6 — Задання імені віртуальної машини: Devuan_Security</w:t>
       </w:r>
     </w:p>
     <w:p>
       <w:pPr>
-        <w:pStyle w:val="Heading1"/>
+        <w:spacing w:line="360" w:lineRule="auto" w:before="0" w:after="0"/>
+        <w:ind w:firstLine="0"/>
+        <w:jc w:val="both"/>
+      </w:pPr>
+    </w:p>
+    <w:p>
+      <w:pPr>
+        <w:spacing w:before="0" w:after="0"/>
+        <w:jc w:val="center"/>
       </w:pPr>
       <w:r>
-        <w:t>Фаза 2: Встановлення Devuan без графічного середовища</w:t>
+        <w:drawing>
+          <wp:inline xmlns:a="http://schemas.openxmlformats.org/drawingml/2006/main" xmlns:pic="http://schemas.openxmlformats.org/drawingml/2006/picture">
+            <wp:extent cx="5040000" cy="3371831"/>
+            <wp:docPr id="7" name="Picture 7"/>
+            <wp:cNvGraphicFramePr>
+              <a:graphicFrameLocks noChangeAspect="1"/>
+            </wp:cNvGraphicFramePr>
+            <a:graphic>
+              <a:graphicData uri="http://schemas.openxmlformats.org/drawingml/2006/picture">
+                <pic:pic>
+                  <pic:nvPicPr>
+                    <pic:cNvPr id="0" name="1.7_vmware_disk_size.png"/>
+                    <pic:cNvPicPr/>
+                  </pic:nvPicPr>
+                  <pic:blipFill>
+                    <a:blip r:embed="rId16"/>
+                    <a:stretch>
+                      <a:fillRect/>
+                    </a:stretch>
+                  </pic:blipFill>
+                  <pic:spPr>
+                    <a:xfrm>
+                      <a:off x="0" y="0"/>
+                      <a:ext cx="5040000" cy="3371831"/>
+                    </a:xfrm>
+                    <a:prstGeom prst="rect"/>
+                  </pic:spPr>
+                </pic:pic>
+              </a:graphicData>
+            </a:graphic>
+          </wp:inline>
+        </w:drawing>
       </w:r>
     </w:p>
     <w:p>
+      <w:pPr>
+        <w:spacing w:before="60" w:after="120" w:line="360" w:lineRule="auto"/>
+        <w:ind w:firstLine="0"/>
+        <w:jc w:val="center"/>
+      </w:pPr>
       <w:r>
         <w:rPr>
-          <w:b/>
-          <w:color w:val="6C757D"/>
+          <w:rFonts w:ascii="Times New Roman" w:hAnsi="Times New Roman"/>
+          <w:color w:val="000000"/>
+          <w:sz w:val="28"/>
         </w:rPr>
-        <w:t>▶ Статус: Очікує</w:t>
-      </w:r>
-    </w:p>
-    <w:p/>
-    <w:p>
-      <w:r>
-        <w:t>Цей розділ буде заповнено після завершення встановлення Devuan у VMware. Ключовим кроком є відмова від будь-якого графічного середовища (Desktop Environment) на етапі вибору компонентів у Tasksel, та встановлення лише SSH server та Standard system utilities.</w:t>
+        <w:t>Рисунок 2.7 — Налаштування розміру віртуального диску: 20 ГБ</w:t>
       </w:r>
     </w:p>
     <w:p>
+      <w:pPr>
+        <w:spacing w:line="360" w:lineRule="auto" w:before="0" w:after="0"/>
+        <w:ind w:firstLine="0"/>
+        <w:jc w:val="both"/>
+      </w:pPr>
+    </w:p>
+    <w:p>
+      <w:pPr>
+        <w:spacing w:before="0" w:after="0"/>
+        <w:jc w:val="center"/>
+      </w:pPr>
       <w:r>
-        <w:rPr>
-          <w:i/>
-        </w:rPr>
-        <w:t>Скріншоти для цієї фази:</w:t>
+        <w:drawing>
+          <wp:inline xmlns:a="http://schemas.openxmlformats.org/drawingml/2006/main" xmlns:pic="http://schemas.openxmlformats.org/drawingml/2006/picture">
+            <wp:extent cx="5040000" cy="3371831"/>
+            <wp:docPr id="8" name="Picture 8"/>
+            <wp:cNvGraphicFramePr>
+              <a:graphicFrameLocks noChangeAspect="1"/>
+            </wp:cNvGraphicFramePr>
+            <a:graphic>
+              <a:graphicData uri="http://schemas.openxmlformats.org/drawingml/2006/picture">
+                <pic:pic>
+                  <pic:nvPicPr>
+                    <pic:cNvPr id="0" name="1.8_vmware_summary.png"/>
+                    <pic:cNvPicPr/>
+                  </pic:nvPicPr>
+                  <pic:blipFill>
+                    <a:blip r:embed="rId17"/>
+                    <a:stretch>
+                      <a:fillRect/>
+                    </a:stretch>
+                  </pic:blipFill>
+                  <pic:spPr>
+                    <a:xfrm>
+                      <a:off x="0" y="0"/>
+                      <a:ext cx="5040000" cy="3371831"/>
+                    </a:xfrm>
+                    <a:prstGeom prst="rect"/>
+                  </pic:spPr>
+                </pic:pic>
+              </a:graphicData>
+            </a:graphic>
+          </wp:inline>
+        </w:drawing>
       </w:r>
     </w:p>
     <w:p>
+      <w:pPr>
+        <w:spacing w:before="60" w:after="120" w:line="360" w:lineRule="auto"/>
+        <w:ind w:firstLine="0"/>
+        <w:jc w:val="center"/>
+      </w:pPr>
       <w:r>
         <w:rPr>
-          <w:i/>
-          <w:color w:val="999999"/>
+          <w:rFonts w:ascii="Times New Roman" w:hAnsi="Times New Roman"/>
+          <w:color w:val="000000"/>
+          <w:sz w:val="28"/>
         </w:rPr>
-        <w:t>• 2.1 — Boot menu Devuan [ОЧІКУЄ]</w:t>
-      </w:r>
-    </w:p>
-    <w:p>
-      <w:r>
-        <w:rPr>
-          <w:i/>
-          <w:color w:val="999999"/>
-        </w:rPr>
-        <w:t>• 2.2 — Вибір мови встановлення [ОЧІКУЄ]</w:t>
-      </w:r>
-    </w:p>
-    <w:p>
-      <w:r>
-        <w:rPr>
-          <w:i/>
-          <w:color w:val="999999"/>
-        </w:rPr>
-        <w:t>• 2.3 — Розмітка диска [ОЧІКУЄ]</w:t>
-      </w:r>
-    </w:p>
-    <w:p>
-      <w:r>
-        <w:rPr>
-          <w:i/>
-          <w:color w:val="999999"/>
-        </w:rPr>
-        <w:t>• 2.4 — Екран Tasksel (без DE) [ОЧІКУЄ]</w:t>
-      </w:r>
-    </w:p>
-    <w:p>
-      <w:r>
-        <w:rPr>
-          <w:i/>
-          <w:color w:val="999999"/>
-        </w:rPr>
-        <w:t>• 2.5 — Перший вхід у систему [ОЧІКУЄ]</w:t>
+        <w:t>Рисунок 2.8 — Фінальні параметри ВМ перед створенням</w:t>
       </w:r>
     </w:p>
     <w:p>
@@ -1359,29 +2288,145 @@
     </w:p>
     <w:p>
       <w:pPr>
-        <w:pStyle w:val="Heading1"/>
+        <w:spacing w:line="360" w:lineRule="auto" w:before="0" w:after="0"/>
+        <w:ind w:firstLine="0"/>
+        <w:jc w:val="center"/>
       </w:pPr>
       <w:r>
-        <w:t>Фаза 3: Конфігурування live-build</w:t>
+        <w:rPr>
+          <w:rFonts w:ascii="Times New Roman" w:hAnsi="Times New Roman"/>
+          <w:b/>
+          <w:caps/>
+          <w:color w:val="000000"/>
+          <w:sz w:val="28"/>
+        </w:rPr>
+        <w:t>3 ФАЗА 2. ВСТАНОВЛЕННЯ DEVUAN БЕЗ ГРАФІЧНОГО СЕРЕДОВИЩА</w:t>
       </w:r>
     </w:p>
     <w:p>
+      <w:pPr>
+        <w:spacing w:line="360" w:lineRule="auto" w:before="0" w:after="0"/>
+        <w:ind w:firstLine="0"/>
+        <w:jc w:val="both"/>
+      </w:pPr>
+    </w:p>
+    <w:p>
+      <w:pPr>
+        <w:spacing w:line="360" w:lineRule="auto" w:before="0" w:after="0"/>
+        <w:ind w:firstLine="709"/>
+        <w:jc w:val="both"/>
+      </w:pPr>
       <w:r>
         <w:rPr>
-          <w:b/>
-          <w:color w:val="6C757D"/>
+          <w:rFonts w:ascii="Times New Roman" w:hAnsi="Times New Roman"/>
+          <w:b w:val="0"/>
+          <w:i w:val="0"/>
+          <w:color w:val="000000"/>
+          <w:sz w:val="28"/>
         </w:rPr>
-        <w:t>▶ Статус: Очікує</w:t>
+        <w:t>Цей розділ буде заповнено після завершення встановлення Devuan у VMware Workstation. Ключовим етапом є відмова від будь-якого графічного середовища на кроці вибору компонентів у Tasksel та встановлення лише SSH server і Standard system utilities.</w:t>
       </w:r>
     </w:p>
-    <w:p/>
     <w:p>
+      <w:pPr>
+        <w:spacing w:line="360" w:lineRule="auto" w:before="0" w:after="0"/>
+        <w:ind w:firstLine="709"/>
+        <w:jc w:val="both"/>
+      </w:pPr>
       <w:r>
         <w:rPr>
+          <w:rFonts w:ascii="Times New Roman" w:hAnsi="Times New Roman"/>
+          <w:b/>
+          <w:i w:val="0"/>
+          <w:color w:val="000000"/>
+          <w:sz w:val="28"/>
+        </w:rPr>
+        <w:t>Скріншоти для даного розділу:</w:t>
+      </w:r>
+    </w:p>
+    <w:p>
+      <w:pPr>
+        <w:spacing w:line="360" w:lineRule="auto" w:before="0" w:after="0"/>
+        <w:ind w:firstLine="709"/>
+        <w:jc w:val="both"/>
+      </w:pPr>
+      <w:r>
+        <w:rPr>
+          <w:rFonts w:ascii="Times New Roman" w:hAnsi="Times New Roman"/>
+          <w:b w:val="0"/>
           <w:i/>
-          <w:color w:val="999999"/>
+          <w:color w:val="000000"/>
+          <w:sz w:val="28"/>
         </w:rPr>
-        <w:t>Цей розділ буде заповнено на відповідному етапі розробки.</w:t>
+        <w:t>— 3.1 — Boot menu Devuan Excalibur [очікується]</w:t>
+      </w:r>
+    </w:p>
+    <w:p>
+      <w:pPr>
+        <w:spacing w:line="360" w:lineRule="auto" w:before="0" w:after="0"/>
+        <w:ind w:firstLine="709"/>
+        <w:jc w:val="both"/>
+      </w:pPr>
+      <w:r>
+        <w:rPr>
+          <w:rFonts w:ascii="Times New Roman" w:hAnsi="Times New Roman"/>
+          <w:b w:val="0"/>
+          <w:i/>
+          <w:color w:val="000000"/>
+          <w:sz w:val="28"/>
+        </w:rPr>
+        <w:t>— 3.2 — Вибір мови встановлення [очікується]</w:t>
+      </w:r>
+    </w:p>
+    <w:p>
+      <w:pPr>
+        <w:spacing w:line="360" w:lineRule="auto" w:before="0" w:after="0"/>
+        <w:ind w:firstLine="709"/>
+        <w:jc w:val="both"/>
+      </w:pPr>
+      <w:r>
+        <w:rPr>
+          <w:rFonts w:ascii="Times New Roman" w:hAnsi="Times New Roman"/>
+          <w:b w:val="0"/>
+          <w:i/>
+          <w:color w:val="000000"/>
+          <w:sz w:val="28"/>
+        </w:rPr>
+        <w:t>— 3.3 — Розмітка диска [очікується]</w:t>
+      </w:r>
+    </w:p>
+    <w:p>
+      <w:pPr>
+        <w:spacing w:line="360" w:lineRule="auto" w:before="0" w:after="0"/>
+        <w:ind w:firstLine="709"/>
+        <w:jc w:val="both"/>
+      </w:pPr>
+      <w:r>
+        <w:rPr>
+          <w:rFonts w:ascii="Times New Roman" w:hAnsi="Times New Roman"/>
+          <w:b w:val="0"/>
+          <w:i/>
+          <w:color w:val="000000"/>
+          <w:sz w:val="28"/>
+        </w:rPr>
+        <w:t>— 3.4 — Екран Tasksel (без графічного середовища) [очікується]</w:t>
+      </w:r>
+    </w:p>
+    <w:p>
+      <w:pPr>
+        <w:spacing w:line="360" w:lineRule="auto" w:before="0" w:after="0"/>
+        <w:ind w:firstLine="709"/>
+        <w:jc w:val="both"/>
+      </w:pPr>
+      <w:r>
+        <w:rPr>
+          <w:rFonts w:ascii="Times New Roman" w:hAnsi="Times New Roman"/>
+          <w:b w:val="0"/>
+          <w:i/>
+          <w:color w:val="000000"/>
+          <w:sz w:val="28"/>
+        </w:rPr>
+        <w:t>— 3.5 — Перший вхід у систему [очікується]</w:t>
       </w:r>
     </w:p>
     <w:p>
@@ -1391,29 +2436,43 @@
     </w:p>
     <w:p>
       <w:pPr>
-        <w:pStyle w:val="Heading1"/>
+        <w:spacing w:line="360" w:lineRule="auto" w:before="0" w:after="0"/>
+        <w:ind w:firstLine="0"/>
+        <w:jc w:val="center"/>
       </w:pPr>
       <w:r>
-        <w:t>Фаза 4: Збірка ISO-образу</w:t>
+        <w:rPr>
+          <w:rFonts w:ascii="Times New Roman" w:hAnsi="Times New Roman"/>
+          <w:b/>
+          <w:caps/>
+          <w:color w:val="000000"/>
+          <w:sz w:val="28"/>
+        </w:rPr>
+        <w:t>4 ФАЗА 3. КОНФІГУРУВАННЯ LIVE-BUILD</w:t>
       </w:r>
     </w:p>
     <w:p>
+      <w:pPr>
+        <w:spacing w:line="360" w:lineRule="auto" w:before="0" w:after="0"/>
+        <w:ind w:firstLine="0"/>
+        <w:jc w:val="both"/>
+      </w:pPr>
+    </w:p>
+    <w:p>
+      <w:pPr>
+        <w:spacing w:line="360" w:lineRule="auto" w:before="0" w:after="0"/>
+        <w:ind w:firstLine="709"/>
+        <w:jc w:val="both"/>
+      </w:pPr>
       <w:r>
         <w:rPr>
-          <w:b/>
-          <w:color w:val="6C757D"/>
+          <w:rFonts w:ascii="Times New Roman" w:hAnsi="Times New Roman"/>
+          <w:b w:val="0"/>
+          <w:i/>
+          <w:color w:val="000000"/>
+          <w:sz w:val="28"/>
         </w:rPr>
-        <w:t>▶ Статус: Очікує</w:t>
-      </w:r>
-    </w:p>
-    <w:p/>
-    <w:p>
-      <w:r>
-        <w:rPr>
-          <w:i/>
-          <w:color w:val="999999"/>
-        </w:rPr>
-        <w:t>Цей розділ буде заповнено на відповідному етапі розробки.</w:t>
+        <w:t>Розділ буде заповнено на відповідному етапі розробки.</w:t>
       </w:r>
     </w:p>
     <w:p>
@@ -1423,39 +2482,120 @@
     </w:p>
     <w:p>
       <w:pPr>
-        <w:pStyle w:val="Heading1"/>
+        <w:spacing w:line="360" w:lineRule="auto" w:before="0" w:after="0"/>
+        <w:ind w:firstLine="0"/>
+        <w:jc w:val="center"/>
       </w:pPr>
       <w:r>
-        <w:t>Фаза 5: Тестування та оптимізація (QA)</w:t>
+        <w:rPr>
+          <w:rFonts w:ascii="Times New Roman" w:hAnsi="Times New Roman"/>
+          <w:b/>
+          <w:caps/>
+          <w:color w:val="000000"/>
+          <w:sz w:val="28"/>
+        </w:rPr>
+        <w:t>5 ФАЗА 4. ЗБІРКА ISO-ОБРАЗУ</w:t>
+      </w:r>
+    </w:p>
+    <w:p>
+      <w:pPr>
+        <w:spacing w:line="360" w:lineRule="auto" w:before="0" w:after="0"/>
+        <w:ind w:firstLine="0"/>
+        <w:jc w:val="both"/>
+      </w:pPr>
+    </w:p>
+    <w:p>
+      <w:pPr>
+        <w:spacing w:line="360" w:lineRule="auto" w:before="0" w:after="0"/>
+        <w:ind w:firstLine="709"/>
+        <w:jc w:val="both"/>
+      </w:pPr>
+      <w:r>
+        <w:rPr>
+          <w:rFonts w:ascii="Times New Roman" w:hAnsi="Times New Roman"/>
+          <w:b w:val="0"/>
+          <w:i/>
+          <w:color w:val="000000"/>
+          <w:sz w:val="28"/>
+        </w:rPr>
+        <w:t>Розділ буде заповнено на відповідному етапі розробки.</w:t>
       </w:r>
     </w:p>
     <w:p>
       <w:r>
-        <w:rPr>
-          <w:b/>
-          <w:color w:val="6C757D"/>
-        </w:rPr>
-        <w:t>▶ Статус: Очікує</w:t>
+        <w:br w:type="page"/>
       </w:r>
     </w:p>
-    <w:p/>
     <w:p>
+      <w:pPr>
+        <w:spacing w:line="360" w:lineRule="auto" w:before="0" w:after="0"/>
+        <w:ind w:firstLine="0"/>
+        <w:jc w:val="center"/>
+      </w:pPr>
       <w:r>
         <w:rPr>
+          <w:rFonts w:ascii="Times New Roman" w:hAnsi="Times New Roman"/>
+          <w:b/>
+          <w:caps/>
+          <w:color w:val="000000"/>
+          <w:sz w:val="28"/>
+        </w:rPr>
+        <w:t>6 ФАЗА 5. ТЕСТУВАННЯ ТА ОПТИМІЗАЦІЯ (QA)</w:t>
+      </w:r>
+    </w:p>
+    <w:p>
+      <w:pPr>
+        <w:spacing w:line="360" w:lineRule="auto" w:before="0" w:after="0"/>
+        <w:ind w:firstLine="0"/>
+        <w:jc w:val="both"/>
+      </w:pPr>
+    </w:p>
+    <w:p>
+      <w:pPr>
+        <w:spacing w:line="360" w:lineRule="auto" w:before="0" w:after="0"/>
+        <w:ind w:firstLine="709"/>
+        <w:jc w:val="both"/>
+      </w:pPr>
+      <w:r>
+        <w:rPr>
+          <w:rFonts w:ascii="Times New Roman" w:hAnsi="Times New Roman"/>
+          <w:b w:val="0"/>
           <w:i/>
-          <w:color w:val="999999"/>
+          <w:color w:val="000000"/>
+          <w:sz w:val="28"/>
         </w:rPr>
-        <w:t>Цей розділ буде заповнено на відповідному етапі розробки.</w:t>
+        <w:t>Розділ буде заповнено на відповідному етапі розробки.</w:t>
       </w:r>
     </w:p>
     <w:sectPr>
+      <w:footerReference w:type="default" r:id="rId9"/>
       <w:pgSz w:w="11906" w:h="16838"/>
-      <w:pgMar w:top="1134" w:right="1134" w:bottom="1134" w:left="1417" w:header="720" w:footer="720" w:gutter="0"/>
+      <w:pgMar w:top="1134" w:right="850" w:bottom="1134" w:left="1417" w:header="720" w:footer="720" w:gutter="0"/>
       <w:cols w:space="720"/>
       <w:docGrid w:linePitch="360"/>
     </w:sectPr>
   </w:body>
 </w:document>
+</file>
+
+<file path=word/footer1.xml><?xml version="1.0" encoding="utf-8"?>
+<w:ftr xmlns:m="http://schemas.openxmlformats.org/officeDocument/2006/math" xmlns:mc="http://schemas.openxmlformats.org/markup-compatibility/2006" xmlns:mo="http://schemas.microsoft.com/office/mac/office/2008/main" xmlns:mv="urn:schemas-microsoft-com:mac:vml" xmlns:o="urn:schemas-microsoft-com:office:office" xmlns:r="http://schemas.openxmlformats.org/officeDocument/2006/relationships" xmlns:v="urn:schemas-microsoft-com:vml" xmlns:w10="urn:schemas-microsoft-com:office:word" xmlns:w14="http://schemas.microsoft.com/office/word/2010/wordml" xmlns:w="http://schemas.openxmlformats.org/wordprocessingml/2006/main" xmlns:wne="http://schemas.microsoft.com/office/word/2006/wordml" xmlns:wp14="http://schemas.microsoft.com/office/word/2010/wordprocessingDrawing" xmlns:wp="http://schemas.openxmlformats.org/drawingml/2006/wordprocessingDrawing" xmlns:wpc="http://schemas.microsoft.com/office/word/2010/wordprocessingCanvas" xmlns:wpg="http://schemas.microsoft.com/office/word/2010/wordprocessingGroup" xmlns:wpi="http://schemas.microsoft.com/office/word/2010/wordprocessingInk" xmlns:wps="http://schemas.microsoft.com/office/word/2010/wordprocessingShape" mc:Ignorable="w14 wp14">
+  <w:p>
+    <w:pPr>
+      <w:pStyle w:val="Footer"/>
+      <w:jc w:val="center"/>
+    </w:pPr>
+    <w:r>
+      <w:rPr>
+        <w:rFonts w:ascii="Times New Roman" w:hAnsi="Times New Roman"/>
+        <w:sz w:val="28"/>
+      </w:rPr>
+      <w:fldChar w:fldCharType="begin"/>
+      <w:instrText>PAGE</w:instrText>
+      <w:fldChar w:fldCharType="end"/>
+    </w:r>
+  </w:p>
+</w:ftr>
 </file>
 
 <file path=word/numbering.xml><?xml version="1.0" encoding="utf-8"?>
@@ -1821,9 +2961,12 @@
     <w:name w:val="Normal"/>
     <w:qFormat/>
     <w:rsid w:val="00FC693F"/>
+    <w:pPr>
+      <w:spacing w:line="360" w:lineRule="auto"/>
+    </w:pPr>
     <w:rPr>
-      <w:rFonts w:ascii="Calibri" w:hAnsi="Calibri"/>
-      <w:sz w:val="22"/>
+      <w:rFonts w:ascii="Times New Roman" w:hAnsi="Times New Roman"/>
+      <w:sz w:val="28"/>
     </w:rPr>
   </w:style>
   <w:style w:type="paragraph" w:styleId="Header">
@@ -1888,8 +3031,8 @@
       <w:rFonts w:asciiTheme="majorHAnsi" w:eastAsiaTheme="majorEastAsia" w:hAnsiTheme="majorHAnsi" w:cstheme="majorBidi"/>
       <w:b/>
       <w:bCs/>
-      <w:color w:val="1A569A"/>
-      <w:sz w:val="32"/>
+      <w:color w:val="365F91" w:themeColor="accent1" w:themeShade="BF"/>
+      <w:sz w:val="28"/>
       <w:szCs w:val="28"/>
     </w:rPr>
   </w:style>
@@ -1912,7 +3055,7 @@
       <w:rFonts w:asciiTheme="majorHAnsi" w:eastAsiaTheme="majorEastAsia" w:hAnsiTheme="majorHAnsi" w:cstheme="majorBidi"/>
       <w:b/>
       <w:bCs/>
-      <w:color w:val="2E75B6"/>
+      <w:color w:val="4F81BD" w:themeColor="accent1"/>
       <w:sz w:val="26"/>
       <w:szCs w:val="26"/>
     </w:rPr>

</xml_diff>

<commit_message>
Complete Phase 2: Install Devuan and generate updated diary
</commit_message>
<xml_diff>
--- a/diary/Devuan_Security_OS_Diary.docx
+++ b/diary/Devuan_Security_OS_Diary.docx
@@ -224,7 +224,7 @@
           <w:color w:val="000000"/>
           <w:sz w:val="28"/>
         </w:rPr>
-        <w:t>04.07.2026</w:t>
+        <w:t>06.07.2026</w:t>
       </w:r>
     </w:p>
     <w:p>
@@ -2324,25 +2324,505 @@
           <w:color w:val="000000"/>
           <w:sz w:val="28"/>
         </w:rPr>
-        <w:t>Цей розділ буде заповнено після завершення встановлення Devuan у VMware Workstation. Ключовим етапом є відмова від будь-якого графічного середовища на кроці вибору компонентів у Tasksel та встановлення лише SSH server і Standard system utilities.</w:t>
+        <w:t>Метою цієї фази є безпосереднє встановлення операційної системи Devuan Excalibur 6.1.1 на віртуальний диск створеної ВМ. Для мінімізації споживання ресурсів та підвищення безпеки системи, встановлення проводиться у мінімальній конфігурації (без графічної оболонки).</w:t>
       </w:r>
     </w:p>
     <w:p>
       <w:pPr>
         <w:spacing w:line="360" w:lineRule="auto" w:before="0" w:after="0"/>
         <w:ind w:firstLine="709"/>
-        <w:jc w:val="both"/>
+        <w:jc w:val="left"/>
       </w:pPr>
       <w:r>
         <w:rPr>
           <w:rFonts w:ascii="Times New Roman" w:hAnsi="Times New Roman"/>
           <w:b/>
+          <w:color w:val="000000"/>
+          <w:sz w:val="28"/>
+        </w:rPr>
+        <w:t>3.1 Початкове завантаження та вибір локалізації</w:t>
+      </w:r>
+    </w:p>
+    <w:p>
+      <w:pPr>
+        <w:spacing w:line="360" w:lineRule="auto" w:before="0" w:after="0"/>
+        <w:ind w:firstLine="0"/>
+        <w:jc w:val="both"/>
+      </w:pPr>
+    </w:p>
+    <w:p>
+      <w:pPr>
+        <w:spacing w:line="360" w:lineRule="auto" w:before="0" w:after="0"/>
+        <w:ind w:firstLine="709"/>
+        <w:jc w:val="both"/>
+      </w:pPr>
+      <w:r>
+        <w:rPr>
+          <w:rFonts w:ascii="Times New Roman" w:hAnsi="Times New Roman"/>
+          <w:b w:val="0"/>
           <w:i w:val="0"/>
           <w:color w:val="000000"/>
           <w:sz w:val="28"/>
         </w:rPr>
-        <w:t>Скріншоти для даного розділу:</w:t>
+        <w:t>При завантаженні з інсталяційного образу користувачу пропонується menu вибору режиму встановлення. Обрано стандартний текстовий режим встановлення (Install). На наступних кроках налаштовано мову інтерфейсу, країну місцезнаходження та розкладку клавіатури.</w:t>
       </w:r>
+    </w:p>
+    <w:p>
+      <w:pPr>
+        <w:spacing w:line="360" w:lineRule="auto" w:before="0" w:after="0"/>
+        <w:ind w:firstLine="0"/>
+        <w:jc w:val="both"/>
+      </w:pPr>
+    </w:p>
+    <w:p>
+      <w:pPr>
+        <w:spacing w:before="0" w:after="0"/>
+        <w:jc w:val="center"/>
+      </w:pPr>
+      <w:r>
+        <w:drawing>
+          <wp:inline xmlns:a="http://schemas.openxmlformats.org/drawingml/2006/main" xmlns:pic="http://schemas.openxmlformats.org/drawingml/2006/picture">
+            <wp:extent cx="5040000" cy="3439264"/>
+            <wp:docPr id="9" name="Picture 9"/>
+            <wp:cNvGraphicFramePr>
+              <a:graphicFrameLocks noChangeAspect="1"/>
+            </wp:cNvGraphicFramePr>
+            <a:graphic>
+              <a:graphicData uri="http://schemas.openxmlformats.org/drawingml/2006/picture">
+                <pic:pic>
+                  <pic:nvPicPr>
+                    <pic:cNvPr id="0" name="2.1_devuan_boot_menu.png"/>
+                    <pic:cNvPicPr/>
+                  </pic:nvPicPr>
+                  <pic:blipFill>
+                    <a:blip r:embed="rId18"/>
+                    <a:stretch>
+                      <a:fillRect/>
+                    </a:stretch>
+                  </pic:blipFill>
+                  <pic:spPr>
+                    <a:xfrm>
+                      <a:off x="0" y="0"/>
+                      <a:ext cx="5040000" cy="3439264"/>
+                    </a:xfrm>
+                    <a:prstGeom prst="rect"/>
+                  </pic:spPr>
+                </pic:pic>
+              </a:graphicData>
+            </a:graphic>
+          </wp:inline>
+        </w:drawing>
+      </w:r>
+    </w:p>
+    <w:p>
+      <w:pPr>
+        <w:spacing w:before="60" w:after="120" w:line="360" w:lineRule="auto"/>
+        <w:ind w:firstLine="0"/>
+        <w:jc w:val="center"/>
+      </w:pPr>
+      <w:r>
+        <w:rPr>
+          <w:rFonts w:ascii="Times New Roman" w:hAnsi="Times New Roman"/>
+          <w:color w:val="000000"/>
+          <w:sz w:val="28"/>
+        </w:rPr>
+        <w:t>Рисунок 3.1 — Меню завантаження Devuan Excalibur</w:t>
+      </w:r>
+    </w:p>
+    <w:p>
+      <w:pPr>
+        <w:spacing w:line="360" w:lineRule="auto" w:before="0" w:after="0"/>
+        <w:ind w:firstLine="0"/>
+        <w:jc w:val="both"/>
+      </w:pPr>
+    </w:p>
+    <w:p>
+      <w:pPr>
+        <w:spacing w:before="0" w:after="0"/>
+        <w:jc w:val="center"/>
+      </w:pPr>
+      <w:r>
+        <w:drawing>
+          <wp:inline xmlns:a="http://schemas.openxmlformats.org/drawingml/2006/main" xmlns:pic="http://schemas.openxmlformats.org/drawingml/2006/picture">
+            <wp:extent cx="5040000" cy="3492245"/>
+            <wp:docPr id="10" name="Picture 10"/>
+            <wp:cNvGraphicFramePr>
+              <a:graphicFrameLocks noChangeAspect="1"/>
+            </wp:cNvGraphicFramePr>
+            <a:graphic>
+              <a:graphicData uri="http://schemas.openxmlformats.org/drawingml/2006/picture">
+                <pic:pic>
+                  <pic:nvPicPr>
+                    <pic:cNvPr id="0" name="2.2_devuan_language.png"/>
+                    <pic:cNvPicPr/>
+                  </pic:nvPicPr>
+                  <pic:blipFill>
+                    <a:blip r:embed="rId19"/>
+                    <a:stretch>
+                      <a:fillRect/>
+                    </a:stretch>
+                  </pic:blipFill>
+                  <pic:spPr>
+                    <a:xfrm>
+                      <a:off x="0" y="0"/>
+                      <a:ext cx="5040000" cy="3492245"/>
+                    </a:xfrm>
+                    <a:prstGeom prst="rect"/>
+                  </pic:spPr>
+                </pic:pic>
+              </a:graphicData>
+            </a:graphic>
+          </wp:inline>
+        </w:drawing>
+      </w:r>
+    </w:p>
+    <w:p>
+      <w:pPr>
+        <w:spacing w:before="60" w:after="120" w:line="360" w:lineRule="auto"/>
+        <w:ind w:firstLine="0"/>
+        <w:jc w:val="center"/>
+      </w:pPr>
+      <w:r>
+        <w:rPr>
+          <w:rFonts w:ascii="Times New Roman" w:hAnsi="Times New Roman"/>
+          <w:color w:val="000000"/>
+          <w:sz w:val="28"/>
+        </w:rPr>
+        <w:t>Рисунок 3.2 — Вибір мови встановлення (English)</w:t>
+      </w:r>
+    </w:p>
+    <w:p>
+      <w:pPr>
+        <w:spacing w:line="360" w:lineRule="auto" w:before="0" w:after="0"/>
+        <w:ind w:firstLine="0"/>
+        <w:jc w:val="both"/>
+      </w:pPr>
+    </w:p>
+    <w:p>
+      <w:pPr>
+        <w:spacing w:before="0" w:after="0"/>
+        <w:jc w:val="center"/>
+      </w:pPr>
+      <w:r>
+        <w:drawing>
+          <wp:inline xmlns:a="http://schemas.openxmlformats.org/drawingml/2006/main" xmlns:pic="http://schemas.openxmlformats.org/drawingml/2006/picture">
+            <wp:extent cx="5040000" cy="3492245"/>
+            <wp:docPr id="11" name="Picture 11"/>
+            <wp:cNvGraphicFramePr>
+              <a:graphicFrameLocks noChangeAspect="1"/>
+            </wp:cNvGraphicFramePr>
+            <a:graphic>
+              <a:graphicData uri="http://schemas.openxmlformats.org/drawingml/2006/picture">
+                <pic:pic>
+                  <pic:nvPicPr>
+                    <pic:cNvPr id="0" name="2.3.1_devuan_location_other.png"/>
+                    <pic:cNvPicPr/>
+                  </pic:nvPicPr>
+                  <pic:blipFill>
+                    <a:blip r:embed="rId20"/>
+                    <a:stretch>
+                      <a:fillRect/>
+                    </a:stretch>
+                  </pic:blipFill>
+                  <pic:spPr>
+                    <a:xfrm>
+                      <a:off x="0" y="0"/>
+                      <a:ext cx="5040000" cy="3492245"/>
+                    </a:xfrm>
+                    <a:prstGeom prst="rect"/>
+                  </pic:spPr>
+                </pic:pic>
+              </a:graphicData>
+            </a:graphic>
+          </wp:inline>
+        </w:drawing>
+      </w:r>
+    </w:p>
+    <w:p>
+      <w:pPr>
+        <w:spacing w:before="60" w:after="120" w:line="360" w:lineRule="auto"/>
+        <w:ind w:firstLine="0"/>
+        <w:jc w:val="center"/>
+      </w:pPr>
+      <w:r>
+        <w:rPr>
+          <w:rFonts w:ascii="Times New Roman" w:hAnsi="Times New Roman"/>
+          <w:color w:val="000000"/>
+          <w:sz w:val="28"/>
+        </w:rPr>
+        <w:t>Рисунок 3.3 — Вибір регіону місцезнаходження (Other)</w:t>
+      </w:r>
+    </w:p>
+    <w:p>
+      <w:pPr>
+        <w:spacing w:line="360" w:lineRule="auto" w:before="0" w:after="0"/>
+        <w:ind w:firstLine="0"/>
+        <w:jc w:val="both"/>
+      </w:pPr>
+    </w:p>
+    <w:p>
+      <w:pPr>
+        <w:spacing w:before="0" w:after="0"/>
+        <w:jc w:val="center"/>
+      </w:pPr>
+      <w:r>
+        <w:drawing>
+          <wp:inline xmlns:a="http://schemas.openxmlformats.org/drawingml/2006/main" xmlns:pic="http://schemas.openxmlformats.org/drawingml/2006/picture">
+            <wp:extent cx="5040000" cy="3492245"/>
+            <wp:docPr id="12" name="Picture 12"/>
+            <wp:cNvGraphicFramePr>
+              <a:graphicFrameLocks noChangeAspect="1"/>
+            </wp:cNvGraphicFramePr>
+            <a:graphic>
+              <a:graphicData uri="http://schemas.openxmlformats.org/drawingml/2006/picture">
+                <pic:pic>
+                  <pic:nvPicPr>
+                    <pic:cNvPr id="0" name="2.3.2_devuan_location_europe.png"/>
+                    <pic:cNvPicPr/>
+                  </pic:nvPicPr>
+                  <pic:blipFill>
+                    <a:blip r:embed="rId21"/>
+                    <a:stretch>
+                      <a:fillRect/>
+                    </a:stretch>
+                  </pic:blipFill>
+                  <pic:spPr>
+                    <a:xfrm>
+                      <a:off x="0" y="0"/>
+                      <a:ext cx="5040000" cy="3492245"/>
+                    </a:xfrm>
+                    <a:prstGeom prst="rect"/>
+                  </pic:spPr>
+                </pic:pic>
+              </a:graphicData>
+            </a:graphic>
+          </wp:inline>
+        </w:drawing>
+      </w:r>
+    </w:p>
+    <w:p>
+      <w:pPr>
+        <w:spacing w:before="60" w:after="120" w:line="360" w:lineRule="auto"/>
+        <w:ind w:firstLine="0"/>
+        <w:jc w:val="center"/>
+      </w:pPr>
+      <w:r>
+        <w:rPr>
+          <w:rFonts w:ascii="Times New Roman" w:hAnsi="Times New Roman"/>
+          <w:color w:val="000000"/>
+          <w:sz w:val="28"/>
+        </w:rPr>
+        <w:t>Рисунок 3.4 — Вибір континенту (Europe)</w:t>
+      </w:r>
+    </w:p>
+    <w:p>
+      <w:pPr>
+        <w:spacing w:line="360" w:lineRule="auto" w:before="0" w:after="0"/>
+        <w:ind w:firstLine="0"/>
+        <w:jc w:val="both"/>
+      </w:pPr>
+    </w:p>
+    <w:p>
+      <w:pPr>
+        <w:spacing w:before="0" w:after="0"/>
+        <w:jc w:val="center"/>
+      </w:pPr>
+      <w:r>
+        <w:drawing>
+          <wp:inline xmlns:a="http://schemas.openxmlformats.org/drawingml/2006/main" xmlns:pic="http://schemas.openxmlformats.org/drawingml/2006/picture">
+            <wp:extent cx="5040000" cy="3492245"/>
+            <wp:docPr id="13" name="Picture 13"/>
+            <wp:cNvGraphicFramePr>
+              <a:graphicFrameLocks noChangeAspect="1"/>
+            </wp:cNvGraphicFramePr>
+            <a:graphic>
+              <a:graphicData uri="http://schemas.openxmlformats.org/drawingml/2006/picture">
+                <pic:pic>
+                  <pic:nvPicPr>
+                    <pic:cNvPr id="0" name="2.3.3_devuan_location_ukraine.png"/>
+                    <pic:cNvPicPr/>
+                  </pic:nvPicPr>
+                  <pic:blipFill>
+                    <a:blip r:embed="rId22"/>
+                    <a:stretch>
+                      <a:fillRect/>
+                    </a:stretch>
+                  </pic:blipFill>
+                  <pic:spPr>
+                    <a:xfrm>
+                      <a:off x="0" y="0"/>
+                      <a:ext cx="5040000" cy="3492245"/>
+                    </a:xfrm>
+                    <a:prstGeom prst="rect"/>
+                  </pic:spPr>
+                </pic:pic>
+              </a:graphicData>
+            </a:graphic>
+          </wp:inline>
+        </w:drawing>
+      </w:r>
+    </w:p>
+    <w:p>
+      <w:pPr>
+        <w:spacing w:before="60" w:after="120" w:line="360" w:lineRule="auto"/>
+        <w:ind w:firstLine="0"/>
+        <w:jc w:val="center"/>
+      </w:pPr>
+      <w:r>
+        <w:rPr>
+          <w:rFonts w:ascii="Times New Roman" w:hAnsi="Times New Roman"/>
+          <w:color w:val="000000"/>
+          <w:sz w:val="28"/>
+        </w:rPr>
+        <w:t>Рисунок 3.5 — Вибір країни (Ukraine)</w:t>
+      </w:r>
+    </w:p>
+    <w:p>
+      <w:pPr>
+        <w:spacing w:line="360" w:lineRule="auto" w:before="0" w:after="0"/>
+        <w:ind w:firstLine="0"/>
+        <w:jc w:val="both"/>
+      </w:pPr>
+    </w:p>
+    <w:p>
+      <w:pPr>
+        <w:spacing w:before="0" w:after="0"/>
+        <w:jc w:val="center"/>
+      </w:pPr>
+      <w:r>
+        <w:drawing>
+          <wp:inline xmlns:a="http://schemas.openxmlformats.org/drawingml/2006/main" xmlns:pic="http://schemas.openxmlformats.org/drawingml/2006/picture">
+            <wp:extent cx="5040000" cy="3492245"/>
+            <wp:docPr id="14" name="Picture 14"/>
+            <wp:cNvGraphicFramePr>
+              <a:graphicFrameLocks noChangeAspect="1"/>
+            </wp:cNvGraphicFramePr>
+            <a:graphic>
+              <a:graphicData uri="http://schemas.openxmlformats.org/drawingml/2006/picture">
+                <pic:pic>
+                  <pic:nvPicPr>
+                    <pic:cNvPr id="0" name="2.4_devuan_locale.png"/>
+                    <pic:cNvPicPr/>
+                  </pic:nvPicPr>
+                  <pic:blipFill>
+                    <a:blip r:embed="rId23"/>
+                    <a:stretch>
+                      <a:fillRect/>
+                    </a:stretch>
+                  </pic:blipFill>
+                  <pic:spPr>
+                    <a:xfrm>
+                      <a:off x="0" y="0"/>
+                      <a:ext cx="5040000" cy="3492245"/>
+                    </a:xfrm>
+                    <a:prstGeom prst="rect"/>
+                  </pic:spPr>
+                </pic:pic>
+              </a:graphicData>
+            </a:graphic>
+          </wp:inline>
+        </w:drawing>
+      </w:r>
+    </w:p>
+    <w:p>
+      <w:pPr>
+        <w:spacing w:before="60" w:after="120" w:line="360" w:lineRule="auto"/>
+        <w:ind w:firstLine="0"/>
+        <w:jc w:val="center"/>
+      </w:pPr>
+      <w:r>
+        <w:rPr>
+          <w:rFonts w:ascii="Times New Roman" w:hAnsi="Times New Roman"/>
+          <w:color w:val="000000"/>
+          <w:sz w:val="28"/>
+        </w:rPr>
+        <w:t>Рисунок 3.6 — Вибір локалі за замовчуванням (en_US.UTF-8)</w:t>
+      </w:r>
+    </w:p>
+    <w:p>
+      <w:pPr>
+        <w:spacing w:line="360" w:lineRule="auto" w:before="0" w:after="0"/>
+        <w:ind w:firstLine="0"/>
+        <w:jc w:val="both"/>
+      </w:pPr>
+    </w:p>
+    <w:p>
+      <w:pPr>
+        <w:spacing w:before="0" w:after="0"/>
+        <w:jc w:val="center"/>
+      </w:pPr>
+      <w:r>
+        <w:drawing>
+          <wp:inline xmlns:a="http://schemas.openxmlformats.org/drawingml/2006/main" xmlns:pic="http://schemas.openxmlformats.org/drawingml/2006/picture">
+            <wp:extent cx="5040000" cy="3492245"/>
+            <wp:docPr id="15" name="Picture 15"/>
+            <wp:cNvGraphicFramePr>
+              <a:graphicFrameLocks noChangeAspect="1"/>
+            </wp:cNvGraphicFramePr>
+            <a:graphic>
+              <a:graphicData uri="http://schemas.openxmlformats.org/drawingml/2006/picture">
+                <pic:pic>
+                  <pic:nvPicPr>
+                    <pic:cNvPr id="0" name="2.5_devuan_keyboard.png"/>
+                    <pic:cNvPicPr/>
+                  </pic:nvPicPr>
+                  <pic:blipFill>
+                    <a:blip r:embed="rId24"/>
+                    <a:stretch>
+                      <a:fillRect/>
+                    </a:stretch>
+                  </pic:blipFill>
+                  <pic:spPr>
+                    <a:xfrm>
+                      <a:off x="0" y="0"/>
+                      <a:ext cx="5040000" cy="3492245"/>
+                    </a:xfrm>
+                    <a:prstGeom prst="rect"/>
+                  </pic:spPr>
+                </pic:pic>
+              </a:graphicData>
+            </a:graphic>
+          </wp:inline>
+        </w:drawing>
+      </w:r>
+    </w:p>
+    <w:p>
+      <w:pPr>
+        <w:spacing w:before="60" w:after="120" w:line="360" w:lineRule="auto"/>
+        <w:ind w:firstLine="0"/>
+        <w:jc w:val="center"/>
+      </w:pPr>
+      <w:r>
+        <w:rPr>
+          <w:rFonts w:ascii="Times New Roman" w:hAnsi="Times New Roman"/>
+          <w:color w:val="000000"/>
+          <w:sz w:val="28"/>
+        </w:rPr>
+        <w:t>Рисунок 3.7 — Вибір розкладки клавіатури (American English)</w:t>
+      </w:r>
+    </w:p>
+    <w:p>
+      <w:pPr>
+        <w:spacing w:line="360" w:lineRule="auto" w:before="0" w:after="0"/>
+        <w:ind w:firstLine="709"/>
+        <w:jc w:val="left"/>
+      </w:pPr>
+      <w:r>
+        <w:rPr>
+          <w:rFonts w:ascii="Times New Roman" w:hAnsi="Times New Roman"/>
+          <w:b/>
+          <w:color w:val="000000"/>
+          <w:sz w:val="28"/>
+        </w:rPr>
+        <w:t>3.2 Налаштування мережі та облікових записів</w:t>
+      </w:r>
+    </w:p>
+    <w:p>
+      <w:pPr>
+        <w:spacing w:line="360" w:lineRule="auto" w:before="0" w:after="0"/>
+        <w:ind w:firstLine="0"/>
+        <w:jc w:val="both"/>
+      </w:pPr>
     </w:p>
     <w:p>
       <w:pPr>
@@ -2354,12 +2834,221 @@
         <w:rPr>
           <w:rFonts w:ascii="Times New Roman" w:hAnsi="Times New Roman"/>
           <w:b w:val="0"/>
-          <w:i/>
+          <w:i w:val="0"/>
           <w:color w:val="000000"/>
           <w:sz w:val="28"/>
         </w:rPr>
-        <w:t>— 3.1 — Boot menu Devuan Excalibur [очікується]</w:t>
+        <w:t>На цьому етапі відбувається автоматичне отримання мережевих налаштувань через DHCP, введення імені хоста (hostname), а також створення облікових записів адміністратора (root) та звичайного користувача системи.</w:t>
       </w:r>
+    </w:p>
+    <w:p>
+      <w:pPr>
+        <w:spacing w:line="360" w:lineRule="auto" w:before="0" w:after="0"/>
+        <w:ind w:firstLine="0"/>
+        <w:jc w:val="both"/>
+      </w:pPr>
+    </w:p>
+    <w:p>
+      <w:pPr>
+        <w:spacing w:before="0" w:after="0"/>
+        <w:jc w:val="center"/>
+      </w:pPr>
+      <w:r>
+        <w:drawing>
+          <wp:inline xmlns:a="http://schemas.openxmlformats.org/drawingml/2006/main" xmlns:pic="http://schemas.openxmlformats.org/drawingml/2006/picture">
+            <wp:extent cx="5040000" cy="3492245"/>
+            <wp:docPr id="16" name="Picture 16"/>
+            <wp:cNvGraphicFramePr>
+              <a:graphicFrameLocks noChangeAspect="1"/>
+            </wp:cNvGraphicFramePr>
+            <a:graphic>
+              <a:graphicData uri="http://schemas.openxmlformats.org/drawingml/2006/picture">
+                <pic:pic>
+                  <pic:nvPicPr>
+                    <pic:cNvPr id="0" name="2.6_devuan_hostname.png"/>
+                    <pic:cNvPicPr/>
+                  </pic:nvPicPr>
+                  <pic:blipFill>
+                    <a:blip r:embed="rId25"/>
+                    <a:stretch>
+                      <a:fillRect/>
+                    </a:stretch>
+                  </pic:blipFill>
+                  <pic:spPr>
+                    <a:xfrm>
+                      <a:off x="0" y="0"/>
+                      <a:ext cx="5040000" cy="3492245"/>
+                    </a:xfrm>
+                    <a:prstGeom prst="rect"/>
+                  </pic:spPr>
+                </pic:pic>
+              </a:graphicData>
+            </a:graphic>
+          </wp:inline>
+        </w:drawing>
+      </w:r>
+    </w:p>
+    <w:p>
+      <w:pPr>
+        <w:spacing w:before="60" w:after="120" w:line="360" w:lineRule="auto"/>
+        <w:ind w:firstLine="0"/>
+        <w:jc w:val="center"/>
+      </w:pPr>
+      <w:r>
+        <w:rPr>
+          <w:rFonts w:ascii="Times New Roman" w:hAnsi="Times New Roman"/>
+          <w:color w:val="000000"/>
+          <w:sz w:val="28"/>
+        </w:rPr>
+        <w:t>Рисунок 3.8 — Задання імені хоста (devuan-security)</w:t>
+      </w:r>
+    </w:p>
+    <w:p>
+      <w:pPr>
+        <w:spacing w:line="360" w:lineRule="auto" w:before="0" w:after="0"/>
+        <w:ind w:firstLine="0"/>
+        <w:jc w:val="both"/>
+      </w:pPr>
+    </w:p>
+    <w:p>
+      <w:pPr>
+        <w:spacing w:before="0" w:after="0"/>
+        <w:jc w:val="center"/>
+      </w:pPr>
+      <w:r>
+        <w:drawing>
+          <wp:inline xmlns:a="http://schemas.openxmlformats.org/drawingml/2006/main" xmlns:pic="http://schemas.openxmlformats.org/drawingml/2006/picture">
+            <wp:extent cx="5040000" cy="3492245"/>
+            <wp:docPr id="17" name="Picture 17"/>
+            <wp:cNvGraphicFramePr>
+              <a:graphicFrameLocks noChangeAspect="1"/>
+            </wp:cNvGraphicFramePr>
+            <a:graphic>
+              <a:graphicData uri="http://schemas.openxmlformats.org/drawingml/2006/picture">
+                <pic:pic>
+                  <pic:nvPicPr>
+                    <pic:cNvPr id="0" name="2.7_devuan_root_password.png"/>
+                    <pic:cNvPicPr/>
+                  </pic:nvPicPr>
+                  <pic:blipFill>
+                    <a:blip r:embed="rId26"/>
+                    <a:stretch>
+                      <a:fillRect/>
+                    </a:stretch>
+                  </pic:blipFill>
+                  <pic:spPr>
+                    <a:xfrm>
+                      <a:off x="0" y="0"/>
+                      <a:ext cx="5040000" cy="3492245"/>
+                    </a:xfrm>
+                    <a:prstGeom prst="rect"/>
+                  </pic:spPr>
+                </pic:pic>
+              </a:graphicData>
+            </a:graphic>
+          </wp:inline>
+        </w:drawing>
+      </w:r>
+    </w:p>
+    <w:p>
+      <w:pPr>
+        <w:spacing w:before="60" w:after="120" w:line="360" w:lineRule="auto"/>
+        <w:ind w:firstLine="0"/>
+        <w:jc w:val="center"/>
+      </w:pPr>
+      <w:r>
+        <w:rPr>
+          <w:rFonts w:ascii="Times New Roman" w:hAnsi="Times New Roman"/>
+          <w:color w:val="000000"/>
+          <w:sz w:val="28"/>
+        </w:rPr>
+        <w:t>Рисунок 3.9 — Встановлення паролю суперкористувача (root)</w:t>
+      </w:r>
+    </w:p>
+    <w:p>
+      <w:pPr>
+        <w:spacing w:line="360" w:lineRule="auto" w:before="0" w:after="0"/>
+        <w:ind w:firstLine="0"/>
+        <w:jc w:val="both"/>
+      </w:pPr>
+    </w:p>
+    <w:p>
+      <w:pPr>
+        <w:spacing w:before="0" w:after="0"/>
+        <w:jc w:val="center"/>
+      </w:pPr>
+      <w:r>
+        <w:drawing>
+          <wp:inline xmlns:a="http://schemas.openxmlformats.org/drawingml/2006/main" xmlns:pic="http://schemas.openxmlformats.org/drawingml/2006/picture">
+            <wp:extent cx="5040000" cy="3492245"/>
+            <wp:docPr id="18" name="Picture 18"/>
+            <wp:cNvGraphicFramePr>
+              <a:graphicFrameLocks noChangeAspect="1"/>
+            </wp:cNvGraphicFramePr>
+            <a:graphic>
+              <a:graphicData uri="http://schemas.openxmlformats.org/drawingml/2006/picture">
+                <pic:pic>
+                  <pic:nvPicPr>
+                    <pic:cNvPr id="0" name="2.8_devuan_user_create.png"/>
+                    <pic:cNvPicPr/>
+                  </pic:nvPicPr>
+                  <pic:blipFill>
+                    <a:blip r:embed="rId27"/>
+                    <a:stretch>
+                      <a:fillRect/>
+                    </a:stretch>
+                  </pic:blipFill>
+                  <pic:spPr>
+                    <a:xfrm>
+                      <a:off x="0" y="0"/>
+                      <a:ext cx="5040000" cy="3492245"/>
+                    </a:xfrm>
+                    <a:prstGeom prst="rect"/>
+                  </pic:spPr>
+                </pic:pic>
+              </a:graphicData>
+            </a:graphic>
+          </wp:inline>
+        </w:drawing>
+      </w:r>
+    </w:p>
+    <w:p>
+      <w:pPr>
+        <w:spacing w:before="60" w:after="120" w:line="360" w:lineRule="auto"/>
+        <w:ind w:firstLine="0"/>
+        <w:jc w:val="center"/>
+      </w:pPr>
+      <w:r>
+        <w:rPr>
+          <w:rFonts w:ascii="Times New Roman" w:hAnsi="Times New Roman"/>
+          <w:color w:val="000000"/>
+          <w:sz w:val="28"/>
+        </w:rPr>
+        <w:t>Рисунок 3.10 — Створення облікового запису звичайного користувача</w:t>
+      </w:r>
+    </w:p>
+    <w:p>
+      <w:pPr>
+        <w:spacing w:line="360" w:lineRule="auto" w:before="0" w:after="0"/>
+        <w:ind w:firstLine="709"/>
+        <w:jc w:val="left"/>
+      </w:pPr>
+      <w:r>
+        <w:rPr>
+          <w:rFonts w:ascii="Times New Roman" w:hAnsi="Times New Roman"/>
+          <w:b/>
+          <w:color w:val="000000"/>
+          <w:sz w:val="28"/>
+        </w:rPr>
+        <w:t>3.3 Розмітка дискового простору</w:t>
+      </w:r>
+    </w:p>
+    <w:p>
+      <w:pPr>
+        <w:spacing w:line="360" w:lineRule="auto" w:before="0" w:after="0"/>
+        <w:ind w:firstLine="0"/>
+        <w:jc w:val="both"/>
+      </w:pPr>
     </w:p>
     <w:p>
       <w:pPr>
@@ -2371,12 +3060,345 @@
         <w:rPr>
           <w:rFonts w:ascii="Times New Roman" w:hAnsi="Times New Roman"/>
           <w:b w:val="0"/>
-          <w:i/>
+          <w:i w:val="0"/>
           <w:color w:val="000000"/>
           <w:sz w:val="28"/>
         </w:rPr>
-        <w:t>— 3.2 — Вибір мови встановлення [очікується]</w:t>
+        <w:t>Для встановлення системи обрано метод автоматичної розмітки всього дискового простору (Guided - use entire disk). Оскільки створюється віртуальна машина розробника (Build Box), обрано найпростішу схему розмітки, де всі файли розташовуються на одному розділі (All files in one partition).</w:t>
       </w:r>
+    </w:p>
+    <w:p>
+      <w:pPr>
+        <w:spacing w:line="360" w:lineRule="auto" w:before="0" w:after="0"/>
+        <w:ind w:firstLine="0"/>
+        <w:jc w:val="both"/>
+      </w:pPr>
+    </w:p>
+    <w:p>
+      <w:pPr>
+        <w:spacing w:before="0" w:after="0"/>
+        <w:jc w:val="center"/>
+      </w:pPr>
+      <w:r>
+        <w:drawing>
+          <wp:inline xmlns:a="http://schemas.openxmlformats.org/drawingml/2006/main" xmlns:pic="http://schemas.openxmlformats.org/drawingml/2006/picture">
+            <wp:extent cx="5040000" cy="3492245"/>
+            <wp:docPr id="19" name="Picture 19"/>
+            <wp:cNvGraphicFramePr>
+              <a:graphicFrameLocks noChangeAspect="1"/>
+            </wp:cNvGraphicFramePr>
+            <a:graphic>
+              <a:graphicData uri="http://schemas.openxmlformats.org/drawingml/2006/picture">
+                <pic:pic>
+                  <pic:nvPicPr>
+                    <pic:cNvPr id="0" name="2.10.1_devuan_disk_method.png"/>
+                    <pic:cNvPicPr/>
+                  </pic:nvPicPr>
+                  <pic:blipFill>
+                    <a:blip r:embed="rId28"/>
+                    <a:stretch>
+                      <a:fillRect/>
+                    </a:stretch>
+                  </pic:blipFill>
+                  <pic:spPr>
+                    <a:xfrm>
+                      <a:off x="0" y="0"/>
+                      <a:ext cx="5040000" cy="3492245"/>
+                    </a:xfrm>
+                    <a:prstGeom prst="rect"/>
+                  </pic:spPr>
+                </pic:pic>
+              </a:graphicData>
+            </a:graphic>
+          </wp:inline>
+        </w:drawing>
+      </w:r>
+    </w:p>
+    <w:p>
+      <w:pPr>
+        <w:spacing w:before="60" w:after="120" w:line="360" w:lineRule="auto"/>
+        <w:ind w:firstLine="0"/>
+        <w:jc w:val="center"/>
+      </w:pPr>
+      <w:r>
+        <w:rPr>
+          <w:rFonts w:ascii="Times New Roman" w:hAnsi="Times New Roman"/>
+          <w:color w:val="000000"/>
+          <w:sz w:val="28"/>
+        </w:rPr>
+        <w:t>Рисунок 3.11 — Вибір методу розмітки диска</w:t>
+      </w:r>
+    </w:p>
+    <w:p>
+      <w:pPr>
+        <w:spacing w:line="360" w:lineRule="auto" w:before="0" w:after="0"/>
+        <w:ind w:firstLine="0"/>
+        <w:jc w:val="both"/>
+      </w:pPr>
+    </w:p>
+    <w:p>
+      <w:pPr>
+        <w:spacing w:before="0" w:after="0"/>
+        <w:jc w:val="center"/>
+      </w:pPr>
+      <w:r>
+        <w:drawing>
+          <wp:inline xmlns:a="http://schemas.openxmlformats.org/drawingml/2006/main" xmlns:pic="http://schemas.openxmlformats.org/drawingml/2006/picture">
+            <wp:extent cx="5040000" cy="3492245"/>
+            <wp:docPr id="20" name="Picture 20"/>
+            <wp:cNvGraphicFramePr>
+              <a:graphicFrameLocks noChangeAspect="1"/>
+            </wp:cNvGraphicFramePr>
+            <a:graphic>
+              <a:graphicData uri="http://schemas.openxmlformats.org/drawingml/2006/picture">
+                <pic:pic>
+                  <pic:nvPicPr>
+                    <pic:cNvPr id="0" name="2.10.2_devuan_disk_select.png"/>
+                    <pic:cNvPicPr/>
+                  </pic:nvPicPr>
+                  <pic:blipFill>
+                    <a:blip r:embed="rId29"/>
+                    <a:stretch>
+                      <a:fillRect/>
+                    </a:stretch>
+                  </pic:blipFill>
+                  <pic:spPr>
+                    <a:xfrm>
+                      <a:off x="0" y="0"/>
+                      <a:ext cx="5040000" cy="3492245"/>
+                    </a:xfrm>
+                    <a:prstGeom prst="rect"/>
+                  </pic:spPr>
+                </pic:pic>
+              </a:graphicData>
+            </a:graphic>
+          </wp:inline>
+        </w:drawing>
+      </w:r>
+    </w:p>
+    <w:p>
+      <w:pPr>
+        <w:spacing w:before="60" w:after="120" w:line="360" w:lineRule="auto"/>
+        <w:ind w:firstLine="0"/>
+        <w:jc w:val="center"/>
+      </w:pPr>
+      <w:r>
+        <w:rPr>
+          <w:rFonts w:ascii="Times New Roman" w:hAnsi="Times New Roman"/>
+          <w:color w:val="000000"/>
+          <w:sz w:val="28"/>
+        </w:rPr>
+        <w:t>Рисунок 3.12 — Вибір цільового диска для розмітки</w:t>
+      </w:r>
+    </w:p>
+    <w:p>
+      <w:pPr>
+        <w:spacing w:line="360" w:lineRule="auto" w:before="0" w:after="0"/>
+        <w:ind w:firstLine="0"/>
+        <w:jc w:val="both"/>
+      </w:pPr>
+    </w:p>
+    <w:p>
+      <w:pPr>
+        <w:spacing w:before="0" w:after="0"/>
+        <w:jc w:val="center"/>
+      </w:pPr>
+      <w:r>
+        <w:drawing>
+          <wp:inline xmlns:a="http://schemas.openxmlformats.org/drawingml/2006/main" xmlns:pic="http://schemas.openxmlformats.org/drawingml/2006/picture">
+            <wp:extent cx="5040000" cy="3492245"/>
+            <wp:docPr id="21" name="Picture 21"/>
+            <wp:cNvGraphicFramePr>
+              <a:graphicFrameLocks noChangeAspect="1"/>
+            </wp:cNvGraphicFramePr>
+            <a:graphic>
+              <a:graphicData uri="http://schemas.openxmlformats.org/drawingml/2006/picture">
+                <pic:pic>
+                  <pic:nvPicPr>
+                    <pic:cNvPr id="0" name="2.10.3_devuan_disk_scheme.png"/>
+                    <pic:cNvPicPr/>
+                  </pic:nvPicPr>
+                  <pic:blipFill>
+                    <a:blip r:embed="rId30"/>
+                    <a:stretch>
+                      <a:fillRect/>
+                    </a:stretch>
+                  </pic:blipFill>
+                  <pic:spPr>
+                    <a:xfrm>
+                      <a:off x="0" y="0"/>
+                      <a:ext cx="5040000" cy="3492245"/>
+                    </a:xfrm>
+                    <a:prstGeom prst="rect"/>
+                  </pic:spPr>
+                </pic:pic>
+              </a:graphicData>
+            </a:graphic>
+          </wp:inline>
+        </w:drawing>
+      </w:r>
+    </w:p>
+    <w:p>
+      <w:pPr>
+        <w:spacing w:before="60" w:after="120" w:line="360" w:lineRule="auto"/>
+        <w:ind w:firstLine="0"/>
+        <w:jc w:val="center"/>
+      </w:pPr>
+      <w:r>
+        <w:rPr>
+          <w:rFonts w:ascii="Times New Roman" w:hAnsi="Times New Roman"/>
+          <w:color w:val="000000"/>
+          <w:sz w:val="28"/>
+        </w:rPr>
+        <w:t>Рисунок 3.13 — Вибір схеми розмітки диска</w:t>
+      </w:r>
+    </w:p>
+    <w:p>
+      <w:pPr>
+        <w:spacing w:line="360" w:lineRule="auto" w:before="0" w:after="0"/>
+        <w:ind w:firstLine="0"/>
+        <w:jc w:val="both"/>
+      </w:pPr>
+    </w:p>
+    <w:p>
+      <w:pPr>
+        <w:spacing w:before="0" w:after="0"/>
+        <w:jc w:val="center"/>
+      </w:pPr>
+      <w:r>
+        <w:drawing>
+          <wp:inline xmlns:a="http://schemas.openxmlformats.org/drawingml/2006/main" xmlns:pic="http://schemas.openxmlformats.org/drawingml/2006/picture">
+            <wp:extent cx="5040000" cy="3492245"/>
+            <wp:docPr id="22" name="Picture 22"/>
+            <wp:cNvGraphicFramePr>
+              <a:graphicFrameLocks noChangeAspect="1"/>
+            </wp:cNvGraphicFramePr>
+            <a:graphic>
+              <a:graphicData uri="http://schemas.openxmlformats.org/drawingml/2006/picture">
+                <pic:pic>
+                  <pic:nvPicPr>
+                    <pic:cNvPr id="0" name="2.10.4_devuan_disk_overview.png"/>
+                    <pic:cNvPicPr/>
+                  </pic:nvPicPr>
+                  <pic:blipFill>
+                    <a:blip r:embed="rId31"/>
+                    <a:stretch>
+                      <a:fillRect/>
+                    </a:stretch>
+                  </pic:blipFill>
+                  <pic:spPr>
+                    <a:xfrm>
+                      <a:off x="0" y="0"/>
+                      <a:ext cx="5040000" cy="3492245"/>
+                    </a:xfrm>
+                    <a:prstGeom prst="rect"/>
+                  </pic:spPr>
+                </pic:pic>
+              </a:graphicData>
+            </a:graphic>
+          </wp:inline>
+        </w:drawing>
+      </w:r>
+    </w:p>
+    <w:p>
+      <w:pPr>
+        <w:spacing w:before="60" w:after="120" w:line="360" w:lineRule="auto"/>
+        <w:ind w:firstLine="0"/>
+        <w:jc w:val="center"/>
+      </w:pPr>
+      <w:r>
+        <w:rPr>
+          <w:rFonts w:ascii="Times New Roman" w:hAnsi="Times New Roman"/>
+          <w:color w:val="000000"/>
+          <w:sz w:val="28"/>
+        </w:rPr>
+        <w:t>Рисунок 3.14 — Огляд створених розділів</w:t>
+      </w:r>
+    </w:p>
+    <w:p>
+      <w:pPr>
+        <w:spacing w:line="360" w:lineRule="auto" w:before="0" w:after="0"/>
+        <w:ind w:firstLine="0"/>
+        <w:jc w:val="both"/>
+      </w:pPr>
+    </w:p>
+    <w:p>
+      <w:pPr>
+        <w:spacing w:before="0" w:after="0"/>
+        <w:jc w:val="center"/>
+      </w:pPr>
+      <w:r>
+        <w:drawing>
+          <wp:inline xmlns:a="http://schemas.openxmlformats.org/drawingml/2006/main" xmlns:pic="http://schemas.openxmlformats.org/drawingml/2006/picture">
+            <wp:extent cx="5040000" cy="3492245"/>
+            <wp:docPr id="23" name="Picture 23"/>
+            <wp:cNvGraphicFramePr>
+              <a:graphicFrameLocks noChangeAspect="1"/>
+            </wp:cNvGraphicFramePr>
+            <a:graphic>
+              <a:graphicData uri="http://schemas.openxmlformats.org/drawingml/2006/picture">
+                <pic:pic>
+                  <pic:nvPicPr>
+                    <pic:cNvPr id="0" name="2.10.5_devuan_disk_confirm.png"/>
+                    <pic:cNvPicPr/>
+                  </pic:nvPicPr>
+                  <pic:blipFill>
+                    <a:blip r:embed="rId32"/>
+                    <a:stretch>
+                      <a:fillRect/>
+                    </a:stretch>
+                  </pic:blipFill>
+                  <pic:spPr>
+                    <a:xfrm>
+                      <a:off x="0" y="0"/>
+                      <a:ext cx="5040000" cy="3492245"/>
+                    </a:xfrm>
+                    <a:prstGeom prst="rect"/>
+                  </pic:spPr>
+                </pic:pic>
+              </a:graphicData>
+            </a:graphic>
+          </wp:inline>
+        </w:drawing>
+      </w:r>
+    </w:p>
+    <w:p>
+      <w:pPr>
+        <w:spacing w:before="60" w:after="120" w:line="360" w:lineRule="auto"/>
+        <w:ind w:firstLine="0"/>
+        <w:jc w:val="center"/>
+      </w:pPr>
+      <w:r>
+        <w:rPr>
+          <w:rFonts w:ascii="Times New Roman" w:hAnsi="Times New Roman"/>
+          <w:color w:val="000000"/>
+          <w:sz w:val="28"/>
+        </w:rPr>
+        <w:t>Рисунок 3.15 — Підтвердження запису таблиці розділів на диск</w:t>
+      </w:r>
+    </w:p>
+    <w:p>
+      <w:pPr>
+        <w:spacing w:line="360" w:lineRule="auto" w:before="0" w:after="0"/>
+        <w:ind w:firstLine="709"/>
+        <w:jc w:val="left"/>
+      </w:pPr>
+      <w:r>
+        <w:rPr>
+          <w:rFonts w:ascii="Times New Roman" w:hAnsi="Times New Roman"/>
+          <w:b/>
+          <w:color w:val="000000"/>
+          <w:sz w:val="28"/>
+        </w:rPr>
+        <w:t>3.4 Налаштування пакетного менеджера та вибір ПЗ</w:t>
+      </w:r>
+    </w:p>
+    <w:p>
+      <w:pPr>
+        <w:spacing w:line="360" w:lineRule="auto" w:before="0" w:after="0"/>
+        <w:ind w:firstLine="0"/>
+        <w:jc w:val="both"/>
+      </w:pPr>
     </w:p>
     <w:p>
       <w:pPr>
@@ -2388,12 +3410,283 @@
         <w:rPr>
           <w:rFonts w:ascii="Times New Roman" w:hAnsi="Times New Roman"/>
           <w:b w:val="0"/>
-          <w:i/>
+          <w:i w:val="0"/>
           <w:color w:val="000000"/>
           <w:sz w:val="28"/>
         </w:rPr>
-        <w:t>— 3.3 — Розмітка диска [очікується]</w:t>
+        <w:t>Після копіювання базової системи виконується конфігурування джерела пакунків (APT mirror) та вибір програмного забезпечення для встановлення. У вікні вибору ПЗ (Tasksel) відключено всі графічні середовища, залишено лише стандартні системні утиліти. Також обрано систему ініціалізації sysvinit.</w:t>
       </w:r>
+    </w:p>
+    <w:p>
+      <w:pPr>
+        <w:spacing w:line="360" w:lineRule="auto" w:before="0" w:after="0"/>
+        <w:ind w:firstLine="0"/>
+        <w:jc w:val="both"/>
+      </w:pPr>
+    </w:p>
+    <w:p>
+      <w:pPr>
+        <w:spacing w:before="0" w:after="0"/>
+        <w:jc w:val="center"/>
+      </w:pPr>
+      <w:r>
+        <w:drawing>
+          <wp:inline xmlns:a="http://schemas.openxmlformats.org/drawingml/2006/main" xmlns:pic="http://schemas.openxmlformats.org/drawingml/2006/picture">
+            <wp:extent cx="5040000" cy="3492245"/>
+            <wp:docPr id="24" name="Picture 24"/>
+            <wp:cNvGraphicFramePr>
+              <a:graphicFrameLocks noChangeAspect="1"/>
+            </wp:cNvGraphicFramePr>
+            <a:graphic>
+              <a:graphicData uri="http://schemas.openxmlformats.org/drawingml/2006/picture">
+                <pic:pic>
+                  <pic:nvPicPr>
+                    <pic:cNvPr id="0" name="2.11.1_devuan_mirror_country.png"/>
+                    <pic:cNvPicPr/>
+                  </pic:nvPicPr>
+                  <pic:blipFill>
+                    <a:blip r:embed="rId33"/>
+                    <a:stretch>
+                      <a:fillRect/>
+                    </a:stretch>
+                  </pic:blipFill>
+                  <pic:spPr>
+                    <a:xfrm>
+                      <a:off x="0" y="0"/>
+                      <a:ext cx="5040000" cy="3492245"/>
+                    </a:xfrm>
+                    <a:prstGeom prst="rect"/>
+                  </pic:spPr>
+                </pic:pic>
+              </a:graphicData>
+            </a:graphic>
+          </wp:inline>
+        </w:drawing>
+      </w:r>
+    </w:p>
+    <w:p>
+      <w:pPr>
+        <w:spacing w:before="60" w:after="120" w:line="360" w:lineRule="auto"/>
+        <w:ind w:firstLine="0"/>
+        <w:jc w:val="center"/>
+      </w:pPr>
+      <w:r>
+        <w:rPr>
+          <w:rFonts w:ascii="Times New Roman" w:hAnsi="Times New Roman"/>
+          <w:color w:val="000000"/>
+          <w:sz w:val="28"/>
+        </w:rPr>
+        <w:t>Рисунок 3.16 — Вибір країни дзеркала репозиторіїв</w:t>
+      </w:r>
+    </w:p>
+    <w:p>
+      <w:pPr>
+        <w:spacing w:line="360" w:lineRule="auto" w:before="0" w:after="0"/>
+        <w:ind w:firstLine="0"/>
+        <w:jc w:val="both"/>
+      </w:pPr>
+    </w:p>
+    <w:p>
+      <w:pPr>
+        <w:spacing w:before="0" w:after="0"/>
+        <w:jc w:val="center"/>
+      </w:pPr>
+      <w:r>
+        <w:drawing>
+          <wp:inline xmlns:a="http://schemas.openxmlformats.org/drawingml/2006/main" xmlns:pic="http://schemas.openxmlformats.org/drawingml/2006/picture">
+            <wp:extent cx="5040000" cy="3492245"/>
+            <wp:docPr id="25" name="Picture 25"/>
+            <wp:cNvGraphicFramePr>
+              <a:graphicFrameLocks noChangeAspect="1"/>
+            </wp:cNvGraphicFramePr>
+            <a:graphic>
+              <a:graphicData uri="http://schemas.openxmlformats.org/drawingml/2006/picture">
+                <pic:pic>
+                  <pic:nvPicPr>
+                    <pic:cNvPr id="0" name="2.11.2_devuan_mirror_select.png"/>
+                    <pic:cNvPicPr/>
+                  </pic:nvPicPr>
+                  <pic:blipFill>
+                    <a:blip r:embed="rId34"/>
+                    <a:stretch>
+                      <a:fillRect/>
+                    </a:stretch>
+                  </pic:blipFill>
+                  <pic:spPr>
+                    <a:xfrm>
+                      <a:off x="0" y="0"/>
+                      <a:ext cx="5040000" cy="3492245"/>
+                    </a:xfrm>
+                    <a:prstGeom prst="rect"/>
+                  </pic:spPr>
+                </pic:pic>
+              </a:graphicData>
+            </a:graphic>
+          </wp:inline>
+        </w:drawing>
+      </w:r>
+    </w:p>
+    <w:p>
+      <w:pPr>
+        <w:spacing w:before="60" w:after="120" w:line="360" w:lineRule="auto"/>
+        <w:ind w:firstLine="0"/>
+        <w:jc w:val="center"/>
+      </w:pPr>
+      <w:r>
+        <w:rPr>
+          <w:rFonts w:ascii="Times New Roman" w:hAnsi="Times New Roman"/>
+          <w:color w:val="000000"/>
+          <w:sz w:val="28"/>
+        </w:rPr>
+        <w:t>Рисунок 3.17 — Вибір адреси дзеркала репозиторію</w:t>
+      </w:r>
+    </w:p>
+    <w:p>
+      <w:pPr>
+        <w:spacing w:line="360" w:lineRule="auto" w:before="0" w:after="0"/>
+        <w:ind w:firstLine="0"/>
+        <w:jc w:val="both"/>
+      </w:pPr>
+    </w:p>
+    <w:p>
+      <w:pPr>
+        <w:spacing w:before="0" w:after="0"/>
+        <w:jc w:val="center"/>
+      </w:pPr>
+      <w:r>
+        <w:drawing>
+          <wp:inline xmlns:a="http://schemas.openxmlformats.org/drawingml/2006/main" xmlns:pic="http://schemas.openxmlformats.org/drawingml/2006/picture">
+            <wp:extent cx="5040000" cy="3492245"/>
+            <wp:docPr id="26" name="Picture 26"/>
+            <wp:cNvGraphicFramePr>
+              <a:graphicFrameLocks noChangeAspect="1"/>
+            </wp:cNvGraphicFramePr>
+            <a:graphic>
+              <a:graphicData uri="http://schemas.openxmlformats.org/drawingml/2006/picture">
+                <pic:pic>
+                  <pic:nvPicPr>
+                    <pic:cNvPr id="0" name="2.11.3_devuan_software_selection.png"/>
+                    <pic:cNvPicPr/>
+                  </pic:nvPicPr>
+                  <pic:blipFill>
+                    <a:blip r:embed="rId35"/>
+                    <a:stretch>
+                      <a:fillRect/>
+                    </a:stretch>
+                  </pic:blipFill>
+                  <pic:spPr>
+                    <a:xfrm>
+                      <a:off x="0" y="0"/>
+                      <a:ext cx="5040000" cy="3492245"/>
+                    </a:xfrm>
+                    <a:prstGeom prst="rect"/>
+                  </pic:spPr>
+                </pic:pic>
+              </a:graphicData>
+            </a:graphic>
+          </wp:inline>
+        </w:drawing>
+      </w:r>
+    </w:p>
+    <w:p>
+      <w:pPr>
+        <w:spacing w:before="60" w:after="120" w:line="360" w:lineRule="auto"/>
+        <w:ind w:firstLine="0"/>
+        <w:jc w:val="center"/>
+      </w:pPr>
+      <w:r>
+        <w:rPr>
+          <w:rFonts w:ascii="Times New Roman" w:hAnsi="Times New Roman"/>
+          <w:color w:val="000000"/>
+          <w:sz w:val="28"/>
+        </w:rPr>
+        <w:t>Рисунок 3.18 — Вибір компонентів системи у меню Tasksel</w:t>
+      </w:r>
+    </w:p>
+    <w:p>
+      <w:pPr>
+        <w:spacing w:line="360" w:lineRule="auto" w:before="0" w:after="0"/>
+        <w:ind w:firstLine="0"/>
+        <w:jc w:val="both"/>
+      </w:pPr>
+    </w:p>
+    <w:p>
+      <w:pPr>
+        <w:spacing w:before="0" w:after="0"/>
+        <w:jc w:val="center"/>
+      </w:pPr>
+      <w:r>
+        <w:drawing>
+          <wp:inline xmlns:a="http://schemas.openxmlformats.org/drawingml/2006/main" xmlns:pic="http://schemas.openxmlformats.org/drawingml/2006/picture">
+            <wp:extent cx="5040000" cy="3492245"/>
+            <wp:docPr id="27" name="Picture 27"/>
+            <wp:cNvGraphicFramePr>
+              <a:graphicFrameLocks noChangeAspect="1"/>
+            </wp:cNvGraphicFramePr>
+            <a:graphic>
+              <a:graphicData uri="http://schemas.openxmlformats.org/drawingml/2006/picture">
+                <pic:pic>
+                  <pic:nvPicPr>
+                    <pic:cNvPr id="0" name="2.11.4_devuan_init_system.png"/>
+                    <pic:cNvPicPr/>
+                  </pic:nvPicPr>
+                  <pic:blipFill>
+                    <a:blip r:embed="rId36"/>
+                    <a:stretch>
+                      <a:fillRect/>
+                    </a:stretch>
+                  </pic:blipFill>
+                  <pic:spPr>
+                    <a:xfrm>
+                      <a:off x="0" y="0"/>
+                      <a:ext cx="5040000" cy="3492245"/>
+                    </a:xfrm>
+                    <a:prstGeom prst="rect"/>
+                  </pic:spPr>
+                </pic:pic>
+              </a:graphicData>
+            </a:graphic>
+          </wp:inline>
+        </w:drawing>
+      </w:r>
+    </w:p>
+    <w:p>
+      <w:pPr>
+        <w:spacing w:before="60" w:after="120" w:line="360" w:lineRule="auto"/>
+        <w:ind w:firstLine="0"/>
+        <w:jc w:val="center"/>
+      </w:pPr>
+      <w:r>
+        <w:rPr>
+          <w:rFonts w:ascii="Times New Roman" w:hAnsi="Times New Roman"/>
+          <w:color w:val="000000"/>
+          <w:sz w:val="28"/>
+        </w:rPr>
+        <w:t>Рисунок 3.19 — Вибір системи ініціалізації (sysvinit)</w:t>
+      </w:r>
+    </w:p>
+    <w:p>
+      <w:pPr>
+        <w:spacing w:line="360" w:lineRule="auto" w:before="0" w:after="0"/>
+        <w:ind w:firstLine="709"/>
+        <w:jc w:val="left"/>
+      </w:pPr>
+      <w:r>
+        <w:rPr>
+          <w:rFonts w:ascii="Times New Roman" w:hAnsi="Times New Roman"/>
+          <w:b/>
+          <w:color w:val="000000"/>
+          <w:sz w:val="28"/>
+        </w:rPr>
+        <w:t>3.5 Встановлення завантажувача та перший вхід</w:t>
+      </w:r>
+    </w:p>
+    <w:p>
+      <w:pPr>
+        <w:spacing w:line="360" w:lineRule="auto" w:before="0" w:after="0"/>
+        <w:ind w:firstLine="0"/>
+        <w:jc w:val="both"/>
+      </w:pPr>
     </w:p>
     <w:p>
       <w:pPr>
@@ -2405,28 +3698,321 @@
         <w:rPr>
           <w:rFonts w:ascii="Times New Roman" w:hAnsi="Times New Roman"/>
           <w:b w:val="0"/>
-          <w:i/>
+          <w:i w:val="0"/>
           <w:color w:val="000000"/>
           <w:sz w:val="28"/>
         </w:rPr>
-        <w:t>— 3.4 — Екран Tasksel (без графічного середовища) [очікується]</w:t>
+        <w:t>Завершальним етапом є встановлення системного завантажувача GRUB у головний завантажувальний запис (MBR) диска /dev/sda та перезавантаження системи для першого запуску.</w:t>
       </w:r>
     </w:p>
     <w:p>
       <w:pPr>
         <w:spacing w:line="360" w:lineRule="auto" w:before="0" w:after="0"/>
-        <w:ind w:firstLine="709"/>
+        <w:ind w:firstLine="0"/>
         <w:jc w:val="both"/>
+      </w:pPr>
+    </w:p>
+    <w:p>
+      <w:pPr>
+        <w:spacing w:before="0" w:after="0"/>
+        <w:jc w:val="center"/>
+      </w:pPr>
+      <w:r>
+        <w:drawing>
+          <wp:inline xmlns:a="http://schemas.openxmlformats.org/drawingml/2006/main" xmlns:pic="http://schemas.openxmlformats.org/drawingml/2006/picture">
+            <wp:extent cx="5040000" cy="3492245"/>
+            <wp:docPr id="28" name="Picture 28"/>
+            <wp:cNvGraphicFramePr>
+              <a:graphicFrameLocks noChangeAspect="1"/>
+            </wp:cNvGraphicFramePr>
+            <a:graphic>
+              <a:graphicData uri="http://schemas.openxmlformats.org/drawingml/2006/picture">
+                <pic:pic>
+                  <pic:nvPicPr>
+                    <pic:cNvPr id="0" name="2.12.1_devuan_grub_install.png"/>
+                    <pic:cNvPicPr/>
+                  </pic:nvPicPr>
+                  <pic:blipFill>
+                    <a:blip r:embed="rId37"/>
+                    <a:stretch>
+                      <a:fillRect/>
+                    </a:stretch>
+                  </pic:blipFill>
+                  <pic:spPr>
+                    <a:xfrm>
+                      <a:off x="0" y="0"/>
+                      <a:ext cx="5040000" cy="3492245"/>
+                    </a:xfrm>
+                    <a:prstGeom prst="rect"/>
+                  </pic:spPr>
+                </pic:pic>
+              </a:graphicData>
+            </a:graphic>
+          </wp:inline>
+        </w:drawing>
+      </w:r>
+    </w:p>
+    <w:p>
+      <w:pPr>
+        <w:spacing w:before="60" w:after="120" w:line="360" w:lineRule="auto"/>
+        <w:ind w:firstLine="0"/>
+        <w:jc w:val="center"/>
       </w:pPr>
       <w:r>
         <w:rPr>
           <w:rFonts w:ascii="Times New Roman" w:hAnsi="Times New Roman"/>
-          <w:b w:val="0"/>
-          <w:i/>
           <w:color w:val="000000"/>
           <w:sz w:val="28"/>
         </w:rPr>
-        <w:t>— 3.5 — Перший вхід у систему [очікується]</w:t>
+        <w:t>Рисунок 3.20 — Запит на встановлення завантажувача GRUB</w:t>
+      </w:r>
+    </w:p>
+    <w:p>
+      <w:pPr>
+        <w:spacing w:line="360" w:lineRule="auto" w:before="0" w:after="0"/>
+        <w:ind w:firstLine="0"/>
+        <w:jc w:val="both"/>
+      </w:pPr>
+    </w:p>
+    <w:p>
+      <w:pPr>
+        <w:spacing w:before="0" w:after="0"/>
+        <w:jc w:val="center"/>
+      </w:pPr>
+      <w:r>
+        <w:drawing>
+          <wp:inline xmlns:a="http://schemas.openxmlformats.org/drawingml/2006/main" xmlns:pic="http://schemas.openxmlformats.org/drawingml/2006/picture">
+            <wp:extent cx="5040000" cy="3492245"/>
+            <wp:docPr id="29" name="Picture 29"/>
+            <wp:cNvGraphicFramePr>
+              <a:graphicFrameLocks noChangeAspect="1"/>
+            </wp:cNvGraphicFramePr>
+            <a:graphic>
+              <a:graphicData uri="http://schemas.openxmlformats.org/drawingml/2006/picture">
+                <pic:pic>
+                  <pic:nvPicPr>
+                    <pic:cNvPr id="0" name="2.12.2_devuan_grub_device.png"/>
+                    <pic:cNvPicPr/>
+                  </pic:nvPicPr>
+                  <pic:blipFill>
+                    <a:blip r:embed="rId38"/>
+                    <a:stretch>
+                      <a:fillRect/>
+                    </a:stretch>
+                  </pic:blipFill>
+                  <pic:spPr>
+                    <a:xfrm>
+                      <a:off x="0" y="0"/>
+                      <a:ext cx="5040000" cy="3492245"/>
+                    </a:xfrm>
+                    <a:prstGeom prst="rect"/>
+                  </pic:spPr>
+                </pic:pic>
+              </a:graphicData>
+            </a:graphic>
+          </wp:inline>
+        </w:drawing>
+      </w:r>
+    </w:p>
+    <w:p>
+      <w:pPr>
+        <w:spacing w:before="60" w:after="120" w:line="360" w:lineRule="auto"/>
+        <w:ind w:firstLine="0"/>
+        <w:jc w:val="center"/>
+      </w:pPr>
+      <w:r>
+        <w:rPr>
+          <w:rFonts w:ascii="Times New Roman" w:hAnsi="Times New Roman"/>
+          <w:color w:val="000000"/>
+          <w:sz w:val="28"/>
+        </w:rPr>
+        <w:t>Рисунок 3.21 — Вибір пристрою для встановлення завантажувача GRUB</w:t>
+      </w:r>
+    </w:p>
+    <w:p>
+      <w:pPr>
+        <w:spacing w:line="360" w:lineRule="auto" w:before="0" w:after="0"/>
+        <w:ind w:firstLine="0"/>
+        <w:jc w:val="both"/>
+      </w:pPr>
+    </w:p>
+    <w:p>
+      <w:pPr>
+        <w:spacing w:before="0" w:after="0"/>
+        <w:jc w:val="center"/>
+      </w:pPr>
+      <w:r>
+        <w:drawing>
+          <wp:inline xmlns:a="http://schemas.openxmlformats.org/drawingml/2006/main" xmlns:pic="http://schemas.openxmlformats.org/drawingml/2006/picture">
+            <wp:extent cx="5040000" cy="3492245"/>
+            <wp:docPr id="30" name="Picture 30"/>
+            <wp:cNvGraphicFramePr>
+              <a:graphicFrameLocks noChangeAspect="1"/>
+            </wp:cNvGraphicFramePr>
+            <a:graphic>
+              <a:graphicData uri="http://schemas.openxmlformats.org/drawingml/2006/picture">
+                <pic:pic>
+                  <pic:nvPicPr>
+                    <pic:cNvPr id="0" name="2.12_devuan_install_complete.png"/>
+                    <pic:cNvPicPr/>
+                  </pic:nvPicPr>
+                  <pic:blipFill>
+                    <a:blip r:embed="rId39"/>
+                    <a:stretch>
+                      <a:fillRect/>
+                    </a:stretch>
+                  </pic:blipFill>
+                  <pic:spPr>
+                    <a:xfrm>
+                      <a:off x="0" y="0"/>
+                      <a:ext cx="5040000" cy="3492245"/>
+                    </a:xfrm>
+                    <a:prstGeom prst="rect"/>
+                  </pic:spPr>
+                </pic:pic>
+              </a:graphicData>
+            </a:graphic>
+          </wp:inline>
+        </w:drawing>
+      </w:r>
+    </w:p>
+    <w:p>
+      <w:pPr>
+        <w:spacing w:before="60" w:after="120" w:line="360" w:lineRule="auto"/>
+        <w:ind w:firstLine="0"/>
+        <w:jc w:val="center"/>
+      </w:pPr>
+      <w:r>
+        <w:rPr>
+          <w:rFonts w:ascii="Times New Roman" w:hAnsi="Times New Roman"/>
+          <w:color w:val="000000"/>
+          <w:sz w:val="28"/>
+        </w:rPr>
+        <w:t>Рисунок 3.22 — Повідомлення про успішне завершення встановлення</w:t>
+      </w:r>
+    </w:p>
+    <w:p>
+      <w:pPr>
+        <w:spacing w:line="360" w:lineRule="auto" w:before="0" w:after="0"/>
+        <w:ind w:firstLine="0"/>
+        <w:jc w:val="both"/>
+      </w:pPr>
+    </w:p>
+    <w:p>
+      <w:pPr>
+        <w:spacing w:before="0" w:after="0"/>
+        <w:jc w:val="center"/>
+      </w:pPr>
+      <w:r>
+        <w:drawing>
+          <wp:inline xmlns:a="http://schemas.openxmlformats.org/drawingml/2006/main" xmlns:pic="http://schemas.openxmlformats.org/drawingml/2006/picture">
+            <wp:extent cx="5040000" cy="3439264"/>
+            <wp:docPr id="31" name="Picture 31"/>
+            <wp:cNvGraphicFramePr>
+              <a:graphicFrameLocks noChangeAspect="1"/>
+            </wp:cNvGraphicFramePr>
+            <a:graphic>
+              <a:graphicData uri="http://schemas.openxmlformats.org/drawingml/2006/picture">
+                <pic:pic>
+                  <pic:nvPicPr>
+                    <pic:cNvPr id="0" name="2.13_devuan_grub_menu.png"/>
+                    <pic:cNvPicPr/>
+                  </pic:nvPicPr>
+                  <pic:blipFill>
+                    <a:blip r:embed="rId40"/>
+                    <a:stretch>
+                      <a:fillRect/>
+                    </a:stretch>
+                  </pic:blipFill>
+                  <pic:spPr>
+                    <a:xfrm>
+                      <a:off x="0" y="0"/>
+                      <a:ext cx="5040000" cy="3439264"/>
+                    </a:xfrm>
+                    <a:prstGeom prst="rect"/>
+                  </pic:spPr>
+                </pic:pic>
+              </a:graphicData>
+            </a:graphic>
+          </wp:inline>
+        </w:drawing>
+      </w:r>
+    </w:p>
+    <w:p>
+      <w:pPr>
+        <w:spacing w:before="60" w:after="120" w:line="360" w:lineRule="auto"/>
+        <w:ind w:firstLine="0"/>
+        <w:jc w:val="center"/>
+      </w:pPr>
+      <w:r>
+        <w:rPr>
+          <w:rFonts w:ascii="Times New Roman" w:hAnsi="Times New Roman"/>
+          <w:color w:val="000000"/>
+          <w:sz w:val="28"/>
+        </w:rPr>
+        <w:t>Рисунок 3.23 — Стартове меню завантажувача GRUB встановленої системи</w:t>
+      </w:r>
+    </w:p>
+    <w:p>
+      <w:pPr>
+        <w:spacing w:line="360" w:lineRule="auto" w:before="0" w:after="0"/>
+        <w:ind w:firstLine="0"/>
+        <w:jc w:val="both"/>
+      </w:pPr>
+    </w:p>
+    <w:p>
+      <w:pPr>
+        <w:spacing w:before="0" w:after="0"/>
+        <w:jc w:val="center"/>
+      </w:pPr>
+      <w:r>
+        <w:drawing>
+          <wp:inline xmlns:a="http://schemas.openxmlformats.org/drawingml/2006/main" xmlns:pic="http://schemas.openxmlformats.org/drawingml/2006/picture">
+            <wp:extent cx="5040000" cy="3049384"/>
+            <wp:docPr id="32" name="Picture 32"/>
+            <wp:cNvGraphicFramePr>
+              <a:graphicFrameLocks noChangeAspect="1"/>
+            </wp:cNvGraphicFramePr>
+            <a:graphic>
+              <a:graphicData uri="http://schemas.openxmlformats.org/drawingml/2006/picture">
+                <pic:pic>
+                  <pic:nvPicPr>
+                    <pic:cNvPr id="0" name="2.14_devuan_first_login.png"/>
+                    <pic:cNvPicPr/>
+                  </pic:nvPicPr>
+                  <pic:blipFill>
+                    <a:blip r:embed="rId41"/>
+                    <a:stretch>
+                      <a:fillRect/>
+                    </a:stretch>
+                  </pic:blipFill>
+                  <pic:spPr>
+                    <a:xfrm>
+                      <a:off x="0" y="0"/>
+                      <a:ext cx="5040000" cy="3049384"/>
+                    </a:xfrm>
+                    <a:prstGeom prst="rect"/>
+                  </pic:spPr>
+                </pic:pic>
+              </a:graphicData>
+            </a:graphic>
+          </wp:inline>
+        </w:drawing>
+      </w:r>
+    </w:p>
+    <w:p>
+      <w:pPr>
+        <w:spacing w:before="60" w:after="120" w:line="360" w:lineRule="auto"/>
+        <w:ind w:firstLine="0"/>
+        <w:jc w:val="center"/>
+      </w:pPr>
+      <w:r>
+        <w:rPr>
+          <w:rFonts w:ascii="Times New Roman" w:hAnsi="Times New Roman"/>
+          <w:color w:val="000000"/>
+          <w:sz w:val="28"/>
+        </w:rPr>
+        <w:t>Рисунок 3.24 — Перший вхід до консолі встановленої ОС</w:t>
       </w:r>
     </w:p>
     <w:p>

</xml_diff>

<commit_message>
Complete Phase 3 & 4: Configure and build custom live ISO, generate diary update
</commit_message>
<xml_diff>
--- a/diary/Devuan_Security_OS_Diary.docx
+++ b/diary/Devuan_Security_OS_Diary.docx
@@ -4048,17 +4048,116 @@
       <w:pPr>
         <w:spacing w:line="360" w:lineRule="auto" w:before="0" w:after="0"/>
         <w:ind w:firstLine="709"/>
+        <w:jc w:val="left"/>
+      </w:pPr>
+      <w:r>
+        <w:rPr>
+          <w:rFonts w:ascii="Times New Roman" w:hAnsi="Times New Roman"/>
+          <w:b/>
+          <w:color w:val="000000"/>
+          <w:sz w:val="28"/>
+        </w:rPr>
+        <w:t>4.1 Принципи та структура конфігурації</w:t>
+      </w:r>
+    </w:p>
+    <w:p>
+      <w:pPr>
+        <w:spacing w:line="360" w:lineRule="auto" w:before="0" w:after="0"/>
+        <w:ind w:firstLine="709"/>
         <w:jc w:val="both"/>
       </w:pPr>
       <w:r>
         <w:rPr>
           <w:rFonts w:ascii="Times New Roman" w:hAnsi="Times New Roman"/>
           <w:b w:val="0"/>
-          <w:i/>
+          <w:i w:val="0"/>
           <w:color w:val="000000"/>
           <w:sz w:val="28"/>
         </w:rPr>
-        <w:t>Розділ буде заповнено на відповідному етапі розробки.</w:t>
+        <w:t>Для побудови дистрибутиву Devuan Security OS використовується інструментарій live-build, який дозволяє повністю автоматизувати процес створення live-систем на базі Debian-подібних ОС. Конфігурація системи описується за допомогою декларативних списків пакетів, скриптів автоматизації та конфігураційних файлів, які переносяться у складальне середовище (Build Box) та використовуються під час збірки.</w:t>
+      </w:r>
+    </w:p>
+    <w:p>
+      <w:pPr>
+        <w:spacing w:line="360" w:lineRule="auto" w:before="0" w:after="0"/>
+        <w:ind w:firstLine="709"/>
+        <w:jc w:val="left"/>
+      </w:pPr>
+      <w:r>
+        <w:rPr>
+          <w:rFonts w:ascii="Times New Roman" w:hAnsi="Times New Roman"/>
+          <w:b/>
+          <w:color w:val="000000"/>
+          <w:sz w:val="28"/>
+        </w:rPr>
+        <w:t>4.2 Сценарій ініціалізації auto/config</w:t>
+      </w:r>
+    </w:p>
+    <w:p>
+      <w:pPr>
+        <w:spacing w:line="360" w:lineRule="auto" w:before="0" w:after="0"/>
+        <w:ind w:firstLine="709"/>
+        <w:jc w:val="both"/>
+      </w:pPr>
+      <w:r>
+        <w:rPr>
+          <w:rFonts w:ascii="Times New Roman" w:hAnsi="Times New Roman"/>
+          <w:b w:val="0"/>
+          <w:i w:val="0"/>
+          <w:color w:val="000000"/>
+          <w:sz w:val="28"/>
+        </w:rPr>
+        <w:t>Сценарій auto/config використовується для генерації базового дерева конфігурації. У ньому визначаються ключові параметри дистрибутиву: робочий режим встановлюється в значення devuan, цільовий дистрибутив — excalibur (Devuan 6), архітектура процесора — amd64, тип вихідного файлу — iso-hybrid. Для оптимізації процесу збірки та уникнення конфліктів із застарілими серверами оновлень Debian, параметр security вимкнено (оскільки в Devuan оновлення безпеки інтегровано в основний репозиторій). Програма налаштовується на використання дзеркала репозиторіїв http://deb.devuan.org/merged.</w:t>
+      </w:r>
+    </w:p>
+    <w:p>
+      <w:pPr>
+        <w:spacing w:line="360" w:lineRule="auto" w:before="0" w:after="0"/>
+        <w:ind w:firstLine="709"/>
+        <w:jc w:val="left"/>
+      </w:pPr>
+      <w:r>
+        <w:rPr>
+          <w:rFonts w:ascii="Times New Roman" w:hAnsi="Times New Roman"/>
+          <w:b/>
+          <w:color w:val="000000"/>
+          <w:sz w:val="28"/>
+        </w:rPr>
+        <w:t>4.3 Списки пакетів та кастомізація середовища</w:t>
+      </w:r>
+    </w:p>
+    <w:p>
+      <w:pPr>
+        <w:spacing w:line="360" w:lineRule="auto" w:before="0" w:after="0"/>
+        <w:ind w:firstLine="709"/>
+        <w:jc w:val="both"/>
+      </w:pPr>
+      <w:r>
+        <w:rPr>
+          <w:rFonts w:ascii="Times New Roman" w:hAnsi="Times New Roman"/>
+          <w:b w:val="0"/>
+          <w:i w:val="0"/>
+          <w:color w:val="000000"/>
+          <w:sz w:val="28"/>
+        </w:rPr>
+        <w:t>Списки пакетів для встановлення описуються у файлі config/package-lists/custom.list.chroot. Конфігурація містить: графічну оболонку XFCE 4 (пакети xfce4, xfce4-goodies) та дисплейний менеджер lightdm; базовий сервер відображення xorg; пакети безпеки та аудиту мережі (ufw, nmap, wireshark, tshark, tcpdump, keepassxc, macchanger, tor); службові утиліти (sudo, htop, curl, wget, git, fastfetch, bash-completion). Через видалення застарілої утиліти neofetch із репозиторіїв Devuan Excalibur, у збірці застосовано сучасну альтернативу fastfetch.</w:t>
+      </w:r>
+    </w:p>
+    <w:p>
+      <w:pPr>
+        <w:spacing w:line="360" w:lineRule="auto" w:before="0" w:after="0"/>
+        <w:ind w:firstLine="709"/>
+        <w:jc w:val="both"/>
+      </w:pPr>
+      <w:r>
+        <w:rPr>
+          <w:rFonts w:ascii="Times New Roman" w:hAnsi="Times New Roman"/>
+          <w:b w:val="0"/>
+          <w:i w:val="0"/>
+          <w:color w:val="000000"/>
+          <w:sz w:val="28"/>
+        </w:rPr>
+        <w:t>Для конфігурування мережі у live-системі створено файл config/includes.chroot/etc/network/interfaces, який забезпечує автоматичне підняття інтерфейсів eth0 та wlan0 за допомогою DHCP. Також додано конфігурацію config/includes.chroot/etc/sudoers.d/live, яка надає стандартному live-користувачу (user) права виконання адміністративних команд без запиту пароля. Додатково виконано патч скрипту /usr/lib/live/build/config у ВМ для примусового вибору підсистеми live-config-sysvinit (замість systemd) при використанні ініціалізації sysvinit.</w:t>
       </w:r>
     </w:p>
     <w:p>
@@ -4094,17 +4193,224 @@
       <w:pPr>
         <w:spacing w:line="360" w:lineRule="auto" w:before="0" w:after="0"/>
         <w:ind w:firstLine="709"/>
+        <w:jc w:val="left"/>
+      </w:pPr>
+      <w:r>
+        <w:rPr>
+          <w:rFonts w:ascii="Times New Roman" w:hAnsi="Times New Roman"/>
+          <w:b/>
+          <w:color w:val="000000"/>
+          <w:sz w:val="28"/>
+        </w:rPr>
+        <w:t>5.1 Процес компонування та створення SquashFS</w:t>
+      </w:r>
+    </w:p>
+    <w:p>
+      <w:pPr>
+        <w:spacing w:line="360" w:lineRule="auto" w:before="0" w:after="0"/>
+        <w:ind w:firstLine="709"/>
         <w:jc w:val="both"/>
       </w:pPr>
       <w:r>
         <w:rPr>
           <w:rFonts w:ascii="Times New Roman" w:hAnsi="Times New Roman"/>
           <w:b w:val="0"/>
-          <w:i/>
+          <w:i w:val="0"/>
           <w:color w:val="000000"/>
           <w:sz w:val="28"/>
         </w:rPr>
-        <w:t>Розділ буде заповнено на відповідному етапі розробки.</w:t>
+        <w:t>Процес збірки запускається послідовністю команд lb clean, lb config та sudo lb build. Під час виконання відбувається створення базової кореневої файлової системи (bootstrap), встановлення ядра Linux, системного завантажувача та всіх заданих у конфігурації пакетів. На завершальному етапі вміст chroot-оточення пакується у стиснуту файлову систему SquashFS.</w:t>
+      </w:r>
+    </w:p>
+    <w:p>
+      <w:pPr>
+        <w:spacing w:line="360" w:lineRule="auto" w:before="0" w:after="0"/>
+        <w:ind w:firstLine="709"/>
+        <w:jc w:val="both"/>
+      </w:pPr>
+      <w:r>
+        <w:rPr>
+          <w:rFonts w:ascii="Times New Roman" w:hAnsi="Times New Roman"/>
+          <w:b w:val="0"/>
+          <w:i w:val="0"/>
+          <w:color w:val="000000"/>
+          <w:sz w:val="28"/>
+        </w:rPr>
+        <w:t>На рисунку 3.1 зображено процес пакування образу файлової системи за допомогою squashfs-tools у складальному середовищі віртуальної машини.</w:t>
+      </w:r>
+    </w:p>
+    <w:p>
+      <w:pPr>
+        <w:spacing w:line="360" w:lineRule="auto" w:before="0" w:after="0"/>
+        <w:ind w:firstLine="0"/>
+        <w:jc w:val="both"/>
+      </w:pPr>
+    </w:p>
+    <w:p>
+      <w:pPr>
+        <w:spacing w:before="0" w:after="0"/>
+        <w:jc w:val="center"/>
+      </w:pPr>
+      <w:r>
+        <w:drawing>
+          <wp:inline xmlns:a="http://schemas.openxmlformats.org/drawingml/2006/main" xmlns:pic="http://schemas.openxmlformats.org/drawingml/2006/picture">
+            <wp:extent cx="5040000" cy="3049384"/>
+            <wp:docPr id="33" name="Picture 33"/>
+            <wp:cNvGraphicFramePr>
+              <a:graphicFrameLocks noChangeAspect="1"/>
+            </wp:cNvGraphicFramePr>
+            <a:graphic>
+              <a:graphicData uri="http://schemas.openxmlformats.org/drawingml/2006/picture">
+                <pic:pic>
+                  <pic:nvPicPr>
+                    <pic:cNvPr id="0" name="3.1_devuan_building_process.png"/>
+                    <pic:cNvPicPr/>
+                  </pic:nvPicPr>
+                  <pic:blipFill>
+                    <a:blip r:embed="rId42"/>
+                    <a:stretch>
+                      <a:fillRect/>
+                    </a:stretch>
+                  </pic:blipFill>
+                  <pic:spPr>
+                    <a:xfrm>
+                      <a:off x="0" y="0"/>
+                      <a:ext cx="5040000" cy="3049384"/>
+                    </a:xfrm>
+                    <a:prstGeom prst="rect"/>
+                  </pic:spPr>
+                </pic:pic>
+              </a:graphicData>
+            </a:graphic>
+          </wp:inline>
+        </w:drawing>
+      </w:r>
+    </w:p>
+    <w:p>
+      <w:pPr>
+        <w:spacing w:before="60" w:after="120" w:line="360" w:lineRule="auto"/>
+        <w:ind w:firstLine="0"/>
+        <w:jc w:val="center"/>
+      </w:pPr>
+      <w:r>
+        <w:rPr>
+          <w:rFonts w:ascii="Times New Roman" w:hAnsi="Times New Roman"/>
+          <w:color w:val="000000"/>
+          <w:sz w:val="28"/>
+        </w:rPr>
+        <w:t>Рисунок 3.25 — Створення стиснутого образу файлової системи SquashFS</w:t>
+      </w:r>
+    </w:p>
+    <w:p>
+      <w:pPr>
+        <w:spacing w:line="360" w:lineRule="auto" w:before="0" w:after="0"/>
+        <w:ind w:firstLine="709"/>
+        <w:jc w:val="left"/>
+      </w:pPr>
+      <w:r>
+        <w:rPr>
+          <w:rFonts w:ascii="Times New Roman" w:hAnsi="Times New Roman"/>
+          <w:b/>
+          <w:color w:val="000000"/>
+          <w:sz w:val="28"/>
+        </w:rPr>
+        <w:t>5.2 Генерація гібридного ISO-образу та його трансфер</w:t>
+      </w:r>
+    </w:p>
+    <w:p>
+      <w:pPr>
+        <w:spacing w:line="360" w:lineRule="auto" w:before="0" w:after="0"/>
+        <w:ind w:firstLine="709"/>
+        <w:jc w:val="both"/>
+      </w:pPr>
+      <w:r>
+        <w:rPr>
+          <w:rFonts w:ascii="Times New Roman" w:hAnsi="Times New Roman"/>
+          <w:b w:val="0"/>
+          <w:i w:val="0"/>
+          <w:color w:val="000000"/>
+          <w:sz w:val="28"/>
+        </w:rPr>
+        <w:t>Після завершення створення SquashFS інструментарій live-build інтегрує його із завантажувачем syslinux та створює фінальний гібридний образ devuan-security-amd64-amd64.hybrid.iso. Отриманий файл розміром 1018 МБ копіюється з віртуальної машини на хост-систему за допомогою безпечного протоколу SCP.</w:t>
+      </w:r>
+    </w:p>
+    <w:p>
+      <w:pPr>
+        <w:spacing w:line="360" w:lineRule="auto" w:before="0" w:after="0"/>
+        <w:ind w:firstLine="709"/>
+        <w:jc w:val="both"/>
+      </w:pPr>
+      <w:r>
+        <w:rPr>
+          <w:rFonts w:ascii="Times New Roman" w:hAnsi="Times New Roman"/>
+          <w:b w:val="0"/>
+          <w:i w:val="0"/>
+          <w:color w:val="000000"/>
+          <w:sz w:val="28"/>
+        </w:rPr>
+        <w:t>На рисунку 3.2 показано результат виведення розміру та прав доступу створеного ISO-образу на хост-машині.</w:t>
+      </w:r>
+    </w:p>
+    <w:p>
+      <w:pPr>
+        <w:spacing w:line="360" w:lineRule="auto" w:before="0" w:after="0"/>
+        <w:ind w:firstLine="0"/>
+        <w:jc w:val="both"/>
+      </w:pPr>
+    </w:p>
+    <w:p>
+      <w:pPr>
+        <w:spacing w:before="0" w:after="0"/>
+        <w:jc w:val="center"/>
+      </w:pPr>
+      <w:r>
+        <w:drawing>
+          <wp:inline xmlns:a="http://schemas.openxmlformats.org/drawingml/2006/main" xmlns:pic="http://schemas.openxmlformats.org/drawingml/2006/picture">
+            <wp:extent cx="5040000" cy="650070"/>
+            <wp:docPr id="34" name="Picture 34"/>
+            <wp:cNvGraphicFramePr>
+              <a:graphicFrameLocks noChangeAspect="1"/>
+            </wp:cNvGraphicFramePr>
+            <a:graphic>
+              <a:graphicData uri="http://schemas.openxmlformats.org/drawingml/2006/picture">
+                <pic:pic>
+                  <pic:nvPicPr>
+                    <pic:cNvPr id="0" name="3.2_devuan_iso_created.png"/>
+                    <pic:cNvPicPr/>
+                  </pic:nvPicPr>
+                  <pic:blipFill>
+                    <a:blip r:embed="rId43"/>
+                    <a:stretch>
+                      <a:fillRect/>
+                    </a:stretch>
+                  </pic:blipFill>
+                  <pic:spPr>
+                    <a:xfrm>
+                      <a:off x="0" y="0"/>
+                      <a:ext cx="5040000" cy="650070"/>
+                    </a:xfrm>
+                    <a:prstGeom prst="rect"/>
+                  </pic:spPr>
+                </pic:pic>
+              </a:graphicData>
+            </a:graphic>
+          </wp:inline>
+        </w:drawing>
+      </w:r>
+    </w:p>
+    <w:p>
+      <w:pPr>
+        <w:spacing w:before="60" w:after="120" w:line="360" w:lineRule="auto"/>
+        <w:ind w:firstLine="0"/>
+        <w:jc w:val="center"/>
+      </w:pPr>
+      <w:r>
+        <w:rPr>
+          <w:rFonts w:ascii="Times New Roman" w:hAnsi="Times New Roman"/>
+          <w:color w:val="000000"/>
+          <w:sz w:val="28"/>
+        </w:rPr>
+        <w:t>Рисунок 3.26 — Результат створення гібридного ISO-образу на хост-машині</w:t>
       </w:r>
     </w:p>
     <w:p>
@@ -4150,7 +4456,7 @@
           <w:color w:val="000000"/>
           <w:sz w:val="28"/>
         </w:rPr>
-        <w:t>Розділ буде заповнено на відповідному етапі розробки.</w:t>
+        <w:t>Розділ буде заповнено на відповідному етапі розробки (тестування live-образу у ВМ).</w:t>
       </w:r>
     </w:p>
     <w:sectPr>

</xml_diff>

<commit_message>
Complete Phase 5: Verify live system and generate final development diary
</commit_message>
<xml_diff>
--- a/diary/Devuan_Security_OS_Diary.docx
+++ b/diary/Devuan_Security_OS_Diary.docx
@@ -224,7 +224,7 @@
           <w:color w:val="000000"/>
           <w:sz w:val="28"/>
         </w:rPr>
-        <w:t>06.07.2026</w:t>
+        <w:t>07.07.2026</w:t>
       </w:r>
     </w:p>
     <w:p>
@@ -4446,17 +4446,224 @@
       <w:pPr>
         <w:spacing w:line="360" w:lineRule="auto" w:before="0" w:after="0"/>
         <w:ind w:firstLine="709"/>
+        <w:jc w:val="left"/>
+      </w:pPr>
+      <w:r>
+        <w:rPr>
+          <w:rFonts w:ascii="Times New Roman" w:hAnsi="Times New Roman"/>
+          <w:b/>
+          <w:color w:val="000000"/>
+          <w:sz w:val="28"/>
+        </w:rPr>
+        <w:t>6.1 Верифікація завантаження та графічного інтерфейсу</w:t>
+      </w:r>
+    </w:p>
+    <w:p>
+      <w:pPr>
+        <w:spacing w:line="360" w:lineRule="auto" w:before="0" w:after="0"/>
+        <w:ind w:firstLine="709"/>
         <w:jc w:val="both"/>
       </w:pPr>
       <w:r>
         <w:rPr>
           <w:rFonts w:ascii="Times New Roman" w:hAnsi="Times New Roman"/>
           <w:b w:val="0"/>
-          <w:i/>
+          <w:i w:val="0"/>
           <w:color w:val="000000"/>
           <w:sz w:val="28"/>
         </w:rPr>
-        <w:t>Розділ буде заповнено на відповідному етапі розробки (тестування live-образу у ВМ).</w:t>
+        <w:t>Для перевірки працездатності створеного дистрибутиву Devuan Security OS було створено нову віртуальну машину з параметрами: 2 ГБ оперативної пам'яті, 2 ядра процесора та підключеним ISO-образом. Завантаження системи відбулося в автоматичному режимі (Live CD). Графічний інтерфейс XFCE 4.20 запустився успішно з автоматичною авторизацією користувача user.</w:t>
+      </w:r>
+    </w:p>
+    <w:p>
+      <w:pPr>
+        <w:spacing w:line="360" w:lineRule="auto" w:before="0" w:after="0"/>
+        <w:ind w:firstLine="709"/>
+        <w:jc w:val="both"/>
+      </w:pPr>
+      <w:r>
+        <w:rPr>
+          <w:rFonts w:ascii="Times New Roman" w:hAnsi="Times New Roman"/>
+          <w:b w:val="0"/>
+          <w:i w:val="0"/>
+          <w:color w:val="000000"/>
+          <w:sz w:val="28"/>
+        </w:rPr>
+        <w:t>На рисунку 3.3 показано завантажений робочий стіл XFCE 4 нашої кастомної операційної системи.</w:t>
+      </w:r>
+    </w:p>
+    <w:p>
+      <w:pPr>
+        <w:spacing w:line="360" w:lineRule="auto" w:before="0" w:after="0"/>
+        <w:ind w:firstLine="0"/>
+        <w:jc w:val="both"/>
+      </w:pPr>
+    </w:p>
+    <w:p>
+      <w:pPr>
+        <w:spacing w:before="0" w:after="0"/>
+        <w:jc w:val="center"/>
+      </w:pPr>
+      <w:r>
+        <w:drawing>
+          <wp:inline xmlns:a="http://schemas.openxmlformats.org/drawingml/2006/main" xmlns:pic="http://schemas.openxmlformats.org/drawingml/2006/picture">
+            <wp:extent cx="5040000" cy="3049384"/>
+            <wp:docPr id="35" name="Picture 35"/>
+            <wp:cNvGraphicFramePr>
+              <a:graphicFrameLocks noChangeAspect="1"/>
+            </wp:cNvGraphicFramePr>
+            <a:graphic>
+              <a:graphicData uri="http://schemas.openxmlformats.org/drawingml/2006/picture">
+                <pic:pic>
+                  <pic:nvPicPr>
+                    <pic:cNvPr id="0" name="4.1_devuan_live_desktop.png"/>
+                    <pic:cNvPicPr/>
+                  </pic:nvPicPr>
+                  <pic:blipFill>
+                    <a:blip r:embed="rId44"/>
+                    <a:stretch>
+                      <a:fillRect/>
+                    </a:stretch>
+                  </pic:blipFill>
+                  <pic:spPr>
+                    <a:xfrm>
+                      <a:off x="0" y="0"/>
+                      <a:ext cx="5040000" cy="3049384"/>
+                    </a:xfrm>
+                    <a:prstGeom prst="rect"/>
+                  </pic:spPr>
+                </pic:pic>
+              </a:graphicData>
+            </a:graphic>
+          </wp:inline>
+        </w:drawing>
+      </w:r>
+    </w:p>
+    <w:p>
+      <w:pPr>
+        <w:spacing w:before="60" w:after="120" w:line="360" w:lineRule="auto"/>
+        <w:ind w:firstLine="0"/>
+        <w:jc w:val="center"/>
+      </w:pPr>
+      <w:r>
+        <w:rPr>
+          <w:rFonts w:ascii="Times New Roman" w:hAnsi="Times New Roman"/>
+          <w:color w:val="000000"/>
+          <w:sz w:val="28"/>
+        </w:rPr>
+        <w:t>Рисунок 3.27 — Робочий стіл XFCE 4 кастомного дистрибутиву Devuan Security OS</w:t>
+      </w:r>
+    </w:p>
+    <w:p>
+      <w:pPr>
+        <w:spacing w:line="360" w:lineRule="auto" w:before="0" w:after="0"/>
+        <w:ind w:firstLine="709"/>
+        <w:jc w:val="left"/>
+      </w:pPr>
+      <w:r>
+        <w:rPr>
+          <w:rFonts w:ascii="Times New Roman" w:hAnsi="Times New Roman"/>
+          <w:b/>
+          <w:color w:val="000000"/>
+          <w:sz w:val="28"/>
+        </w:rPr>
+        <w:t>6.2 Перевірка відсутності системного менеджера systemd</w:t>
+      </w:r>
+    </w:p>
+    <w:p>
+      <w:pPr>
+        <w:spacing w:line="360" w:lineRule="auto" w:before="0" w:after="0"/>
+        <w:ind w:firstLine="709"/>
+        <w:jc w:val="both"/>
+      </w:pPr>
+      <w:r>
+        <w:rPr>
+          <w:rFonts w:ascii="Times New Roman" w:hAnsi="Times New Roman"/>
+          <w:b w:val="0"/>
+          <w:i w:val="0"/>
+          <w:color w:val="000000"/>
+          <w:sz w:val="28"/>
+        </w:rPr>
+        <w:t>Для підтвердження повної відповідності архітектурним вимогам Devuan (відсутності systemd) було виконано перевірку процесу з ідентифікатором PID 1. Успішне виведення команди 'ps -p 1' підтверджує, що в ролі головного процесу ініціалізації використовується класичний init (sysvinit).</w:t>
+      </w:r>
+    </w:p>
+    <w:p>
+      <w:pPr>
+        <w:spacing w:line="360" w:lineRule="auto" w:before="0" w:after="0"/>
+        <w:ind w:firstLine="709"/>
+        <w:jc w:val="both"/>
+      </w:pPr>
+      <w:r>
+        <w:rPr>
+          <w:rFonts w:ascii="Times New Roman" w:hAnsi="Times New Roman"/>
+          <w:b w:val="0"/>
+          <w:i w:val="0"/>
+          <w:color w:val="000000"/>
+          <w:sz w:val="28"/>
+        </w:rPr>
+        <w:t>На рисунку 3.4 зображено термінал із виведенням інформації про систему через fastfetch та перевіркою PID 1.</w:t>
+      </w:r>
+    </w:p>
+    <w:p>
+      <w:pPr>
+        <w:spacing w:line="360" w:lineRule="auto" w:before="0" w:after="0"/>
+        <w:ind w:firstLine="0"/>
+        <w:jc w:val="both"/>
+      </w:pPr>
+    </w:p>
+    <w:p>
+      <w:pPr>
+        <w:spacing w:before="0" w:after="0"/>
+        <w:jc w:val="center"/>
+      </w:pPr>
+      <w:r>
+        <w:drawing>
+          <wp:inline xmlns:a="http://schemas.openxmlformats.org/drawingml/2006/main" xmlns:pic="http://schemas.openxmlformats.org/drawingml/2006/picture">
+            <wp:extent cx="5040000" cy="3049384"/>
+            <wp:docPr id="36" name="Picture 36"/>
+            <wp:cNvGraphicFramePr>
+              <a:graphicFrameLocks noChangeAspect="1"/>
+            </wp:cNvGraphicFramePr>
+            <a:graphic>
+              <a:graphicData uri="http://schemas.openxmlformats.org/drawingml/2006/picture">
+                <pic:pic>
+                  <pic:nvPicPr>
+                    <pic:cNvPr id="0" name="4.2_devuan_sysvinit_proof.png"/>
+                    <pic:cNvPicPr/>
+                  </pic:nvPicPr>
+                  <pic:blipFill>
+                    <a:blip r:embed="rId45"/>
+                    <a:stretch>
+                      <a:fillRect/>
+                    </a:stretch>
+                  </pic:blipFill>
+                  <pic:spPr>
+                    <a:xfrm>
+                      <a:off x="0" y="0"/>
+                      <a:ext cx="5040000" cy="3049384"/>
+                    </a:xfrm>
+                    <a:prstGeom prst="rect"/>
+                  </pic:spPr>
+                </pic:pic>
+              </a:graphicData>
+            </a:graphic>
+          </wp:inline>
+        </w:drawing>
+      </w:r>
+    </w:p>
+    <w:p>
+      <w:pPr>
+        <w:spacing w:before="60" w:after="120" w:line="360" w:lineRule="auto"/>
+        <w:ind w:firstLine="0"/>
+        <w:jc w:val="center"/>
+      </w:pPr>
+      <w:r>
+        <w:rPr>
+          <w:rFonts w:ascii="Times New Roman" w:hAnsi="Times New Roman"/>
+          <w:color w:val="000000"/>
+          <w:sz w:val="28"/>
+        </w:rPr>
+        <w:t>Рисунок 3.28 — Перевірка процесу ініціалізації PID 1 у терміналі Live-системи</w:t>
       </w:r>
     </w:p>
     <w:sectPr>

</xml_diff>

<commit_message>
Configure stable XFCE default panel, PolicyKit suppress warning, btop kiosk fullscreen, recordings skeleton, and update Dstu diary with QA persistence verification
</commit_message>
<xml_diff>
--- a/diary/Devuan_Security_OS_Diary.docx
+++ b/diary/Devuan_Security_OS_Diary.docx
@@ -224,7 +224,7 @@
           <w:color w:val="000000"/>
           <w:sz w:val="28"/>
         </w:rPr>
-        <w:t>07.07.2026</w:t>
+        <w:t>08.07.2026</w:t>
       </w:r>
     </w:p>
     <w:p>
@@ -4090,7 +4090,7 @@
           <w:color w:val="000000"/>
           <w:sz w:val="28"/>
         </w:rPr>
-        <w:t>4.2 Сценарій ініціалізації auto/config</w:t>
+        <w:t>4.2 Сценарій ініціалізації auto/config та вимкнення інсталятора</w:t>
       </w:r>
     </w:p>
     <w:p>
@@ -4107,7 +4107,7 @@
           <w:color w:val="000000"/>
           <w:sz w:val="28"/>
         </w:rPr>
-        <w:t>Сценарій auto/config використовується для генерації базового дерева конфігурації. У ньому визначаються ключові параметри дистрибутиву: робочий режим встановлюється в значення devuan, цільовий дистрибутив — excalibur (Devuan 6), архітектура процесора — amd64, тип вихідного файлу — iso-hybrid. Для оптимізації процесу збірки та уникнення конфліктів із застарілими серверами оновлень Debian, параметр security вимкнено (оскільки в Devuan оновлення безпеки інтегровано в основний репозиторій). Програма налаштовується на використання дзеркала репозиторіїв http://deb.devuan.org/merged.</w:t>
+        <w:t>Сценарій auto/config використовується для генерації базового дерева конфігурації. У ньому визначаються ключові параметри дистрибутиву: робочий режим встановлюється в значення devuan, цільовий дистрибутив — excalibur (Devuan 6), архітектура процесора — amd64, тип вихідного файлу — iso-hybrid. Параметр security вимкнено (оскільки в Devuan оновлення безпеки інтегровано в основний репозиторій). Через особливості структури репозиторіїв Devuan Excalibur, де відсутній сумісний завантажувач debian-installer за стандартним шляхом, параметр debian-installer було встановлено в значення false для уникнення помилок збірки 404. Це забезпечило побудову стабільного та чистого Live-образу, орієнтованого на роботу з оперативної пам'яті.</w:t>
       </w:r>
     </w:p>
     <w:p>
@@ -4123,7 +4123,7 @@
           <w:color w:val="000000"/>
           <w:sz w:val="28"/>
         </w:rPr>
-        <w:t>4.3 Списки пакетів та кастомізація середовища</w:t>
+        <w:t>4.3 Оновлений список пакетів та кастомізація середовища</w:t>
       </w:r>
     </w:p>
     <w:p>
@@ -4140,7 +4140,7 @@
           <w:color w:val="000000"/>
           <w:sz w:val="28"/>
         </w:rPr>
-        <w:t>Списки пакетів для встановлення описуються у файлі config/package-lists/custom.list.chroot. Конфігурація містить: графічну оболонку XFCE 4 (пакети xfce4, xfce4-goodies) та дисплейний менеджер lightdm; базовий сервер відображення xorg; пакети безпеки та аудиту мережі (ufw, nmap, wireshark, tshark, tcpdump, keepassxc, macchanger, tor); службові утиліти (sudo, htop, curl, wget, git, fastfetch, bash-completion). Через видалення застарілої утиліти neofetch із репозиторіїв Devuan Excalibur, у збірці застосовано сучасну альтернативу fastfetch.</w:t>
+        <w:t>Списки пакетів для встановлення описуються у файлі config/package-lists/custom.list.chroot. Конфігурація містить: графічну оболонку XFCE 4 та дисплейний менеджер lightdm; базовий сервер відображення xorg; інструменти мережевої безпеки (nmap, curl, wget, tcpdump, network-manager); медіа-стек для систем відеоспостереження (mpv, pavucontrol, alsa-utils, va-driver-all, mesa-va-drivers); службові утиліти (sudo, btop, lm-sensors, openssh-server, thunar-volman, gvfs, fastfetch). Замість застарілого htop у збірку інтегровано сучасну консольну панель моніторингу btop, яка надає детальні динамічні графіки споживання ресурсів та температури процесорів.</w:t>
       </w:r>
     </w:p>
     <w:p>
@@ -4157,7 +4157,7 @@
           <w:color w:val="000000"/>
           <w:sz w:val="28"/>
         </w:rPr>
-        <w:t>Для конфігурування мережі у live-системі створено файл config/includes.chroot/etc/network/interfaces, який забезпечує автоматичне підняття інтерфейсів eth0 та wlan0 за допомогою DHCP. Також додано конфігурацію config/includes.chroot/etc/sudoers.d/live, яка надає стандартному live-користувачу (user) права виконання адміністративних команд без запиту пароля. Додатково виконано патч скрипту /usr/lib/live/build/config у ВМ для примусового вибору підсистеми live-config-sysvinit (замість systemd) при використанні ініціалізації sysvinit.</w:t>
+        <w:t>Для конфігурування кіоск-режиму у live-системі здійснено такі налаштування: 1) у файлі config/includes.chroot/etc/lightdm/lightdm.conf активовано автоматичний вхід без пароля для користувача user; 2) у файлі config/includes.chroot/etc/skel/.config/autostart/disable-sleep.desktop прописано команду xset s off -dpms для відключення енергозбереження та сну екрана (що критично для постів охорони, які мають вести моніторинг 24/7); 3) у файлі config/includes.chroot/etc/skel/.config/autostart/kiosk-app.desktop налаштовано автоматичний запуск утиліти btop у повноекранному терміналі xfce4-terminal при кожному вході; 4) створено автостарт-заглушки xfce-polkit.desktop та polkit-gnome-authentication-agent-1.desktop з прапором Hidden=true для усунення помилки дублювання агентів авторизації PolicyKit на старті системи.</w:t>
       </w:r>
     </w:p>
     <w:p>
@@ -4331,7 +4331,7 @@
           <w:color w:val="000000"/>
           <w:sz w:val="28"/>
         </w:rPr>
-        <w:t>Після завершення створення SquashFS інструментарій live-build інтегрує його із завантажувачем syslinux та створює фінальний гібридний образ devuan-security-amd64-amd64.hybrid.iso. Отриманий файл розміром 1018 МБ копіюється з віртуальної машини на хост-систему за допомогою безпечного протоколу SCP.</w:t>
+        <w:t>Після завершення створення SquashFS інструментарій live-build інтегрує його із завантажувачем syslinux та створює фінальний гібридний образ devuan-security-amd64-amd64.hybrid.iso. Отриманий файл розміром 951 МБ копіюється з віртуальної машини на хост-систему за допомогою безпечного протоколу SCP.</w:t>
       </w:r>
     </w:p>
     <w:p>
@@ -4348,7 +4348,7 @@
           <w:color w:val="000000"/>
           <w:sz w:val="28"/>
         </w:rPr>
-        <w:t>На рисунку 3.2 показано результат виведення розміру та прав доступу створеного ISO-образу на хост-машині.</w:t>
+        <w:t>На рисунку 3.2 показано результат виведення розміру та права доступу створеного ISO-образу на хост-машині.</w:t>
       </w:r>
     </w:p>
     <w:p>
@@ -4455,7 +4455,7 @@
           <w:color w:val="000000"/>
           <w:sz w:val="28"/>
         </w:rPr>
-        <w:t>6.1 Верифікація завантаження та графічного інтерфейсу</w:t>
+        <w:t>6.1 Верифікація автоматичного входу та кіоск-режиму btop</w:t>
       </w:r>
     </w:p>
     <w:p>
@@ -4472,7 +4472,7 @@
           <w:color w:val="000000"/>
           <w:sz w:val="28"/>
         </w:rPr>
-        <w:t>Для перевірки працездатності створеного дистрибутиву Devuan Security OS було створено нову віртуальну машину з параметрами: 2 ГБ оперативної пам'яті, 2 ядра процесора та підключеним ISO-образом. Завантаження системи відбулося в автоматичному режимі (Live CD). Графічний інтерфейс XFCE 4.20 запустився успішно з автоматичною авторизацією користувача user.</w:t>
+        <w:t>Для перевірки працездатності створеного дистрибутиву Devuan Security OS було створено нову віртуальну машину з параметрами: 2 ГБ оперативної пам'яті, 2 ядра процесора та підключеним ISO-образом. Завантаження системи відбулося в автоматичному режимі (Live CD). Графічний інтерфейс XFCE запустився успішно з автоматичною авторизацією без запиту пароля. Після завантаження робочого столу на весь екран автоматично відкрилася консоль моніторингу btop, демонструючи успішну роботу кіоск-режиму та відсутність візуальних помилок авторизації.</w:t>
       </w:r>
     </w:p>
     <w:p>
@@ -4489,7 +4489,7 @@
           <w:color w:val="000000"/>
           <w:sz w:val="28"/>
         </w:rPr>
-        <w:t>На рисунку 3.3 показано завантажений робочий стіл XFCE 4 нашої кастомної операційної системи.</w:t>
+        <w:t>На рисунку 3.3 показано завантажений робочий стіл XFCE 4 нашої кастомної операційної системи в режимі кіоску.</w:t>
       </w:r>
     </w:p>
     <w:p>
@@ -4507,7 +4507,7 @@
       <w:r>
         <w:drawing>
           <wp:inline xmlns:a="http://schemas.openxmlformats.org/drawingml/2006/main" xmlns:pic="http://schemas.openxmlformats.org/drawingml/2006/picture">
-            <wp:extent cx="5040000" cy="3049384"/>
+            <wp:extent cx="5040000" cy="3046640"/>
             <wp:docPr id="35" name="Picture 35"/>
             <wp:cNvGraphicFramePr>
               <a:graphicFrameLocks noChangeAspect="1"/>
@@ -4528,7 +4528,7 @@
                   <pic:spPr>
                     <a:xfrm>
                       <a:off x="0" y="0"/>
-                      <a:ext cx="5040000" cy="3049384"/>
+                      <a:ext cx="5040000" cy="3046640"/>
                     </a:xfrm>
                     <a:prstGeom prst="rect"/>
                   </pic:spPr>
@@ -4551,7 +4551,7 @@
           <w:color w:val="000000"/>
           <w:sz w:val="28"/>
         </w:rPr>
-        <w:t>Рисунок 3.27 — Робочий стіл XFCE 4 кастомного дистрибутиву Devuan Security OS</w:t>
+        <w:t>Рисунок 3.27 — Робочий стіл XFCE 4 кастомного дистрибутиву Devuan Security OS з автозапуском btop</w:t>
       </w:r>
     </w:p>
     <w:p>
@@ -4567,7 +4567,7 @@
           <w:color w:val="000000"/>
           <w:sz w:val="28"/>
         </w:rPr>
-        <w:t>6.2 Перевірка відсутності системного менеджера systemd</w:t>
+        <w:t>6.2 Налаштування вибіркової персистентності та перевірка ініціалізації</w:t>
       </w:r>
     </w:p>
     <w:p>
@@ -4584,7 +4584,7 @@
           <w:color w:val="000000"/>
           <w:sz w:val="28"/>
         </w:rPr>
-        <w:t>Для підтвердження повної відповідності архітектурним вимогам Devuan (відсутності systemd) було виконано перевірку процесу з ідентифікатором PID 1. Успішне виведення команди 'ps -p 1' підтверджує, що в ролі головного процесу ініціалізації використовується класичний init (sysvinit).</w:t>
+        <w:t>Для забезпечення збереження відеозаписів та логів при роботі системи повністю в оперативній пам'яті (stateless), було підключено другий віртуальний диск /dev/sdb1, відформатований в ext4 та позначений міткою persistence. У файлі конфігурації persistence.conf прописано шлях /home/user/recordings, що дозволило реалізувати вибіркове монтування типу bind. Це забезпечує збереження записів камер на фізичному диску, тоді як усі налаштування ОС залишаються захищеними в RAM. Перевірка процесу ініціалізації PID 1 підтвердила використання sysvinit (init).</w:t>
       </w:r>
     </w:p>
     <w:p>
@@ -4601,7 +4601,7 @@
           <w:color w:val="000000"/>
           <w:sz w:val="28"/>
         </w:rPr>
-        <w:t>На рисунку 3.4 зображено термінал із виведенням інформації про систему через fastfetch та перевіркою PID 1.</w:t>
+        <w:t>На рисунку 3.4 зображено термінал із виведенням інформації про систему, перевіркою PID 1 та успішним монтуванням розділу записів.</w:t>
       </w:r>
     </w:p>
     <w:p>
@@ -4619,7 +4619,7 @@
       <w:r>
         <w:drawing>
           <wp:inline xmlns:a="http://schemas.openxmlformats.org/drawingml/2006/main" xmlns:pic="http://schemas.openxmlformats.org/drawingml/2006/picture">
-            <wp:extent cx="5040000" cy="3049384"/>
+            <wp:extent cx="5040000" cy="3046640"/>
             <wp:docPr id="36" name="Picture 36"/>
             <wp:cNvGraphicFramePr>
               <a:graphicFrameLocks noChangeAspect="1"/>
@@ -4640,7 +4640,7 @@
                   <pic:spPr>
                     <a:xfrm>
                       <a:off x="0" y="0"/>
-                      <a:ext cx="5040000" cy="3049384"/>
+                      <a:ext cx="5040000" cy="3046640"/>
                     </a:xfrm>
                     <a:prstGeom prst="rect"/>
                   </pic:spPr>
@@ -4663,7 +4663,7 @@
           <w:color w:val="000000"/>
           <w:sz w:val="28"/>
         </w:rPr>
-        <w:t>Рисунок 3.28 — Перевірка процесу ініціалізації PID 1 у терміналі Live-системи</w:t>
+        <w:t>Рисунок 3.28 — Перевірка процесу ініціалізації та монтування диска збереження записів</w:t>
       </w:r>
     </w:p>
     <w:sectPr>

</xml_diff>